<commit_message>
Se organiza el documento de prestacion de servicios de capital
</commit_message>
<xml_diff>
--- a/back/src/static/todoSilver/ContratoPrestacionServicioCapital.docx
+++ b/back/src/static/todoSilver/ContratoPrestacionServicioCapital.docx
@@ -116,8 +116,8 @@
         <w:tblLook w:val="04A0" w:firstRow="1" w:lastRow="0" w:firstColumn="1" w:lastColumn="0" w:noHBand="0" w:noVBand="1"/>
       </w:tblPr>
       <w:tblGrid>
-        <w:gridCol w:w="4414"/>
-        <w:gridCol w:w="4414"/>
+        <w:gridCol w:w="3177"/>
+        <w:gridCol w:w="5661"/>
       </w:tblGrid>
       <w:tr>
         <w:tc>
@@ -389,6 +389,16 @@
                 <w:szCs w:val="22"/>
               </w:rPr>
             </w:pPr>
+            <w:r>
+              <w:rPr>
+                <w:rFonts w:ascii="Aptos" w:hAnsi="Aptos" w:cs="Calibri"/>
+                <w:b/>
+                <w:bCs/>
+                <w:sz w:val="20"/>
+                <w:szCs w:val="20"/>
+              </w:rPr>
+              <w:t xml:space="preserve">         </w:t>
+            </w:r>
             <w:r>
               <w:rPr>
                 <w:rFonts w:ascii="Aptos" w:hAnsi="Aptos" w:cs="Calibri"/>
@@ -463,46 +473,254 @@
           </w:p>
           <w:p>
             <w:pPr>
-              <w:jc w:val="both"/>
-              <w:rPr>
-                <w:rFonts w:ascii="Aptos" w:hAnsi="Aptos" w:cs="Calibri"/>
-                <w:sz w:val="20"/>
-                <w:szCs w:val="20"/>
+              <w:pStyle w:val="TableParagraph"/>
+              <w:spacing w:before="11"/>
+              <w:ind w:left="439"/>
+              <w:rPr>
+                <w:b/>
+                <w:lang w:val="es-CO"/>
               </w:rPr>
             </w:pPr>
             <w:r>
               <w:rPr>
-                <w:rFonts w:ascii="Aptos" w:hAnsi="Aptos" w:cs="Calibri"/>
                 <w:b/>
-                <w:bCs/>
-                <w:sz w:val="20"/>
-                <w:szCs w:val="20"/>
-              </w:rPr>
-              <w:t xml:space="preserve">Nombre: </w:t>
+                <w:lang w:val="es-CO"/>
+              </w:rPr>
+              <w:t>Nombre: {{</w:t>
             </w:r>
+            <w:proofErr w:type="spellStart"/>
             <w:r>
               <w:rPr>
-                <w:bCs/>
-                <w:sz w:val="20"/>
-                <w:szCs w:val="20"/>
+                <w:b/>
+                <w:lang w:val="es-CO"/>
+              </w:rPr>
+              <w:t>ContratistaNombreLegal</w:t>
+            </w:r>
+            <w:proofErr w:type="spellEnd"/>
+            <w:r>
+              <w:rPr>
+                <w:b/>
+                <w:lang w:val="es-CO"/>
+              </w:rPr>
+              <w:t>}}</w:t>
+            </w:r>
+          </w:p>
+          <w:p>
+            <w:pPr>
+              <w:pStyle w:val="TableParagraph"/>
+              <w:spacing w:before="11"/>
+              <w:ind w:left="439"/>
+              <w:rPr>
+                <w:b/>
+                <w:lang w:val="es-CO"/>
+              </w:rPr>
+            </w:pPr>
+            <w:r>
+              <w:rPr>
+                <w:b/>
+                <w:lang w:val="es-CO"/>
               </w:rPr>
               <w:t>{{</w:t>
             </w:r>
             <w:proofErr w:type="spellStart"/>
             <w:r>
               <w:rPr>
-                <w:bCs/>
-                <w:sz w:val="20"/>
-                <w:szCs w:val="20"/>
-              </w:rPr>
-              <w:t>NombreCompleto</w:t>
+                <w:b/>
+                <w:lang w:val="es-CO"/>
+              </w:rPr>
+              <w:t>ContratistaDocumentoEtiqueta</w:t>
             </w:r>
             <w:proofErr w:type="spellEnd"/>
             <w:r>
               <w:rPr>
-                <w:bCs/>
-                <w:sz w:val="20"/>
-                <w:szCs w:val="20"/>
+                <w:b/>
+                <w:lang w:val="es-CO"/>
+              </w:rPr>
+              <w:t>}}: {{</w:t>
+            </w:r>
+            <w:proofErr w:type="spellStart"/>
+            <w:r>
+              <w:rPr>
+                <w:b/>
+                <w:lang w:val="es-CO"/>
+              </w:rPr>
+              <w:t>ContratistaDocumentoLegal</w:t>
+            </w:r>
+            <w:proofErr w:type="spellEnd"/>
+            <w:r>
+              <w:rPr>
+                <w:b/>
+                <w:lang w:val="es-CO"/>
+              </w:rPr>
+              <w:t>}}</w:t>
+            </w:r>
+          </w:p>
+          <w:p>
+            <w:pPr>
+              <w:pStyle w:val="TableParagraph"/>
+              <w:spacing w:before="11"/>
+              <w:ind w:left="439"/>
+              <w:rPr>
+                <w:b/>
+                <w:lang w:val="es-CO"/>
+              </w:rPr>
+            </w:pPr>
+            <w:r>
+              <w:rPr>
+                <w:b/>
+                <w:lang w:val="es-CO"/>
+              </w:rPr>
+              <w:t>{{#ContratistaFirmaNit}}</w:t>
+            </w:r>
+          </w:p>
+          <w:p>
+            <w:pPr>
+              <w:pStyle w:val="TableParagraph"/>
+              <w:spacing w:before="11"/>
+              <w:ind w:left="439"/>
+              <w:rPr>
+                <w:b/>
+                <w:lang w:val="es-CO"/>
+              </w:rPr>
+            </w:pPr>
+            <w:r>
+              <w:rPr>
+                <w:b/>
+                <w:lang w:val="es-CO"/>
+              </w:rPr>
+              <w:t>Rep. Legal | {{</w:t>
+            </w:r>
+            <w:proofErr w:type="spellStart"/>
+            <w:r>
+              <w:rPr>
+                <w:b/>
+                <w:lang w:val="es-CO"/>
+              </w:rPr>
+              <w:t>ContratistaRepresentanteLegal</w:t>
+            </w:r>
+            <w:proofErr w:type="spellEnd"/>
+            <w:r>
+              <w:rPr>
+                <w:b/>
+                <w:lang w:val="es-CO"/>
+              </w:rPr>
+              <w:t>}}</w:t>
+            </w:r>
+          </w:p>
+          <w:p>
+            <w:pPr>
+              <w:pStyle w:val="TableParagraph"/>
+              <w:spacing w:before="11"/>
+              <w:ind w:left="439"/>
+              <w:rPr>
+                <w:b/>
+                <w:lang w:val="es-CO"/>
+              </w:rPr>
+            </w:pPr>
+            <w:r>
+              <w:rPr>
+                <w:b/>
+                <w:lang w:val="es-CO"/>
+              </w:rPr>
+              <w:t>{{</w:t>
+            </w:r>
+            <w:proofErr w:type="spellStart"/>
+            <w:r>
+              <w:rPr>
+                <w:b/>
+                <w:lang w:val="es-CO"/>
+              </w:rPr>
+              <w:t>ContratistaTipoDocumentoRepresentante</w:t>
+            </w:r>
+            <w:proofErr w:type="spellEnd"/>
+            <w:r>
+              <w:rPr>
+                <w:b/>
+                <w:lang w:val="es-CO"/>
+              </w:rPr>
+              <w:t>}}: {{</w:t>
+            </w:r>
+            <w:proofErr w:type="spellStart"/>
+            <w:r>
+              <w:rPr>
+                <w:b/>
+                <w:lang w:val="es-CO"/>
+              </w:rPr>
+              <w:t>ContratistaNumeroDocumentoRepresentante</w:t>
+            </w:r>
+            <w:proofErr w:type="spellEnd"/>
+            <w:r>
+              <w:rPr>
+                <w:b/>
+                <w:lang w:val="es-CO"/>
+              </w:rPr>
+              <w:t>}}</w:t>
+            </w:r>
+          </w:p>
+          <w:p>
+            <w:pPr>
+              <w:pStyle w:val="TableParagraph"/>
+              <w:spacing w:before="11"/>
+              <w:ind w:left="439"/>
+              <w:rPr>
+                <w:b/>
+                <w:lang w:val="es-CO"/>
+              </w:rPr>
+            </w:pPr>
+            <w:r>
+              <w:rPr>
+                <w:b/>
+                <w:lang w:val="es-CO"/>
+              </w:rPr>
+              <w:t>{{/</w:t>
+            </w:r>
+            <w:proofErr w:type="spellStart"/>
+            <w:r>
+              <w:rPr>
+                <w:b/>
+                <w:lang w:val="es-CO"/>
+              </w:rPr>
+              <w:t>ContratistaFirmaNit</w:t>
+            </w:r>
+            <w:proofErr w:type="spellEnd"/>
+            <w:r>
+              <w:rPr>
+                <w:b/>
+                <w:lang w:val="es-CO"/>
+              </w:rPr>
+              <w:t>}}</w:t>
+            </w:r>
+          </w:p>
+          <w:p>
+            <w:pPr>
+              <w:pStyle w:val="TableParagraph"/>
+              <w:spacing w:before="11"/>
+              <w:ind w:left="439"/>
+              <w:rPr>
+                <w:b/>
+                <w:lang w:val="es-CO"/>
+              </w:rPr>
+            </w:pPr>
+            <w:r>
+              <w:rPr>
+                <w:b/>
+                <w:lang w:val="es-CO"/>
+              </w:rPr>
+              <w:t>Domicilio: {{</w:t>
+            </w:r>
+            <w:proofErr w:type="spellStart"/>
+            <w:r>
+              <w:rPr>
+                <w:b/>
+                <w:lang w:val="es-CO"/>
+              </w:rPr>
+              <w:t>Direccion</w:t>
+            </w:r>
+            <w:proofErr w:type="spellEnd"/>
+            <w:r>
+              <w:rPr>
+                <w:b/>
+                <w:lang w:val="es-CO"/>
               </w:rPr>
               <w:t>}}</w:t>
             </w:r>
@@ -512,108 +730,6 @@
               <w:jc w:val="both"/>
               <w:rPr>
                 <w:rFonts w:ascii="Aptos" w:hAnsi="Aptos" w:cs="Calibri"/>
-                <w:b/>
-                <w:bCs/>
-                <w:sz w:val="20"/>
-                <w:szCs w:val="20"/>
-              </w:rPr>
-            </w:pPr>
-            <w:r>
-              <w:rPr>
-                <w:rFonts w:ascii="Aptos" w:hAnsi="Aptos" w:cs="Calibri"/>
-                <w:b/>
-                <w:bCs/>
-                <w:sz w:val="20"/>
-                <w:szCs w:val="20"/>
-              </w:rPr>
-              <w:t xml:space="preserve">Cédula: </w:t>
-            </w:r>
-            <w:r>
-              <w:rPr>
-                <w:bCs/>
-                <w:spacing w:val="-2"/>
-                <w:sz w:val="20"/>
-                <w:szCs w:val="20"/>
-              </w:rPr>
-              <w:t>{{</w:t>
-            </w:r>
-            <w:proofErr w:type="spellStart"/>
-            <w:r>
-              <w:rPr>
-                <w:bCs/>
-                <w:spacing w:val="-2"/>
-                <w:sz w:val="20"/>
-                <w:szCs w:val="20"/>
-              </w:rPr>
-              <w:t>NumeroDocumento</w:t>
-            </w:r>
-            <w:proofErr w:type="spellEnd"/>
-            <w:r>
-              <w:rPr>
-                <w:bCs/>
-                <w:spacing w:val="-2"/>
-                <w:sz w:val="20"/>
-                <w:szCs w:val="20"/>
-              </w:rPr>
-              <w:t>}}</w:t>
-            </w:r>
-          </w:p>
-          <w:p>
-            <w:pPr>
-              <w:jc w:val="both"/>
-              <w:rPr>
-                <w:rFonts w:ascii="Aptos" w:hAnsi="Aptos" w:cs="Calibri"/>
-                <w:sz w:val="20"/>
-                <w:szCs w:val="20"/>
-              </w:rPr>
-            </w:pPr>
-            <w:r>
-              <w:rPr>
-                <w:rFonts w:ascii="Aptos" w:hAnsi="Aptos" w:cs="Calibri"/>
-                <w:b/>
-                <w:bCs/>
-                <w:sz w:val="20"/>
-                <w:szCs w:val="20"/>
-              </w:rPr>
-              <w:t>Domicilio:</w:t>
-            </w:r>
-            <w:r>
-              <w:rPr>
-                <w:rFonts w:ascii="Aptos" w:hAnsi="Aptos" w:cs="Calibri"/>
-                <w:sz w:val="20"/>
-                <w:szCs w:val="20"/>
-              </w:rPr>
-              <w:t xml:space="preserve"> </w:t>
-            </w:r>
-            <w:r>
-              <w:rPr>
-                <w:sz w:val="20"/>
-                <w:szCs w:val="20"/>
-              </w:rPr>
-              <w:t>{{</w:t>
-            </w:r>
-            <w:proofErr w:type="spellStart"/>
-            <w:r>
-              <w:rPr>
-                <w:sz w:val="20"/>
-                <w:szCs w:val="20"/>
-              </w:rPr>
-              <w:t>Direccion</w:t>
-            </w:r>
-            <w:proofErr w:type="spellEnd"/>
-            <w:r>
-              <w:rPr>
-                <w:sz w:val="20"/>
-                <w:szCs w:val="20"/>
-              </w:rPr>
-              <w:t>}}</w:t>
-            </w:r>
-          </w:p>
-          <w:p>
-            <w:pPr>
-              <w:jc w:val="both"/>
-              <w:rPr>
-                <w:rFonts w:ascii="Aptos" w:hAnsi="Aptos" w:cs="Calibri"/>
                 <w:sz w:val="20"/>
                 <w:szCs w:val="20"/>
               </w:rPr>
@@ -1115,6 +1231,7 @@
           <w:sz w:val="20"/>
           <w:szCs w:val="20"/>
         </w:rPr>
+        <w:lastRenderedPageBreak/>
         <w:t>Parágrafo:</w:t>
       </w:r>
       <w:r>
@@ -1196,7 +1313,6 @@
           <w:sz w:val="20"/>
           <w:szCs w:val="20"/>
         </w:rPr>
-        <w:lastRenderedPageBreak/>
         <w:t xml:space="preserve">En caso de que </w:t>
       </w:r>
       <w:r>
@@ -1283,7 +1399,25 @@
           <w:sz w:val="20"/>
           <w:szCs w:val="20"/>
         </w:rPr>
-        <w:t xml:space="preserve">la hoja de vida del consultor que considere más apropiado para la prestación del servicio, para que de acuerdo con el conocimiento del Cliente y sus necesidades, </w:t>
+        <w:t xml:space="preserve">la hoja de vida del consultor que considere más apropiado para la prestación del servicio, para </w:t>
+      </w:r>
+      <w:proofErr w:type="gramStart"/>
+      <w:r>
+        <w:rPr>
+          <w:rFonts w:ascii="Aptos" w:hAnsi="Aptos" w:cs="Calibri"/>
+          <w:sz w:val="20"/>
+          <w:szCs w:val="20"/>
+        </w:rPr>
+        <w:t>que</w:t>
+      </w:r>
+      <w:proofErr w:type="gramEnd"/>
+      <w:r>
+        <w:rPr>
+          <w:rFonts w:ascii="Aptos" w:hAnsi="Aptos" w:cs="Calibri"/>
+          <w:sz w:val="20"/>
+          <w:szCs w:val="20"/>
+        </w:rPr>
+        <w:t xml:space="preserve"> de acuerdo con el conocimiento del Cliente y sus necesidades, </w:t>
       </w:r>
       <w:r>
         <w:rPr>
@@ -2117,6 +2251,7 @@
           <w:sz w:val="20"/>
           <w:szCs w:val="20"/>
         </w:rPr>
+        <w:lastRenderedPageBreak/>
         <w:t xml:space="preserve">Permitir que </w:t>
       </w:r>
       <w:r>
@@ -2209,7 +2344,6 @@
           <w:sz w:val="20"/>
           <w:szCs w:val="20"/>
         </w:rPr>
-        <w:lastRenderedPageBreak/>
         <w:t xml:space="preserve">Cumplir a cabalidad todas las actividades necesarias para la ejecución del servicio objeto del presente Contrato. </w:t>
       </w:r>
     </w:p>
@@ -3078,34 +3212,53 @@
           <w:sz w:val="20"/>
           <w:szCs w:val="20"/>
         </w:rPr>
-        <w:t xml:space="preserve"> las tarifas de horas establecidas en el Anexo Técnico y de acuerdo a la efectiva solicitud de servicios que se haya realizado durante el mes a pagar. </w:t>
-      </w:r>
-    </w:p>
-    <w:p>
-      <w:pPr>
-        <w:jc w:val="both"/>
-        <w:rPr>
-          <w:rFonts w:ascii="Aptos" w:hAnsi="Aptos" w:cs="Calibri"/>
-          <w:sz w:val="20"/>
-          <w:szCs w:val="20"/>
-        </w:rPr>
-      </w:pPr>
-    </w:p>
-    <w:p>
-      <w:pPr>
-        <w:jc w:val="both"/>
-        <w:rPr>
-          <w:rFonts w:ascii="Aptos" w:hAnsi="Aptos" w:cs="Calibri"/>
-          <w:sz w:val="20"/>
-          <w:szCs w:val="20"/>
-        </w:rPr>
-      </w:pPr>
-      <w:r>
-        <w:rPr>
-          <w:rFonts w:ascii="Aptos" w:hAnsi="Aptos" w:cs="Calibri"/>
-          <w:sz w:val="20"/>
-          <w:szCs w:val="20"/>
-        </w:rPr>
+        <w:t xml:space="preserve"> las tarifas de horas establecidas en el Anexo Técnico y </w:t>
+      </w:r>
+      <w:proofErr w:type="gramStart"/>
+      <w:r>
+        <w:rPr>
+          <w:rFonts w:ascii="Aptos" w:hAnsi="Aptos" w:cs="Calibri"/>
+          <w:sz w:val="20"/>
+          <w:szCs w:val="20"/>
+        </w:rPr>
+        <w:t>de acuerdo a</w:t>
+      </w:r>
+      <w:proofErr w:type="gramEnd"/>
+      <w:r>
+        <w:rPr>
+          <w:rFonts w:ascii="Aptos" w:hAnsi="Aptos" w:cs="Calibri"/>
+          <w:sz w:val="20"/>
+          <w:szCs w:val="20"/>
+        </w:rPr>
+        <w:t xml:space="preserve"> la efectiva solicitud de servicios que se haya realizado durante el mes a pagar. </w:t>
+      </w:r>
+    </w:p>
+    <w:p>
+      <w:pPr>
+        <w:jc w:val="both"/>
+        <w:rPr>
+          <w:rFonts w:ascii="Aptos" w:hAnsi="Aptos" w:cs="Calibri"/>
+          <w:sz w:val="20"/>
+          <w:szCs w:val="20"/>
+        </w:rPr>
+      </w:pPr>
+    </w:p>
+    <w:p>
+      <w:pPr>
+        <w:jc w:val="both"/>
+        <w:rPr>
+          <w:rFonts w:ascii="Aptos" w:hAnsi="Aptos" w:cs="Calibri"/>
+          <w:sz w:val="20"/>
+          <w:szCs w:val="20"/>
+        </w:rPr>
+      </w:pPr>
+      <w:r>
+        <w:rPr>
+          <w:rFonts w:ascii="Aptos" w:hAnsi="Aptos" w:cs="Calibri"/>
+          <w:sz w:val="20"/>
+          <w:szCs w:val="20"/>
+        </w:rPr>
+        <w:lastRenderedPageBreak/>
         <w:t>En los honorarios se</w:t>
       </w:r>
       <w:r>
@@ -3231,16 +3384,7 @@
           <w:sz w:val="20"/>
           <w:szCs w:val="20"/>
         </w:rPr>
-        <w:t xml:space="preserve">para realizar el pago establecido en la presente Cláusula, se </w:t>
-      </w:r>
-      <w:r>
-        <w:rPr>
-          <w:rFonts w:ascii="Aptos" w:hAnsi="Aptos" w:cs="Calibri"/>
-          <w:sz w:val="20"/>
-          <w:szCs w:val="20"/>
-        </w:rPr>
-        <w:lastRenderedPageBreak/>
-        <w:t xml:space="preserve">encuentran detalladas en la Política de Pagos de </w:t>
+        <w:t xml:space="preserve">para realizar el pago establecido en la presente Cláusula, se encuentran detalladas en la Política de Pagos de </w:t>
       </w:r>
       <w:r>
         <w:rPr>
@@ -4065,6 +4209,7 @@
           <w:sz w:val="20"/>
           <w:szCs w:val="20"/>
         </w:rPr>
+        <w:lastRenderedPageBreak/>
         <w:t>E</w:t>
       </w:r>
       <w:r>
@@ -4197,7 +4342,1484 @@
           <w:sz w:val="20"/>
           <w:szCs w:val="20"/>
         </w:rPr>
-        <w:t xml:space="preserve">, la Parte que pretenda invocar alguna de las causales descritas en esta cláusula, deberá hacerlo por escrito, sin necesidad de notificación previa, y </w:t>
+        <w:t>, la Parte que pretenda invocar alguna de las causales descritas en esta cláusula, deberá hacerlo por escrito, sin necesidad de notificación previa, y la terminación surtirá efectos de forma inmediata. La terminación no eximirá a la Parte incumplida del cumplimiento de sus obligaciones, pudiendo la Parte cumplida o que se allanó a cumplir, solicitar el cumplimiento de la obligación, sin perjuicio de lo pactado en la Cláusula Penal. </w:t>
+      </w:r>
+    </w:p>
+    <w:p>
+      <w:pPr>
+        <w:jc w:val="both"/>
+        <w:rPr>
+          <w:rFonts w:ascii="Aptos" w:hAnsi="Aptos" w:cs="Calibri"/>
+          <w:sz w:val="20"/>
+          <w:szCs w:val="20"/>
+        </w:rPr>
+      </w:pPr>
+    </w:p>
+    <w:p>
+      <w:pPr>
+        <w:jc w:val="both"/>
+        <w:rPr>
+          <w:rFonts w:ascii="Aptos" w:hAnsi="Aptos" w:cs="Calibri"/>
+          <w:sz w:val="20"/>
+          <w:szCs w:val="20"/>
+        </w:rPr>
+      </w:pPr>
+    </w:p>
+    <w:p>
+      <w:pPr>
+        <w:jc w:val="both"/>
+        <w:rPr>
+          <w:rFonts w:ascii="Aptos" w:hAnsi="Aptos" w:cs="Calibri"/>
+          <w:sz w:val="20"/>
+          <w:szCs w:val="20"/>
+        </w:rPr>
+      </w:pPr>
+    </w:p>
+    <w:p>
+      <w:pPr>
+        <w:jc w:val="both"/>
+        <w:rPr>
+          <w:rFonts w:ascii="Aptos" w:hAnsi="Aptos" w:cs="Calibri"/>
+          <w:sz w:val="20"/>
+          <w:szCs w:val="20"/>
+        </w:rPr>
+      </w:pPr>
+      <w:r>
+        <w:rPr>
+          <w:rFonts w:ascii="Aptos" w:hAnsi="Aptos" w:cs="Calibri"/>
+          <w:sz w:val="20"/>
+          <w:szCs w:val="20"/>
+        </w:rPr>
+        <w:t xml:space="preserve">Las Partes dejan expresa constancia que, </w:t>
+      </w:r>
+      <w:r>
+        <w:rPr>
+          <w:rFonts w:ascii="Aptos" w:hAnsi="Aptos" w:cs="Calibri"/>
+          <w:sz w:val="20"/>
+          <w:szCs w:val="20"/>
+        </w:rPr>
+        <w:t xml:space="preserve">el Contratista se compromete a </w:t>
+      </w:r>
+      <w:r>
+        <w:rPr>
+          <w:rFonts w:ascii="Aptos" w:hAnsi="Aptos" w:cs="Calibri"/>
+          <w:sz w:val="20"/>
+          <w:szCs w:val="20"/>
+        </w:rPr>
+        <w:t>e</w:t>
+      </w:r>
+      <w:r>
+        <w:rPr>
+          <w:rFonts w:ascii="Aptos" w:hAnsi="Aptos" w:cs="Calibri"/>
+          <w:sz w:val="20"/>
+          <w:szCs w:val="20"/>
+        </w:rPr>
+        <w:t xml:space="preserve">ntregar toda la información que repose en su poder a la fecha de terminación del Contrato, que sea de propiedad de </w:t>
+      </w:r>
+      <w:r>
+        <w:rPr>
+          <w:rFonts w:ascii="Aptos" w:eastAsia="Aptos" w:hAnsi="Aptos" w:cs="Aptos"/>
+          <w:b/>
+          <w:bCs/>
+          <w:sz w:val="20"/>
+          <w:szCs w:val="20"/>
+        </w:rPr>
+        <w:t>CAPITALINK</w:t>
+      </w:r>
+      <w:r>
+        <w:rPr>
+          <w:rFonts w:ascii="Aptos" w:eastAsia="Aptos" w:hAnsi="Aptos" w:cs="Aptos"/>
+          <w:b/>
+          <w:bCs/>
+          <w:sz w:val="20"/>
+          <w:szCs w:val="20"/>
+        </w:rPr>
+        <w:t xml:space="preserve"> </w:t>
+      </w:r>
+      <w:r>
+        <w:rPr>
+          <w:rFonts w:ascii="Aptos" w:hAnsi="Aptos" w:cs="Calibri"/>
+          <w:sz w:val="20"/>
+          <w:szCs w:val="20"/>
+        </w:rPr>
+        <w:t>o de sus clientes, que a manera enunciativa podrá tratarse de manuales, procesos, procedimientos, accesos, configuraciones, informes, entre otros</w:t>
+      </w:r>
+      <w:r>
+        <w:rPr>
+          <w:rFonts w:ascii="Aptos" w:hAnsi="Aptos" w:cs="Calibri"/>
+          <w:sz w:val="20"/>
+          <w:szCs w:val="20"/>
+        </w:rPr>
+        <w:t>, so pena, de dar aplicación a lo establecido en la Cláusula Penal.</w:t>
+      </w:r>
+    </w:p>
+    <w:p>
+      <w:pPr>
+        <w:jc w:val="both"/>
+        <w:rPr>
+          <w:rFonts w:ascii="Aptos" w:hAnsi="Aptos" w:cs="Calibri"/>
+          <w:sz w:val="20"/>
+          <w:szCs w:val="20"/>
+        </w:rPr>
+      </w:pPr>
+    </w:p>
+    <w:p>
+      <w:pPr>
+        <w:jc w:val="both"/>
+        <w:rPr>
+          <w:rFonts w:ascii="Aptos" w:hAnsi="Aptos" w:cs="Calibri"/>
+          <w:sz w:val="20"/>
+          <w:szCs w:val="20"/>
+        </w:rPr>
+      </w:pPr>
+      <w:r>
+        <w:rPr>
+          <w:rFonts w:ascii="Aptos" w:hAnsi="Aptos" w:cs="Calibri"/>
+          <w:b/>
+          <w:bCs/>
+          <w:sz w:val="20"/>
+          <w:szCs w:val="20"/>
+        </w:rPr>
+        <w:t xml:space="preserve">Parágrafo </w:t>
+      </w:r>
+      <w:r>
+        <w:rPr>
+          <w:rFonts w:ascii="Aptos" w:hAnsi="Aptos" w:cs="Calibri"/>
+          <w:b/>
+          <w:bCs/>
+          <w:sz w:val="20"/>
+          <w:szCs w:val="20"/>
+        </w:rPr>
+        <w:t>Segundo</w:t>
+      </w:r>
+      <w:r>
+        <w:rPr>
+          <w:rFonts w:ascii="Aptos" w:hAnsi="Aptos" w:cs="Calibri"/>
+          <w:b/>
+          <w:bCs/>
+          <w:sz w:val="20"/>
+          <w:szCs w:val="20"/>
+        </w:rPr>
+        <w:t>:</w:t>
+      </w:r>
+      <w:r>
+        <w:rPr>
+          <w:rFonts w:ascii="Aptos" w:hAnsi="Aptos" w:cs="Calibri"/>
+          <w:sz w:val="20"/>
+          <w:szCs w:val="20"/>
+        </w:rPr>
+        <w:t xml:space="preserve"> Por circunstancias de fuerza mayor o caso fortuito podrá </w:t>
+      </w:r>
+      <w:r>
+        <w:rPr>
+          <w:rFonts w:ascii="Aptos" w:hAnsi="Aptos" w:cs="Calibri"/>
+          <w:b/>
+          <w:bCs/>
+          <w:sz w:val="20"/>
+          <w:szCs w:val="20"/>
+        </w:rPr>
+        <w:t>CAPITALINK</w:t>
+      </w:r>
+      <w:r>
+        <w:rPr>
+          <w:rFonts w:ascii="Aptos" w:hAnsi="Aptos" w:cs="Calibri"/>
+          <w:b/>
+          <w:bCs/>
+          <w:sz w:val="20"/>
+          <w:szCs w:val="20"/>
+        </w:rPr>
+        <w:t xml:space="preserve"> </w:t>
+      </w:r>
+      <w:r>
+        <w:rPr>
+          <w:rFonts w:ascii="Aptos" w:hAnsi="Aptos" w:cs="Calibri"/>
+          <w:sz w:val="20"/>
+          <w:szCs w:val="20"/>
+        </w:rPr>
+        <w:t xml:space="preserve">suspender temporalmente la ejecución del Contrato, mediante un Acta suscrita por </w:t>
+      </w:r>
+      <w:r>
+        <w:rPr>
+          <w:rFonts w:ascii="Aptos" w:hAnsi="Aptos" w:cs="Calibri"/>
+          <w:b/>
+          <w:bCs/>
+          <w:sz w:val="20"/>
+          <w:szCs w:val="20"/>
+        </w:rPr>
+        <w:t>CAPITALINK</w:t>
+      </w:r>
+      <w:r>
+        <w:rPr>
+          <w:rFonts w:ascii="Aptos" w:hAnsi="Aptos" w:cs="Calibri"/>
+          <w:b/>
+          <w:bCs/>
+          <w:sz w:val="20"/>
+          <w:szCs w:val="20"/>
+        </w:rPr>
+        <w:t xml:space="preserve"> </w:t>
+      </w:r>
+      <w:r>
+        <w:rPr>
+          <w:rFonts w:ascii="Aptos" w:hAnsi="Aptos" w:cs="Calibri"/>
+          <w:sz w:val="20"/>
+          <w:szCs w:val="20"/>
+        </w:rPr>
+        <w:t xml:space="preserve">en la cual se indiquen las causas que dieron origen a la suspensión, sin que para efectos del plazo del Contrato se compute el tiempo de suspensión, </w:t>
+      </w:r>
+      <w:r>
+        <w:rPr>
+          <w:rFonts w:ascii="Aptos" w:hAnsi="Aptos" w:cs="Calibri"/>
+          <w:b/>
+          <w:bCs/>
+          <w:sz w:val="20"/>
+          <w:szCs w:val="20"/>
+        </w:rPr>
+        <w:t>CAPITALINK</w:t>
+      </w:r>
+      <w:r>
+        <w:rPr>
+          <w:rFonts w:ascii="Aptos" w:hAnsi="Aptos" w:cs="Calibri"/>
+          <w:b/>
+          <w:bCs/>
+          <w:sz w:val="20"/>
+          <w:szCs w:val="20"/>
+        </w:rPr>
+        <w:t xml:space="preserve"> </w:t>
+      </w:r>
+      <w:r>
+        <w:rPr>
+          <w:rFonts w:ascii="Aptos" w:hAnsi="Aptos" w:cs="Calibri"/>
+          <w:sz w:val="20"/>
+          <w:szCs w:val="20"/>
+        </w:rPr>
+        <w:t xml:space="preserve">y </w:t>
+      </w:r>
+      <w:r>
+        <w:rPr>
+          <w:rFonts w:ascii="Aptos" w:hAnsi="Aptos" w:cs="Calibri"/>
+          <w:b/>
+          <w:bCs/>
+          <w:sz w:val="20"/>
+          <w:szCs w:val="20"/>
+        </w:rPr>
+        <w:t>EL CONTRATISTA</w:t>
+      </w:r>
+      <w:r>
+        <w:rPr>
+          <w:rFonts w:ascii="Aptos" w:hAnsi="Aptos" w:cs="Calibri"/>
+          <w:sz w:val="20"/>
+          <w:szCs w:val="20"/>
+        </w:rPr>
+        <w:t xml:space="preserve"> podrán reiniciar la ejecución de este Contrato cuando consideren que han desaparecido las causas que dieron origen a la suspensión. </w:t>
+      </w:r>
+      <w:r>
+        <w:rPr>
+          <w:rFonts w:ascii="Aptos" w:hAnsi="Aptos" w:cs="Calibri"/>
+          <w:sz w:val="20"/>
+          <w:szCs w:val="20"/>
+        </w:rPr>
+        <w:t>El presente Contrato se reiniciará mediante Acta en la que se indique que se ha superado la causa que di</w:t>
+      </w:r>
+      <w:r>
+        <w:rPr>
+          <w:rFonts w:ascii="Aptos" w:hAnsi="Aptos" w:cs="Calibri"/>
+          <w:sz w:val="20"/>
+          <w:szCs w:val="20"/>
+        </w:rPr>
+        <w:t>o</w:t>
+      </w:r>
+      <w:r>
+        <w:rPr>
+          <w:rFonts w:ascii="Aptos" w:hAnsi="Aptos" w:cs="Calibri"/>
+          <w:sz w:val="20"/>
+          <w:szCs w:val="20"/>
+        </w:rPr>
+        <w:t xml:space="preserve"> origen a la suspensión y en los mismos términos y acuerdos que ya se encontraban establecidos a</w:t>
+      </w:r>
+      <w:r>
+        <w:rPr>
+          <w:rFonts w:ascii="Aptos" w:hAnsi="Aptos" w:cs="Calibri"/>
+          <w:sz w:val="20"/>
+          <w:szCs w:val="20"/>
+        </w:rPr>
+        <w:t xml:space="preserve">l momento de la suspensión del Contrato, en especial, las tarifas establecidas en el Anexo Técnico. </w:t>
+      </w:r>
+    </w:p>
+    <w:p>
+      <w:pPr>
+        <w:jc w:val="both"/>
+        <w:rPr>
+          <w:rFonts w:ascii="Aptos" w:hAnsi="Aptos" w:cs="Calibri"/>
+          <w:sz w:val="20"/>
+          <w:szCs w:val="20"/>
+        </w:rPr>
+      </w:pPr>
+    </w:p>
+    <w:p>
+      <w:pPr>
+        <w:jc w:val="both"/>
+        <w:rPr>
+          <w:rFonts w:ascii="Aptos" w:hAnsi="Aptos" w:cs="Calibri"/>
+          <w:sz w:val="20"/>
+          <w:szCs w:val="20"/>
+        </w:rPr>
+      </w:pPr>
+      <w:r>
+        <w:rPr>
+          <w:rFonts w:ascii="Aptos" w:hAnsi="Aptos" w:cs="Calibri"/>
+          <w:b/>
+          <w:bCs/>
+          <w:sz w:val="20"/>
+          <w:szCs w:val="20"/>
+        </w:rPr>
+        <w:t>Séptima</w:t>
+      </w:r>
+      <w:r>
+        <w:rPr>
+          <w:rFonts w:ascii="Aptos" w:hAnsi="Aptos" w:cs="Calibri"/>
+          <w:b/>
+          <w:bCs/>
+          <w:sz w:val="20"/>
+          <w:szCs w:val="20"/>
+        </w:rPr>
+        <w:t>. Seguridad de la Información y Ciberseguridad:</w:t>
+      </w:r>
+      <w:r>
+        <w:rPr>
+          <w:rFonts w:ascii="Aptos" w:hAnsi="Aptos" w:cs="Calibri"/>
+          <w:sz w:val="20"/>
+          <w:szCs w:val="20"/>
+        </w:rPr>
+        <w:t xml:space="preserve"> </w:t>
+      </w:r>
+      <w:r>
+        <w:rPr>
+          <w:rFonts w:ascii="Aptos" w:hAnsi="Aptos" w:cs="Calibri"/>
+          <w:b/>
+          <w:sz w:val="20"/>
+          <w:szCs w:val="20"/>
+        </w:rPr>
+        <w:t>EL CONTRATISTA</w:t>
+      </w:r>
+      <w:r>
+        <w:rPr>
+          <w:rFonts w:ascii="Aptos" w:hAnsi="Aptos" w:cs="Calibri"/>
+          <w:sz w:val="20"/>
+          <w:szCs w:val="20"/>
+        </w:rPr>
+        <w:t xml:space="preserve"> se compromete a cumplir estrictamente con todas las políticas, normas y procedimientos de seguridad de la información y ciberseguridad establecidos por </w:t>
+      </w:r>
+      <w:r>
+        <w:rPr>
+          <w:rFonts w:ascii="Aptos" w:hAnsi="Aptos" w:cs="Calibri"/>
+          <w:b/>
+          <w:sz w:val="20"/>
+          <w:szCs w:val="20"/>
+        </w:rPr>
+        <w:t>CAPITALINK</w:t>
+      </w:r>
+      <w:r>
+        <w:rPr>
+          <w:rFonts w:ascii="Aptos" w:hAnsi="Aptos" w:cs="Calibri"/>
+          <w:b/>
+          <w:sz w:val="20"/>
+          <w:szCs w:val="20"/>
+        </w:rPr>
+        <w:t xml:space="preserve"> </w:t>
+      </w:r>
+      <w:r>
+        <w:rPr>
+          <w:rFonts w:ascii="Aptos" w:hAnsi="Aptos" w:cs="Calibri"/>
+          <w:sz w:val="20"/>
+          <w:szCs w:val="20"/>
+        </w:rPr>
+        <w:t>y sus clientes</w:t>
+      </w:r>
+      <w:r>
+        <w:rPr>
+          <w:rFonts w:ascii="Aptos" w:hAnsi="Aptos" w:cs="Calibri"/>
+          <w:sz w:val="20"/>
+          <w:szCs w:val="20"/>
+        </w:rPr>
+        <w:t xml:space="preserve">, así como con la legislación y normativa aplicable en Colombia incluyendo, pero no limitándose a, las disposiciones de la Ley 1581 de 2012 (protección de datos personales), la Ley 1273 de 2009 (delitos informáticos) y las regulaciones internacionales que sean aplicables. </w:t>
+      </w:r>
+      <w:r>
+        <w:rPr>
+          <w:rFonts w:ascii="Aptos" w:hAnsi="Aptos" w:cs="Calibri"/>
+          <w:b/>
+          <w:sz w:val="20"/>
+          <w:szCs w:val="20"/>
+        </w:rPr>
+        <w:t>EL CONTRATISTA</w:t>
+      </w:r>
+      <w:r>
+        <w:rPr>
+          <w:rFonts w:ascii="Aptos" w:hAnsi="Aptos" w:cs="Calibri"/>
+          <w:sz w:val="20"/>
+          <w:szCs w:val="20"/>
+        </w:rPr>
+        <w:t xml:space="preserve"> deberá garantizar que sus prácticas cumplan con los estándares exigidos por la ley y estar preparado para auditorías que verifiquen este cumplimiento. </w:t>
+      </w:r>
+    </w:p>
+    <w:p>
+      <w:pPr>
+        <w:jc w:val="both"/>
+        <w:rPr>
+          <w:rFonts w:ascii="Aptos" w:hAnsi="Aptos" w:cs="Calibri"/>
+          <w:sz w:val="20"/>
+          <w:szCs w:val="20"/>
+        </w:rPr>
+      </w:pPr>
+    </w:p>
+    <w:p>
+      <w:pPr>
+        <w:jc w:val="both"/>
+        <w:rPr>
+          <w:rFonts w:ascii="Aptos" w:hAnsi="Aptos" w:cs="Calibri"/>
+          <w:sz w:val="20"/>
+          <w:szCs w:val="20"/>
+        </w:rPr>
+      </w:pPr>
+      <w:r>
+        <w:rPr>
+          <w:rFonts w:ascii="Aptos" w:hAnsi="Aptos" w:cs="Calibri"/>
+          <w:b/>
+          <w:bCs/>
+          <w:sz w:val="20"/>
+          <w:szCs w:val="20"/>
+        </w:rPr>
+        <w:t xml:space="preserve">Parágrafo Primero: </w:t>
+      </w:r>
+      <w:r>
+        <w:rPr>
+          <w:rFonts w:ascii="Aptos" w:hAnsi="Aptos" w:cs="Calibri"/>
+          <w:b/>
+          <w:sz w:val="20"/>
+          <w:szCs w:val="20"/>
+        </w:rPr>
+        <w:t>EL CONTRATISTA</w:t>
+      </w:r>
+      <w:r>
+        <w:rPr>
+          <w:rFonts w:ascii="Aptos" w:hAnsi="Aptos" w:cs="Calibri"/>
+          <w:sz w:val="20"/>
+          <w:szCs w:val="20"/>
+        </w:rPr>
+        <w:t xml:space="preserve"> deberá implementar medidas técnicas y organizativas adecuadas para garantizar la seguridad, confidencialidad, integridad y disponibilidad de la información, incluyendo, pero no limitándose a, controles de acceso, cifrado de datos, gestión de vulnerabilidades, prevención de ataques informáticos (</w:t>
+      </w:r>
+      <w:proofErr w:type="gramStart"/>
+      <w:r>
+        <w:rPr>
+          <w:rFonts w:ascii="Aptos" w:hAnsi="Aptos" w:cs="Calibri"/>
+          <w:sz w:val="20"/>
+          <w:szCs w:val="20"/>
+        </w:rPr>
+        <w:t>malware</w:t>
+      </w:r>
+      <w:proofErr w:type="gramEnd"/>
+      <w:r>
+        <w:rPr>
+          <w:rFonts w:ascii="Aptos" w:hAnsi="Aptos" w:cs="Calibri"/>
+          <w:sz w:val="20"/>
+          <w:szCs w:val="20"/>
+        </w:rPr>
+        <w:t xml:space="preserve">, phishing, </w:t>
+      </w:r>
+      <w:proofErr w:type="spellStart"/>
+      <w:r>
+        <w:rPr>
+          <w:rFonts w:ascii="Aptos" w:hAnsi="Aptos" w:cs="Calibri"/>
+          <w:sz w:val="20"/>
+          <w:szCs w:val="20"/>
+        </w:rPr>
+        <w:t>ransomware</w:t>
+      </w:r>
+      <w:proofErr w:type="spellEnd"/>
+      <w:r>
+        <w:rPr>
+          <w:rFonts w:ascii="Aptos" w:hAnsi="Aptos" w:cs="Calibri"/>
+          <w:sz w:val="20"/>
+          <w:szCs w:val="20"/>
+        </w:rPr>
+        <w:t>), y procedimientos de recuperación ante desastres o incidentes de ciberseguridad. </w:t>
+      </w:r>
+    </w:p>
+    <w:p>
+      <w:pPr>
+        <w:jc w:val="both"/>
+        <w:rPr>
+          <w:rFonts w:ascii="Aptos" w:hAnsi="Aptos" w:cs="Calibri"/>
+          <w:sz w:val="20"/>
+          <w:szCs w:val="20"/>
+        </w:rPr>
+      </w:pPr>
+    </w:p>
+    <w:p>
+      <w:pPr>
+        <w:jc w:val="both"/>
+        <w:rPr>
+          <w:rFonts w:ascii="Aptos" w:hAnsi="Aptos" w:cs="Calibri"/>
+          <w:sz w:val="20"/>
+          <w:szCs w:val="20"/>
+        </w:rPr>
+      </w:pPr>
+      <w:r>
+        <w:rPr>
+          <w:rFonts w:ascii="Aptos" w:hAnsi="Aptos" w:cs="Calibri"/>
+          <w:b/>
+          <w:bCs/>
+          <w:sz w:val="20"/>
+          <w:szCs w:val="20"/>
+        </w:rPr>
+        <w:t>Parágrafo Segundo:</w:t>
+      </w:r>
+      <w:r>
+        <w:rPr>
+          <w:rFonts w:ascii="Aptos" w:hAnsi="Aptos" w:cs="Calibri"/>
+          <w:sz w:val="20"/>
+          <w:szCs w:val="20"/>
+        </w:rPr>
+        <w:t xml:space="preserve"> </w:t>
+      </w:r>
+      <w:r>
+        <w:rPr>
+          <w:rFonts w:ascii="Aptos" w:hAnsi="Aptos" w:cs="Calibri"/>
+          <w:b/>
+          <w:sz w:val="20"/>
+          <w:szCs w:val="20"/>
+        </w:rPr>
+        <w:t>EL CONTRATISTA</w:t>
+      </w:r>
+      <w:r>
+        <w:rPr>
+          <w:rFonts w:ascii="Aptos" w:hAnsi="Aptos" w:cs="Calibri"/>
+          <w:sz w:val="20"/>
+          <w:szCs w:val="20"/>
+        </w:rPr>
+        <w:t xml:space="preserve"> deberá asegurar que cualquier dato personal o sensible tratado en virtud de este Contrato será almacenado y procesado de conformidad con las normativas vigentes de protección de datos y ciberseguridad, implementando protocolos de cifrado tanto en tránsito como en reposo</w:t>
+      </w:r>
+      <w:r>
+        <w:rPr>
+          <w:rFonts w:ascii="Aptos" w:hAnsi="Aptos" w:cs="Calibri"/>
+          <w:b/>
+          <w:bCs/>
+          <w:sz w:val="20"/>
+          <w:szCs w:val="20"/>
+        </w:rPr>
+        <w:t>.</w:t>
+      </w:r>
+      <w:r>
+        <w:rPr>
+          <w:rFonts w:ascii="Aptos" w:hAnsi="Aptos" w:cs="Calibri"/>
+          <w:sz w:val="20"/>
+          <w:szCs w:val="20"/>
+        </w:rPr>
+        <w:t> </w:t>
+      </w:r>
+    </w:p>
+    <w:p>
+      <w:pPr>
+        <w:jc w:val="both"/>
+        <w:rPr>
+          <w:rFonts w:ascii="Aptos" w:hAnsi="Aptos" w:cs="Calibri"/>
+          <w:sz w:val="20"/>
+          <w:szCs w:val="20"/>
+        </w:rPr>
+      </w:pPr>
+    </w:p>
+    <w:p>
+      <w:pPr>
+        <w:jc w:val="both"/>
+        <w:rPr>
+          <w:rFonts w:ascii="Aptos" w:hAnsi="Aptos" w:cs="Calibri"/>
+          <w:sz w:val="20"/>
+          <w:szCs w:val="20"/>
+        </w:rPr>
+      </w:pPr>
+      <w:r>
+        <w:rPr>
+          <w:rFonts w:ascii="Aptos" w:hAnsi="Aptos" w:cs="Calibri"/>
+          <w:b/>
+          <w:bCs/>
+          <w:sz w:val="20"/>
+          <w:szCs w:val="20"/>
+        </w:rPr>
+        <w:t>Octava</w:t>
+      </w:r>
+      <w:r>
+        <w:rPr>
+          <w:rFonts w:ascii="Aptos" w:hAnsi="Aptos" w:cs="Calibri"/>
+          <w:b/>
+          <w:bCs/>
+          <w:sz w:val="20"/>
+          <w:szCs w:val="20"/>
+        </w:rPr>
+        <w:t xml:space="preserve">. Gestión de Incidentes de Seguridad: </w:t>
+      </w:r>
+      <w:r>
+        <w:rPr>
+          <w:rFonts w:ascii="Aptos" w:hAnsi="Aptos" w:cs="Calibri"/>
+          <w:sz w:val="20"/>
+          <w:szCs w:val="20"/>
+        </w:rPr>
+        <w:t xml:space="preserve">En caso de cualquier incidente o vulneración de seguridad que comprometa la información de </w:t>
+      </w:r>
+      <w:r>
+        <w:rPr>
+          <w:rFonts w:ascii="Aptos" w:hAnsi="Aptos" w:cs="Calibri"/>
+          <w:b/>
+          <w:bCs/>
+          <w:sz w:val="20"/>
+          <w:szCs w:val="20"/>
+        </w:rPr>
+        <w:t>CAPITALINK</w:t>
+      </w:r>
+      <w:r>
+        <w:rPr>
+          <w:rFonts w:ascii="Aptos" w:hAnsi="Aptos" w:cs="Calibri"/>
+          <w:b/>
+          <w:bCs/>
+          <w:sz w:val="20"/>
+          <w:szCs w:val="20"/>
+        </w:rPr>
+        <w:t xml:space="preserve"> </w:t>
+      </w:r>
+      <w:r>
+        <w:rPr>
+          <w:rFonts w:ascii="Aptos" w:hAnsi="Aptos" w:cs="Calibri"/>
+          <w:sz w:val="20"/>
+          <w:szCs w:val="20"/>
+        </w:rPr>
+        <w:t xml:space="preserve">o </w:t>
+      </w:r>
+      <w:r>
+        <w:rPr>
+          <w:rFonts w:ascii="Aptos" w:hAnsi="Aptos" w:cs="Calibri"/>
+          <w:sz w:val="20"/>
+          <w:szCs w:val="20"/>
+        </w:rPr>
+        <w:t>de sus clientes</w:t>
+      </w:r>
+      <w:r>
+        <w:rPr>
+          <w:rFonts w:ascii="Aptos" w:hAnsi="Aptos" w:cs="Calibri"/>
+          <w:sz w:val="20"/>
+          <w:szCs w:val="20"/>
+        </w:rPr>
+        <w:t xml:space="preserve">, </w:t>
+      </w:r>
+      <w:r>
+        <w:rPr>
+          <w:rFonts w:ascii="Aptos" w:hAnsi="Aptos" w:cs="Calibri"/>
+          <w:b/>
+          <w:sz w:val="20"/>
+          <w:szCs w:val="20"/>
+        </w:rPr>
+        <w:t>EL CONTRATISTA</w:t>
+      </w:r>
+      <w:r>
+        <w:rPr>
+          <w:rFonts w:ascii="Aptos" w:hAnsi="Aptos" w:cs="Calibri"/>
+          <w:sz w:val="20"/>
+          <w:szCs w:val="20"/>
+        </w:rPr>
+        <w:t xml:space="preserve"> deberá notificarlo de forma inmediata, en un plazo no mayor a veinticuatro (24) horas desde que tenga conocimiento </w:t>
+      </w:r>
+      <w:proofErr w:type="gramStart"/>
+      <w:r>
+        <w:rPr>
+          <w:rFonts w:ascii="Aptos" w:hAnsi="Aptos" w:cs="Calibri"/>
+          <w:sz w:val="20"/>
+          <w:szCs w:val="20"/>
+        </w:rPr>
+        <w:t>del mismo</w:t>
+      </w:r>
+      <w:proofErr w:type="gramEnd"/>
+      <w:r>
+        <w:rPr>
+          <w:rFonts w:ascii="Aptos" w:hAnsi="Aptos" w:cs="Calibri"/>
+          <w:sz w:val="20"/>
+          <w:szCs w:val="20"/>
+        </w:rPr>
+        <w:t xml:space="preserve">, e implementar todas las acciones correctivas necesarias para mitigar sus efectos. </w:t>
+      </w:r>
+      <w:r>
+        <w:rPr>
+          <w:rFonts w:ascii="Aptos" w:hAnsi="Aptos" w:cs="Calibri"/>
+          <w:b/>
+          <w:sz w:val="20"/>
+          <w:szCs w:val="20"/>
+        </w:rPr>
+        <w:t>EL CONTRATISTA</w:t>
+      </w:r>
+      <w:r>
+        <w:rPr>
+          <w:rFonts w:ascii="Aptos" w:hAnsi="Aptos" w:cs="Calibri"/>
+          <w:sz w:val="20"/>
+          <w:szCs w:val="20"/>
+        </w:rPr>
+        <w:t xml:space="preserve"> se compromete a colaborar plenamente con </w:t>
+      </w:r>
+      <w:r>
+        <w:rPr>
+          <w:rFonts w:ascii="Aptos" w:hAnsi="Aptos" w:cs="Calibri"/>
+          <w:b/>
+          <w:sz w:val="20"/>
+          <w:szCs w:val="20"/>
+        </w:rPr>
+        <w:t>CAPITALINK</w:t>
+      </w:r>
+      <w:r>
+        <w:rPr>
+          <w:rFonts w:ascii="Aptos" w:hAnsi="Aptos" w:cs="Calibri"/>
+          <w:b/>
+          <w:sz w:val="20"/>
+          <w:szCs w:val="20"/>
+        </w:rPr>
+        <w:t xml:space="preserve"> </w:t>
+      </w:r>
+      <w:r>
+        <w:rPr>
+          <w:rFonts w:ascii="Aptos" w:hAnsi="Aptos" w:cs="Calibri"/>
+          <w:sz w:val="20"/>
+          <w:szCs w:val="20"/>
+        </w:rPr>
+        <w:t>en la investigación y resolución de dicho incidente. </w:t>
+      </w:r>
+    </w:p>
+    <w:p>
+      <w:pPr>
+        <w:jc w:val="both"/>
+        <w:rPr>
+          <w:rFonts w:ascii="Aptos" w:hAnsi="Aptos" w:cs="Calibri"/>
+          <w:sz w:val="20"/>
+          <w:szCs w:val="20"/>
+        </w:rPr>
+      </w:pPr>
+    </w:p>
+    <w:p>
+      <w:pPr>
+        <w:jc w:val="both"/>
+        <w:rPr>
+          <w:rFonts w:ascii="Aptos" w:hAnsi="Aptos" w:cs="Calibri"/>
+          <w:sz w:val="20"/>
+          <w:szCs w:val="20"/>
+        </w:rPr>
+      </w:pPr>
+      <w:r>
+        <w:rPr>
+          <w:rFonts w:ascii="Aptos" w:hAnsi="Aptos" w:cs="Calibri"/>
+          <w:b/>
+          <w:bCs/>
+          <w:sz w:val="20"/>
+          <w:szCs w:val="20"/>
+        </w:rPr>
+        <w:t>Novena</w:t>
+      </w:r>
+      <w:r>
+        <w:rPr>
+          <w:rFonts w:ascii="Aptos" w:hAnsi="Aptos" w:cs="Calibri"/>
+          <w:b/>
+          <w:bCs/>
+          <w:sz w:val="20"/>
+          <w:szCs w:val="20"/>
+        </w:rPr>
+        <w:t xml:space="preserve">. Prohibición </w:t>
+      </w:r>
+      <w:r>
+        <w:rPr>
+          <w:rFonts w:ascii="Aptos" w:hAnsi="Aptos" w:cs="Calibri"/>
+          <w:b/>
+          <w:bCs/>
+          <w:sz w:val="20"/>
+          <w:szCs w:val="20"/>
+        </w:rPr>
+        <w:t>d</w:t>
+      </w:r>
+      <w:r>
+        <w:rPr>
+          <w:rFonts w:ascii="Aptos" w:hAnsi="Aptos" w:cs="Calibri"/>
+          <w:b/>
+          <w:bCs/>
+          <w:sz w:val="20"/>
+          <w:szCs w:val="20"/>
+        </w:rPr>
+        <w:t xml:space="preserve">e Cesión: </w:t>
+      </w:r>
+      <w:r>
+        <w:rPr>
+          <w:rFonts w:ascii="Aptos" w:hAnsi="Aptos" w:cs="Calibri"/>
+          <w:b/>
+          <w:sz w:val="20"/>
+          <w:szCs w:val="20"/>
+        </w:rPr>
+        <w:t>EL CONTRATISTA</w:t>
+      </w:r>
+      <w:r>
+        <w:rPr>
+          <w:rFonts w:ascii="Aptos" w:hAnsi="Aptos" w:cs="Calibri"/>
+          <w:sz w:val="20"/>
+          <w:szCs w:val="20"/>
+        </w:rPr>
+        <w:t xml:space="preserve"> declara que conoce que el presente Contrato es celebrado con fundamento en su experiencia y conocimiento, en virtud de ello queda prohibido ceder este Contrato o subcontratar la ejecución de ninguna de las actividades que se deriven del mismo.  </w:t>
+      </w:r>
+    </w:p>
+    <w:p>
+      <w:pPr>
+        <w:jc w:val="both"/>
+        <w:rPr>
+          <w:rFonts w:ascii="Aptos" w:hAnsi="Aptos" w:cs="Calibri"/>
+          <w:sz w:val="20"/>
+          <w:szCs w:val="20"/>
+        </w:rPr>
+      </w:pPr>
+    </w:p>
+    <w:p>
+      <w:pPr>
+        <w:jc w:val="both"/>
+        <w:rPr>
+          <w:rFonts w:ascii="Aptos" w:hAnsi="Aptos" w:cs="Calibri"/>
+          <w:sz w:val="20"/>
+          <w:szCs w:val="20"/>
+        </w:rPr>
+      </w:pPr>
+      <w:r>
+        <w:rPr>
+          <w:rFonts w:ascii="Aptos" w:hAnsi="Aptos" w:cs="Calibri"/>
+          <w:b/>
+          <w:bCs/>
+          <w:sz w:val="20"/>
+          <w:szCs w:val="20"/>
+        </w:rPr>
+        <w:t>Parágrafo Primero:</w:t>
+      </w:r>
+      <w:r>
+        <w:rPr>
+          <w:rFonts w:ascii="Aptos" w:hAnsi="Aptos" w:cs="Calibri"/>
+          <w:sz w:val="20"/>
+          <w:szCs w:val="20"/>
+        </w:rPr>
+        <w:t xml:space="preserve"> </w:t>
+      </w:r>
+      <w:r>
+        <w:rPr>
+          <w:rFonts w:ascii="Aptos" w:hAnsi="Aptos" w:cs="Calibri"/>
+          <w:b/>
+          <w:sz w:val="20"/>
+          <w:szCs w:val="20"/>
+        </w:rPr>
+        <w:t>EL CONTRATISTA</w:t>
+      </w:r>
+      <w:r>
+        <w:rPr>
+          <w:rFonts w:ascii="Aptos" w:hAnsi="Aptos" w:cs="Calibri"/>
+          <w:sz w:val="20"/>
+          <w:szCs w:val="20"/>
+        </w:rPr>
+        <w:t xml:space="preserve"> tendrá como obligación ejecutar las actividades derivadas del presente Contrato por sí mismo, cuando se tratare de una persona natural. En caso de que </w:t>
+      </w:r>
+      <w:r>
+        <w:rPr>
+          <w:rFonts w:ascii="Aptos" w:hAnsi="Aptos" w:cs="Calibri"/>
+          <w:b/>
+          <w:sz w:val="20"/>
+          <w:szCs w:val="20"/>
+        </w:rPr>
+        <w:t>EL CONTRATISTA</w:t>
+      </w:r>
+      <w:r>
+        <w:rPr>
+          <w:rFonts w:ascii="Aptos" w:hAnsi="Aptos" w:cs="Calibri"/>
+          <w:sz w:val="20"/>
+          <w:szCs w:val="20"/>
+        </w:rPr>
+        <w:t xml:space="preserve"> sea una persona jurídica, deberá cumplir con lo establecido en el presente Contrato, para elección del consultor encargado de desarrollar las actividades derivadas de este Contrato.  </w:t>
+      </w:r>
+    </w:p>
+    <w:p>
+      <w:pPr>
+        <w:jc w:val="both"/>
+        <w:rPr>
+          <w:rFonts w:ascii="Aptos" w:hAnsi="Aptos" w:cs="Calibri"/>
+          <w:sz w:val="20"/>
+          <w:szCs w:val="20"/>
+        </w:rPr>
+      </w:pPr>
+    </w:p>
+    <w:p>
+      <w:pPr>
+        <w:jc w:val="both"/>
+        <w:rPr>
+          <w:rFonts w:ascii="Aptos" w:hAnsi="Aptos" w:cs="Calibri"/>
+          <w:sz w:val="20"/>
+          <w:szCs w:val="20"/>
+        </w:rPr>
+      </w:pPr>
+      <w:r>
+        <w:rPr>
+          <w:rFonts w:ascii="Aptos" w:hAnsi="Aptos" w:cs="Calibri"/>
+          <w:b/>
+          <w:bCs/>
+          <w:sz w:val="20"/>
+          <w:szCs w:val="20"/>
+        </w:rPr>
+        <w:t>Décima</w:t>
+      </w:r>
+      <w:r>
+        <w:rPr>
+          <w:rFonts w:ascii="Aptos" w:hAnsi="Aptos" w:cs="Calibri"/>
+          <w:b/>
+          <w:bCs/>
+          <w:sz w:val="20"/>
+          <w:szCs w:val="20"/>
+        </w:rPr>
+        <w:t>. Auditoría:</w:t>
+      </w:r>
+      <w:r>
+        <w:rPr>
+          <w:rFonts w:ascii="Aptos" w:hAnsi="Aptos" w:cs="Calibri"/>
+          <w:sz w:val="20"/>
+          <w:szCs w:val="20"/>
+        </w:rPr>
+        <w:t xml:space="preserve"> </w:t>
+      </w:r>
+      <w:r>
+        <w:rPr>
+          <w:rFonts w:ascii="Aptos" w:hAnsi="Aptos" w:cs="Calibri"/>
+          <w:b/>
+          <w:sz w:val="20"/>
+          <w:szCs w:val="20"/>
+        </w:rPr>
+        <w:t>CAPITALINK</w:t>
+      </w:r>
+      <w:r>
+        <w:rPr>
+          <w:rFonts w:ascii="Aptos" w:hAnsi="Aptos" w:cs="Calibri"/>
+          <w:b/>
+          <w:sz w:val="20"/>
+          <w:szCs w:val="20"/>
+        </w:rPr>
+        <w:t xml:space="preserve"> </w:t>
+      </w:r>
+      <w:r>
+        <w:rPr>
+          <w:rFonts w:ascii="Aptos" w:hAnsi="Aptos" w:cs="Calibri"/>
+          <w:sz w:val="20"/>
+          <w:szCs w:val="20"/>
+        </w:rPr>
+        <w:t xml:space="preserve">podrá en cualquier momento iniciar una auditoría a </w:t>
+      </w:r>
+      <w:r>
+        <w:rPr>
+          <w:rFonts w:ascii="Aptos" w:hAnsi="Aptos" w:cs="Calibri"/>
+          <w:b/>
+          <w:bCs/>
+          <w:sz w:val="20"/>
+          <w:szCs w:val="20"/>
+        </w:rPr>
+        <w:t xml:space="preserve">EL </w:t>
+      </w:r>
+      <w:r>
+        <w:rPr>
+          <w:rFonts w:ascii="Aptos" w:hAnsi="Aptos" w:cs="Calibri"/>
+          <w:b/>
+          <w:bCs/>
+          <w:sz w:val="20"/>
+          <w:szCs w:val="20"/>
+        </w:rPr>
+        <w:t>CONTRATISTA</w:t>
+      </w:r>
+      <w:r>
+        <w:rPr>
+          <w:rFonts w:ascii="Aptos" w:hAnsi="Aptos" w:cs="Calibri"/>
+          <w:sz w:val="20"/>
+          <w:szCs w:val="20"/>
+        </w:rPr>
+        <w:t xml:space="preserve">, para lo cual deberá notificarlo de su intención de iniciar auditoría enunciando los documentos que requiere sean aportados o en todo caso, si realizará la auditoría en las instalaciones </w:t>
+      </w:r>
+      <w:r>
+        <w:rPr>
+          <w:rFonts w:ascii="Aptos" w:hAnsi="Aptos" w:cs="Calibri"/>
+          <w:bCs/>
+          <w:sz w:val="20"/>
+          <w:szCs w:val="20"/>
+        </w:rPr>
+        <w:t>de</w:t>
+      </w:r>
+      <w:r>
+        <w:rPr>
+          <w:rFonts w:ascii="Aptos" w:hAnsi="Aptos" w:cs="Calibri"/>
+          <w:b/>
+          <w:sz w:val="20"/>
+          <w:szCs w:val="20"/>
+        </w:rPr>
+        <w:t xml:space="preserve"> </w:t>
+      </w:r>
+      <w:r>
+        <w:rPr>
+          <w:rFonts w:ascii="Aptos" w:hAnsi="Aptos" w:cs="Calibri"/>
+          <w:b/>
+          <w:sz w:val="20"/>
+          <w:szCs w:val="20"/>
+        </w:rPr>
+        <w:t>EL CONTRATISTA</w:t>
+      </w:r>
+      <w:r>
+        <w:rPr>
+          <w:rFonts w:ascii="Aptos" w:hAnsi="Aptos" w:cs="Calibri"/>
+          <w:sz w:val="20"/>
+          <w:szCs w:val="20"/>
+        </w:rPr>
+        <w:t xml:space="preserve">. La finalidad de las auditorías establecidas en la presente Cláusula es verificar el cumplimiento de todas las obligaciones contenida en la Ley y en el presente Contrato para </w:t>
+      </w:r>
+      <w:r>
+        <w:rPr>
+          <w:rFonts w:ascii="Aptos" w:hAnsi="Aptos" w:cs="Calibri"/>
+          <w:b/>
+          <w:sz w:val="20"/>
+          <w:szCs w:val="20"/>
+        </w:rPr>
+        <w:t>EL CONTRATISTA</w:t>
+      </w:r>
+      <w:r>
+        <w:rPr>
+          <w:rFonts w:ascii="Aptos" w:hAnsi="Aptos" w:cs="Calibri"/>
+          <w:sz w:val="20"/>
+          <w:szCs w:val="20"/>
+        </w:rPr>
+        <w:t xml:space="preserve">. </w:t>
+      </w:r>
+    </w:p>
+    <w:p>
+      <w:pPr>
+        <w:jc w:val="both"/>
+        <w:rPr>
+          <w:rFonts w:ascii="Aptos" w:hAnsi="Aptos" w:cs="Calibri"/>
+          <w:sz w:val="20"/>
+          <w:szCs w:val="20"/>
+        </w:rPr>
+      </w:pPr>
+    </w:p>
+    <w:p>
+      <w:pPr>
+        <w:pStyle w:val="Sinespaciado"/>
+        <w:jc w:val="both"/>
+        <w:rPr>
+          <w:rFonts w:ascii="Aptos" w:eastAsiaTheme="minorEastAsia" w:hAnsi="Aptos" w:cs="Calibri"/>
+        </w:rPr>
+      </w:pPr>
+      <w:r>
+        <w:rPr>
+          <w:rFonts w:ascii="Aptos" w:hAnsi="Aptos" w:cs="Calibri"/>
+          <w:b/>
+          <w:bCs/>
+        </w:rPr>
+        <w:t>Décima</w:t>
+      </w:r>
+      <w:r>
+        <w:rPr>
+          <w:rFonts w:ascii="Aptos" w:hAnsi="Aptos" w:cs="Calibri"/>
+          <w:b/>
+          <w:bCs/>
+        </w:rPr>
+        <w:t xml:space="preserve"> Primera</w:t>
+      </w:r>
+      <w:r>
+        <w:rPr>
+          <w:rFonts w:ascii="Aptos" w:hAnsi="Aptos" w:cs="Calibri"/>
+          <w:b/>
+          <w:bCs/>
+        </w:rPr>
+        <w:t>. Naturaleza de la relación</w:t>
+      </w:r>
+      <w:r>
+        <w:rPr>
+          <w:rFonts w:ascii="Aptos" w:eastAsiaTheme="minorEastAsia" w:hAnsi="Aptos" w:cs="Calibri"/>
+          <w:b/>
+          <w:bCs/>
+        </w:rPr>
+        <w:t>:</w:t>
+      </w:r>
+      <w:r>
+        <w:rPr>
+          <w:rFonts w:ascii="Aptos" w:eastAsiaTheme="minorEastAsia" w:hAnsi="Aptos" w:cs="Calibri"/>
+        </w:rPr>
+        <w:t xml:space="preserve"> El vínculo contractual que se establece por el presente Contrato es de naturaleza civil- comercial, motivo por el cual  </w:t>
+      </w:r>
+      <w:r>
+        <w:rPr>
+          <w:rFonts w:ascii="Aptos" w:eastAsiaTheme="minorEastAsia" w:hAnsi="Aptos" w:cs="Calibri"/>
+          <w:b/>
+          <w:bCs/>
+        </w:rPr>
+        <w:t>EL CONTRATISTA</w:t>
+      </w:r>
+      <w:r>
+        <w:rPr>
+          <w:rFonts w:ascii="Aptos" w:eastAsiaTheme="minorEastAsia" w:hAnsi="Aptos" w:cs="Calibri"/>
+        </w:rPr>
+        <w:t xml:space="preserve"> y/o sus colaboradores dependientes e independientes o subcontratistas, no adquieren vínculo jurídico de carácter laboral o de servicios con </w:t>
+      </w:r>
+      <w:r>
+        <w:rPr>
+          <w:rFonts w:ascii="Aptos" w:eastAsiaTheme="minorEastAsia" w:hAnsi="Aptos" w:cs="Calibri"/>
+          <w:b/>
+          <w:bCs/>
+        </w:rPr>
+        <w:t>CAPITALINK</w:t>
+      </w:r>
+      <w:r>
+        <w:rPr>
+          <w:rFonts w:ascii="Aptos" w:eastAsiaTheme="minorEastAsia" w:hAnsi="Aptos" w:cs="Calibri"/>
+        </w:rPr>
+        <w:t xml:space="preserve">, por cuanto </w:t>
+      </w:r>
+      <w:r>
+        <w:rPr>
+          <w:rFonts w:ascii="Aptos" w:eastAsiaTheme="minorEastAsia" w:hAnsi="Aptos" w:cs="Calibri"/>
+          <w:b/>
+          <w:bCs/>
+        </w:rPr>
+        <w:t>EL CONTRATISTA</w:t>
+      </w:r>
+      <w:r>
+        <w:rPr>
+          <w:rFonts w:ascii="Aptos" w:eastAsiaTheme="minorEastAsia" w:hAnsi="Aptos" w:cs="Calibri"/>
+        </w:rPr>
+        <w:t xml:space="preserve"> tiene autonomía técnica, financiera, administrativa y operacional en tanto se compromete a ejecutar el presente Contrato con sus propios medios, bajo su responsabilidad y con sus propios colaboradores. Se deja expresa constancia en cuanto a que las Partes han negociado en pie de igualdad y nada de lo estipulado creará entre ellas sociedad de hecho o relación laboral alguna.</w:t>
+      </w:r>
+    </w:p>
+    <w:p>
+      <w:pPr>
+        <w:jc w:val="both"/>
+        <w:rPr>
+          <w:rFonts w:ascii="Aptos" w:hAnsi="Aptos" w:cs="Calibri"/>
+          <w:sz w:val="20"/>
+          <w:szCs w:val="20"/>
+        </w:rPr>
+      </w:pPr>
+    </w:p>
+    <w:p>
+      <w:pPr>
+        <w:pStyle w:val="Sinespaciado"/>
+        <w:jc w:val="both"/>
+        <w:rPr>
+          <w:rFonts w:ascii="Aptos" w:eastAsiaTheme="minorEastAsia" w:hAnsi="Aptos" w:cs="Calibri"/>
+        </w:rPr>
+      </w:pPr>
+      <w:r>
+        <w:rPr>
+          <w:rFonts w:ascii="Aptos" w:hAnsi="Aptos" w:cs="Calibri"/>
+          <w:b/>
+          <w:bCs/>
+        </w:rPr>
+        <w:t xml:space="preserve">Décima </w:t>
+      </w:r>
+      <w:r>
+        <w:rPr>
+          <w:rFonts w:ascii="Aptos" w:hAnsi="Aptos" w:cs="Calibri"/>
+          <w:b/>
+          <w:bCs/>
+        </w:rPr>
+        <w:t>Segunda</w:t>
+      </w:r>
+      <w:r>
+        <w:rPr>
+          <w:rFonts w:ascii="Aptos" w:hAnsi="Aptos" w:cs="Calibri"/>
+          <w:b/>
+          <w:bCs/>
+        </w:rPr>
+        <w:t xml:space="preserve">. </w:t>
+      </w:r>
+      <w:r>
+        <w:rPr>
+          <w:rFonts w:ascii="Aptos" w:eastAsiaTheme="minorEastAsia" w:hAnsi="Aptos" w:cs="Calibri"/>
+          <w:b/>
+        </w:rPr>
+        <w:t>Indemnidad:</w:t>
+      </w:r>
+      <w:r>
+        <w:rPr>
+          <w:rFonts w:ascii="Aptos" w:eastAsiaTheme="minorEastAsia" w:hAnsi="Aptos" w:cs="Calibri"/>
+        </w:rPr>
+        <w:t xml:space="preserve"> </w:t>
+      </w:r>
+      <w:r>
+        <w:rPr>
+          <w:rFonts w:ascii="Aptos" w:eastAsiaTheme="minorEastAsia" w:hAnsi="Aptos" w:cs="Calibri"/>
+          <w:b/>
+        </w:rPr>
+        <w:t>EL CONTRATISTA</w:t>
+      </w:r>
+      <w:r>
+        <w:rPr>
+          <w:rFonts w:ascii="Aptos" w:eastAsiaTheme="minorEastAsia" w:hAnsi="Aptos" w:cs="Calibri"/>
+        </w:rPr>
+        <w:t xml:space="preserve"> mantendrá </w:t>
+      </w:r>
+      <w:r>
+        <w:rPr>
+          <w:rFonts w:ascii="Aptos" w:eastAsiaTheme="minorEastAsia" w:hAnsi="Aptos" w:cs="Calibri"/>
+          <w:u w:val="single"/>
+        </w:rPr>
+        <w:t>indemne</w:t>
+      </w:r>
+      <w:r>
+        <w:rPr>
+          <w:rFonts w:ascii="Aptos" w:eastAsiaTheme="minorEastAsia" w:hAnsi="Aptos" w:cs="Calibri"/>
+        </w:rPr>
+        <w:t xml:space="preserve"> a </w:t>
+      </w:r>
+      <w:r>
+        <w:rPr>
+          <w:rFonts w:ascii="Aptos" w:eastAsiaTheme="minorEastAsia" w:hAnsi="Aptos" w:cs="Calibri"/>
+          <w:b/>
+        </w:rPr>
+        <w:t>CAPITALINK</w:t>
+      </w:r>
+      <w:r>
+        <w:rPr>
+          <w:rFonts w:ascii="Aptos" w:eastAsiaTheme="minorEastAsia" w:hAnsi="Aptos" w:cs="Calibri"/>
+          <w:b/>
+        </w:rPr>
+        <w:t xml:space="preserve"> </w:t>
+      </w:r>
+      <w:r>
+        <w:rPr>
+          <w:rFonts w:ascii="Aptos" w:eastAsiaTheme="minorEastAsia" w:hAnsi="Aptos" w:cs="Calibri"/>
+        </w:rPr>
+        <w:t xml:space="preserve">y las personas relacionadas directa o indirectamente con este, contra toda reclamación, demanda o acción legal que pueda surgir por daños o lesiones de cualquier índole a terceros, a </w:t>
+      </w:r>
+      <w:r>
+        <w:rPr>
+          <w:rFonts w:ascii="Aptos" w:eastAsiaTheme="minorEastAsia" w:hAnsi="Aptos" w:cs="Calibri"/>
+          <w:b/>
+        </w:rPr>
+        <w:t>CAPITALINK</w:t>
+      </w:r>
+      <w:r>
+        <w:rPr>
+          <w:rFonts w:ascii="Aptos" w:eastAsiaTheme="minorEastAsia" w:hAnsi="Aptos" w:cs="Calibri"/>
+          <w:b/>
+        </w:rPr>
+        <w:t xml:space="preserve"> </w:t>
+      </w:r>
+      <w:r>
+        <w:rPr>
+          <w:rFonts w:ascii="Aptos" w:eastAsiaTheme="minorEastAsia" w:hAnsi="Aptos" w:cs="Calibri"/>
+        </w:rPr>
+        <w:t xml:space="preserve">o a su propio personal en razón de la ejecución del presente Contrato y por no contar </w:t>
+      </w:r>
+      <w:r>
+        <w:rPr>
+          <w:rFonts w:ascii="Aptos" w:eastAsiaTheme="minorEastAsia" w:hAnsi="Aptos" w:cs="Calibri"/>
+          <w:b/>
+        </w:rPr>
+        <w:t>EL CONTRATISTA</w:t>
+      </w:r>
+      <w:r>
+        <w:rPr>
+          <w:rFonts w:ascii="Aptos" w:eastAsiaTheme="minorEastAsia" w:hAnsi="Aptos" w:cs="Calibri"/>
+        </w:rPr>
+        <w:t xml:space="preserve"> con los permisos, licencias, autorizaciones y demás para la debida ejecución de las actividades contratadas, considerándose para el efecto de responsabilidad , todas las acciones y omisiones del personal a su servicio.</w:t>
+      </w:r>
+    </w:p>
+    <w:p>
+      <w:pPr>
+        <w:pStyle w:val="Sinespaciado"/>
+        <w:jc w:val="both"/>
+        <w:rPr>
+          <w:rFonts w:ascii="Aptos" w:eastAsiaTheme="minorEastAsia" w:hAnsi="Aptos" w:cs="Calibri"/>
+        </w:rPr>
+      </w:pPr>
+    </w:p>
+    <w:p>
+      <w:pPr>
+        <w:pStyle w:val="Sinespaciado"/>
+        <w:jc w:val="both"/>
+        <w:rPr>
+          <w:rFonts w:ascii="Aptos" w:eastAsiaTheme="minorEastAsia" w:hAnsi="Aptos" w:cs="Calibri"/>
+        </w:rPr>
+      </w:pPr>
+      <w:r>
+        <w:rPr>
+          <w:rFonts w:ascii="Aptos" w:eastAsiaTheme="minorEastAsia" w:hAnsi="Aptos" w:cs="Calibri"/>
+          <w:b/>
+        </w:rPr>
+        <w:t>EL CONTRATISTA</w:t>
+      </w:r>
+      <w:r>
+        <w:rPr>
+          <w:rFonts w:ascii="Aptos" w:eastAsiaTheme="minorEastAsia" w:hAnsi="Aptos" w:cs="Calibri"/>
+        </w:rPr>
+        <w:t xml:space="preserve"> a través de la firma del presente Contrato, se compromete a salir en la defensa e indemnidad de los intereses de </w:t>
+      </w:r>
+      <w:r>
+        <w:rPr>
+          <w:rFonts w:ascii="Aptos" w:eastAsiaTheme="minorEastAsia" w:hAnsi="Aptos" w:cs="Calibri"/>
+          <w:b/>
+        </w:rPr>
+        <w:t>CAPITALINK</w:t>
+      </w:r>
+      <w:r>
+        <w:rPr>
+          <w:rFonts w:ascii="Aptos" w:eastAsiaTheme="minorEastAsia" w:hAnsi="Aptos" w:cs="Calibri"/>
+        </w:rPr>
+        <w:t xml:space="preserve">, en la integración del litisconsorcio o coadyuvancia necesarios, cuando quiera que se presente reclamación, sanción o proceso judicial en su contra, por actividades o faltas derivadas directa o indirectamente de las actividades objeto del Contrato, en ese sentido, con la firma del Contrato acepta ser llamado en garantía en cualquier proceso judicial en el cual sea vinculado </w:t>
+      </w:r>
+      <w:r>
+        <w:rPr>
+          <w:rFonts w:ascii="Aptos" w:eastAsiaTheme="minorEastAsia" w:hAnsi="Aptos" w:cs="Calibri"/>
+          <w:b/>
+        </w:rPr>
+        <w:t>CAPITALINK</w:t>
+      </w:r>
+      <w:r>
+        <w:rPr>
+          <w:rFonts w:ascii="Aptos" w:eastAsiaTheme="minorEastAsia" w:hAnsi="Aptos" w:cs="Calibri"/>
+        </w:rPr>
+        <w:t xml:space="preserve"> por cualquier tercero que tenga o haya tenido relación directa o indirecta con </w:t>
+      </w:r>
+      <w:r>
+        <w:rPr>
+          <w:rFonts w:ascii="Aptos" w:eastAsiaTheme="minorEastAsia" w:hAnsi="Aptos" w:cs="Calibri"/>
+          <w:b/>
+        </w:rPr>
+        <w:t>CAPITALINK</w:t>
+      </w:r>
+      <w:r>
+        <w:rPr>
+          <w:rFonts w:ascii="Aptos" w:eastAsiaTheme="minorEastAsia" w:hAnsi="Aptos" w:cs="Calibri"/>
+        </w:rPr>
+        <w:t>, en virtud de la celebración, ejecución y conclusión del presente Contrato.</w:t>
+      </w:r>
+    </w:p>
+    <w:p>
+      <w:pPr>
+        <w:pStyle w:val="Sinespaciado"/>
+        <w:jc w:val="both"/>
+        <w:rPr>
+          <w:rFonts w:ascii="Aptos" w:eastAsiaTheme="minorEastAsia" w:hAnsi="Aptos" w:cs="Calibri"/>
+        </w:rPr>
+      </w:pPr>
+    </w:p>
+    <w:p>
+      <w:pPr>
+        <w:pStyle w:val="Sinespaciado"/>
+        <w:jc w:val="both"/>
+        <w:rPr>
+          <w:rFonts w:ascii="Aptos" w:eastAsiaTheme="minorEastAsia" w:hAnsi="Aptos" w:cs="Calibri"/>
+        </w:rPr>
+      </w:pPr>
+      <w:r>
+        <w:rPr>
+          <w:rFonts w:ascii="Aptos" w:eastAsiaTheme="minorEastAsia" w:hAnsi="Aptos" w:cs="Calibri"/>
+          <w:b/>
+        </w:rPr>
+        <w:t>EL CONTRATISTA</w:t>
+      </w:r>
+      <w:r>
+        <w:rPr>
+          <w:rFonts w:ascii="Aptos" w:eastAsiaTheme="minorEastAsia" w:hAnsi="Aptos" w:cs="Calibri"/>
+        </w:rPr>
+        <w:t xml:space="preserve"> se compromete a hacer devolución en un plazo máximo de treinta (30) días calendario, de las sumas que haya cancelado </w:t>
+      </w:r>
+      <w:r>
+        <w:rPr>
+          <w:rFonts w:ascii="Aptos" w:eastAsiaTheme="minorEastAsia" w:hAnsi="Aptos" w:cs="Calibri"/>
+          <w:b/>
+        </w:rPr>
+        <w:t>CAPITALINK</w:t>
+      </w:r>
+      <w:r>
+        <w:rPr>
+          <w:rFonts w:ascii="Aptos" w:eastAsiaTheme="minorEastAsia" w:hAnsi="Aptos" w:cs="Calibri"/>
+          <w:b/>
+        </w:rPr>
+        <w:t xml:space="preserve"> </w:t>
+      </w:r>
+      <w:r>
+        <w:rPr>
+          <w:rFonts w:ascii="Aptos" w:eastAsiaTheme="minorEastAsia" w:hAnsi="Aptos" w:cs="Calibri"/>
+        </w:rPr>
+        <w:t xml:space="preserve">para la defensa, sus intereses o cualquier costo o gasto, como consecuencia de las situaciones planteadas en este contrato o por cualquier otra derivada del incumplimiento de las obligaciones, para lo cual el presente documento, junto con la manifestación de lo pagado, hecha por </w:t>
+      </w:r>
+      <w:r>
+        <w:rPr>
+          <w:rFonts w:ascii="Aptos" w:eastAsiaTheme="minorEastAsia" w:hAnsi="Aptos" w:cs="Calibri"/>
+          <w:b/>
+        </w:rPr>
+        <w:t>CAPITALINK</w:t>
+      </w:r>
+      <w:r>
+        <w:rPr>
+          <w:rFonts w:ascii="Aptos" w:eastAsiaTheme="minorEastAsia" w:hAnsi="Aptos" w:cs="Calibri"/>
+          <w:b/>
+        </w:rPr>
+        <w:t xml:space="preserve"> </w:t>
+      </w:r>
+      <w:r>
+        <w:rPr>
+          <w:rFonts w:ascii="Aptos" w:eastAsiaTheme="minorEastAsia" w:hAnsi="Aptos" w:cs="Calibri"/>
+        </w:rPr>
+        <w:t>constituirá título ejecutivo suficiente para exigir judicialmente la restitución de dichas sumas en el entendido que no habrá requerimiento en mora alguno.</w:t>
+      </w:r>
+    </w:p>
+    <w:p>
+      <w:pPr>
+        <w:pStyle w:val="Sinespaciado"/>
+        <w:jc w:val="both"/>
+        <w:rPr>
+          <w:rFonts w:ascii="Aptos" w:eastAsiaTheme="minorEastAsia" w:hAnsi="Aptos" w:cs="Calibri"/>
+        </w:rPr>
+      </w:pPr>
+    </w:p>
+    <w:p>
+      <w:pPr>
+        <w:jc w:val="both"/>
+        <w:rPr>
+          <w:rFonts w:ascii="Aptos" w:hAnsi="Aptos" w:cs="Calibri"/>
+          <w:sz w:val="20"/>
+          <w:szCs w:val="20"/>
+        </w:rPr>
+      </w:pPr>
+      <w:r>
+        <w:rPr>
+          <w:rFonts w:ascii="Aptos" w:hAnsi="Aptos" w:cs="Calibri"/>
+          <w:b/>
+          <w:bCs/>
+          <w:sz w:val="20"/>
+          <w:szCs w:val="20"/>
+        </w:rPr>
+        <w:t xml:space="preserve">Décima </w:t>
+      </w:r>
+      <w:r>
+        <w:rPr>
+          <w:rFonts w:ascii="Aptos" w:hAnsi="Aptos" w:cs="Calibri"/>
+          <w:b/>
+          <w:bCs/>
+          <w:sz w:val="20"/>
+          <w:szCs w:val="20"/>
+        </w:rPr>
+        <w:t>Tercera</w:t>
+      </w:r>
+      <w:r>
+        <w:rPr>
+          <w:rFonts w:ascii="Aptos" w:hAnsi="Aptos" w:cs="Calibri"/>
+          <w:b/>
+          <w:bCs/>
+          <w:sz w:val="20"/>
+          <w:szCs w:val="20"/>
+        </w:rPr>
+        <w:t>. Confidencialidad:</w:t>
+      </w:r>
+      <w:r>
+        <w:rPr>
+          <w:rFonts w:ascii="Aptos" w:hAnsi="Aptos" w:cs="Calibri"/>
+          <w:sz w:val="20"/>
+          <w:szCs w:val="20"/>
+        </w:rPr>
+        <w:t xml:space="preserve"> Las Partes se comprometen a mantener en estricta reserva y confidencialidad de la información, documentación, operaciones, procesos, tecnología y demás datos, a la que tuviera acceso o conocimiento en virtud del presente Contrato. Queda comprendido en la </w:t>
       </w:r>
       <w:r>
         <w:rPr>
@@ -4206,263 +5828,389 @@
           <w:szCs w:val="20"/>
         </w:rPr>
         <w:lastRenderedPageBreak/>
-        <w:t>la terminación surtirá efectos de forma inmediata. La terminación no eximirá a la Parte incumplida del cumplimiento de sus obligaciones, pudiendo la Parte cumplida o que se allanó a cumplir, solicitar el cumplimiento de la obligación, sin perjuicio de lo pactado en la Cláusula Penal. </w:t>
-      </w:r>
-    </w:p>
-    <w:p>
-      <w:pPr>
-        <w:jc w:val="both"/>
-        <w:rPr>
-          <w:rFonts w:ascii="Aptos" w:hAnsi="Aptos" w:cs="Calibri"/>
-          <w:sz w:val="20"/>
-          <w:szCs w:val="20"/>
-        </w:rPr>
-      </w:pPr>
-    </w:p>
-    <w:p>
-      <w:pPr>
-        <w:jc w:val="both"/>
-        <w:rPr>
-          <w:rFonts w:ascii="Aptos" w:hAnsi="Aptos" w:cs="Calibri"/>
-          <w:sz w:val="20"/>
-          <w:szCs w:val="20"/>
-        </w:rPr>
-      </w:pPr>
-    </w:p>
-    <w:p>
-      <w:pPr>
-        <w:jc w:val="both"/>
-        <w:rPr>
-          <w:rFonts w:ascii="Aptos" w:hAnsi="Aptos" w:cs="Calibri"/>
-          <w:sz w:val="20"/>
-          <w:szCs w:val="20"/>
-        </w:rPr>
-      </w:pPr>
-    </w:p>
-    <w:p>
-      <w:pPr>
-        <w:jc w:val="both"/>
-        <w:rPr>
-          <w:rFonts w:ascii="Aptos" w:hAnsi="Aptos" w:cs="Calibri"/>
-          <w:sz w:val="20"/>
-          <w:szCs w:val="20"/>
-        </w:rPr>
-      </w:pPr>
-      <w:r>
-        <w:rPr>
-          <w:rFonts w:ascii="Aptos" w:hAnsi="Aptos" w:cs="Calibri"/>
-          <w:sz w:val="20"/>
-          <w:szCs w:val="20"/>
-        </w:rPr>
-        <w:t xml:space="preserve">Las Partes dejan expresa constancia que, </w:t>
-      </w:r>
-      <w:r>
-        <w:rPr>
-          <w:rFonts w:ascii="Aptos" w:hAnsi="Aptos" w:cs="Calibri"/>
-          <w:sz w:val="20"/>
-          <w:szCs w:val="20"/>
-        </w:rPr>
-        <w:t xml:space="preserve">el Contratista se compromete a </w:t>
-      </w:r>
-      <w:r>
-        <w:rPr>
-          <w:rFonts w:ascii="Aptos" w:hAnsi="Aptos" w:cs="Calibri"/>
-          <w:sz w:val="20"/>
-          <w:szCs w:val="20"/>
-        </w:rPr>
-        <w:t>e</w:t>
-      </w:r>
-      <w:r>
-        <w:rPr>
-          <w:rFonts w:ascii="Aptos" w:hAnsi="Aptos" w:cs="Calibri"/>
-          <w:sz w:val="20"/>
-          <w:szCs w:val="20"/>
-        </w:rPr>
-        <w:t xml:space="preserve">ntregar toda la información que repose en su poder a la fecha de terminación del Contrato, que sea de propiedad de </w:t>
-      </w:r>
-      <w:r>
-        <w:rPr>
-          <w:rFonts w:ascii="Aptos" w:eastAsia="Aptos" w:hAnsi="Aptos" w:cs="Aptos"/>
-          <w:b/>
-          <w:bCs/>
-          <w:sz w:val="20"/>
-          <w:szCs w:val="20"/>
+        <w:t xml:space="preserve">obligación de confidencialidad, toda documentación que, por cualquier medio, se cursen las Partes en ejecución </w:t>
+      </w:r>
+      <w:proofErr w:type="gramStart"/>
+      <w:r>
+        <w:rPr>
+          <w:rFonts w:ascii="Aptos" w:hAnsi="Aptos" w:cs="Calibri"/>
+          <w:sz w:val="20"/>
+          <w:szCs w:val="20"/>
+        </w:rPr>
+        <w:t>del mismo</w:t>
+      </w:r>
+      <w:proofErr w:type="gramEnd"/>
+      <w:r>
+        <w:rPr>
+          <w:rFonts w:ascii="Aptos" w:hAnsi="Aptos" w:cs="Calibri"/>
+          <w:sz w:val="20"/>
+          <w:szCs w:val="20"/>
+        </w:rPr>
+        <w:t>.</w:t>
+      </w:r>
+    </w:p>
+    <w:p>
+      <w:pPr>
+        <w:jc w:val="both"/>
+        <w:rPr>
+          <w:rFonts w:ascii="Aptos" w:hAnsi="Aptos" w:cs="Calibri"/>
+          <w:sz w:val="20"/>
+          <w:szCs w:val="20"/>
+        </w:rPr>
+      </w:pPr>
+    </w:p>
+    <w:p>
+      <w:pPr>
+        <w:jc w:val="both"/>
+        <w:rPr>
+          <w:rFonts w:ascii="Aptos" w:hAnsi="Aptos" w:cs="Calibri"/>
+          <w:sz w:val="20"/>
+          <w:szCs w:val="20"/>
+        </w:rPr>
+      </w:pPr>
+      <w:r>
+        <w:rPr>
+          <w:rFonts w:ascii="Aptos" w:hAnsi="Aptos" w:cs="Calibri"/>
+          <w:b/>
+          <w:bCs/>
+          <w:sz w:val="20"/>
+          <w:szCs w:val="20"/>
+        </w:rPr>
+        <w:t>Parágrafo Primero:</w:t>
+      </w:r>
+      <w:r>
+        <w:rPr>
+          <w:rFonts w:ascii="Aptos" w:hAnsi="Aptos" w:cs="Calibri"/>
+          <w:sz w:val="20"/>
+          <w:szCs w:val="20"/>
+        </w:rPr>
+        <w:t xml:space="preserve"> A efectos de lo dispuesto en el párrafo precedente, para que se considere que una de las Partes  ha  incurrido en un incumplimiento de la obligación antes señalada, basta con que alguno o algunos de los antes mencionados revelen a cualquier tercero, ajeno a la otra Parte contratante, cualquier información contenida en la documentación o informes verbales que se le proporcione para la ejecución del objeto del presente Contrato, así como toda otra información que pudiera obtener como consecuencia del mismo. </w:t>
+      </w:r>
+    </w:p>
+    <w:p>
+      <w:pPr>
+        <w:jc w:val="both"/>
+        <w:rPr>
+          <w:rFonts w:ascii="Aptos" w:hAnsi="Aptos" w:cs="Calibri"/>
+          <w:sz w:val="20"/>
+          <w:szCs w:val="20"/>
+        </w:rPr>
+      </w:pPr>
+    </w:p>
+    <w:p>
+      <w:pPr>
+        <w:jc w:val="both"/>
+        <w:rPr>
+          <w:rFonts w:ascii="Aptos" w:hAnsi="Aptos" w:cs="Calibri"/>
+          <w:sz w:val="20"/>
+          <w:szCs w:val="20"/>
+        </w:rPr>
+      </w:pPr>
+      <w:r>
+        <w:rPr>
+          <w:rFonts w:ascii="Aptos" w:hAnsi="Aptos" w:cs="Calibri"/>
+          <w:b/>
+          <w:bCs/>
+          <w:sz w:val="20"/>
+          <w:szCs w:val="20"/>
+        </w:rPr>
+        <w:t>Parágrafo</w:t>
+      </w:r>
+      <w:r>
+        <w:rPr>
+          <w:rFonts w:ascii="Aptos" w:hAnsi="Aptos" w:cs="Calibri"/>
+          <w:sz w:val="20"/>
+          <w:szCs w:val="20"/>
+        </w:rPr>
+        <w:t xml:space="preserve"> </w:t>
+      </w:r>
+      <w:r>
+        <w:rPr>
+          <w:rFonts w:ascii="Aptos" w:hAnsi="Aptos" w:cs="Calibri"/>
+          <w:b/>
+          <w:bCs/>
+          <w:sz w:val="20"/>
+          <w:szCs w:val="20"/>
+        </w:rPr>
+        <w:t xml:space="preserve">Segundo: </w:t>
+      </w:r>
+      <w:r>
+        <w:rPr>
+          <w:rFonts w:ascii="Aptos" w:hAnsi="Aptos" w:cs="Calibri"/>
+          <w:sz w:val="20"/>
+          <w:szCs w:val="20"/>
+        </w:rPr>
+        <w:t xml:space="preserve">Si alguna de las Partes fuera notificada por cualquier autoridad judicial, administrativa, arbitral, entre otras análogas, a fin de que proporcione información y/o documentación relativa al presente Contrato, deberá notificar de inmediato y por escrito a la otra Parte para que esta ejerza las acciones conducentes a cautelar sus derechos, antes de entregar cualquier información y/o documentación. Esta obligación de confidencialidad se extiende a los empleados y asesores externos de cada una de las Partes, quienes harán uso exclusivo de la Información Confidencial para el cumplimiento del Contrato. </w:t>
+      </w:r>
+    </w:p>
+    <w:p>
+      <w:pPr>
+        <w:jc w:val="both"/>
+        <w:rPr>
+          <w:rFonts w:ascii="Aptos" w:hAnsi="Aptos" w:cs="Calibri"/>
+          <w:sz w:val="20"/>
+          <w:szCs w:val="20"/>
+        </w:rPr>
+      </w:pPr>
+    </w:p>
+    <w:p>
+      <w:pPr>
+        <w:jc w:val="both"/>
+        <w:rPr>
+          <w:rFonts w:ascii="Aptos" w:hAnsi="Aptos" w:cs="Calibri"/>
+          <w:sz w:val="20"/>
+          <w:szCs w:val="20"/>
+        </w:rPr>
+      </w:pPr>
+      <w:r>
+        <w:rPr>
+          <w:rFonts w:ascii="Aptos" w:hAnsi="Aptos" w:cs="Calibri"/>
+          <w:b/>
+          <w:bCs/>
+          <w:sz w:val="20"/>
+          <w:szCs w:val="20"/>
+        </w:rPr>
+        <w:t>Parágrafo Tercero:</w:t>
+      </w:r>
+      <w:r>
+        <w:rPr>
+          <w:rFonts w:ascii="Aptos" w:hAnsi="Aptos" w:cs="Calibri"/>
+          <w:sz w:val="20"/>
+          <w:szCs w:val="20"/>
+        </w:rPr>
+        <w:t xml:space="preserve"> La Información Confidencial no se dará a conocer a terceras personas, firmas o corporaciones sin la autorización escrita y previa de la otra Parte. Las Partes convienen expresamente que las obligaciones contenidas en la presente cláusula permanecerán con plena fuerza y vigor incluso vencido el plazo del presente contrato o resuelto el mismo.</w:t>
+      </w:r>
+    </w:p>
+    <w:p>
+      <w:pPr>
+        <w:pStyle w:val="Sinespaciado"/>
+        <w:jc w:val="both"/>
+        <w:rPr>
+          <w:rFonts w:ascii="Aptos" w:eastAsiaTheme="minorEastAsia" w:hAnsi="Aptos" w:cs="Calibri"/>
+        </w:rPr>
+      </w:pPr>
+    </w:p>
+    <w:p>
+      <w:pPr>
+        <w:pStyle w:val="Sinespaciado"/>
+        <w:jc w:val="both"/>
+        <w:rPr>
+          <w:rFonts w:ascii="Aptos" w:eastAsiaTheme="minorEastAsia" w:hAnsi="Aptos" w:cs="Calibri"/>
+        </w:rPr>
+      </w:pPr>
+      <w:r>
+        <w:rPr>
+          <w:rFonts w:ascii="Aptos" w:eastAsiaTheme="minorEastAsia" w:hAnsi="Aptos" w:cs="Calibri"/>
+          <w:b/>
+        </w:rPr>
+        <w:t xml:space="preserve">Décima </w:t>
+      </w:r>
+      <w:r>
+        <w:rPr>
+          <w:rFonts w:ascii="Aptos" w:eastAsiaTheme="minorEastAsia" w:hAnsi="Aptos" w:cs="Calibri"/>
+          <w:b/>
+        </w:rPr>
+        <w:t>Cuarta</w:t>
+      </w:r>
+      <w:r>
+        <w:rPr>
+          <w:rFonts w:ascii="Aptos" w:eastAsiaTheme="minorEastAsia" w:hAnsi="Aptos" w:cs="Calibri"/>
+          <w:b/>
+        </w:rPr>
+        <w:t>. Autorización de Tratamiento, Consulta y Registro de Datos Personales:</w:t>
+      </w:r>
+      <w:r>
+        <w:rPr>
+          <w:rFonts w:ascii="Aptos" w:eastAsia="Cambria" w:hAnsi="Aptos" w:cs="Calibri"/>
+          <w:b/>
+          <w:spacing w:val="2"/>
+        </w:rPr>
+        <w:t xml:space="preserve"> </w:t>
+      </w:r>
+      <w:r>
+        <w:rPr>
+          <w:rFonts w:ascii="Aptos" w:eastAsiaTheme="minorEastAsia" w:hAnsi="Aptos" w:cs="Calibri"/>
+          <w:b/>
+        </w:rPr>
+        <w:t>EL CONTRATISTA</w:t>
+      </w:r>
+      <w:r>
+        <w:rPr>
+          <w:rFonts w:ascii="Aptos" w:eastAsiaTheme="minorEastAsia" w:hAnsi="Aptos" w:cs="Calibri"/>
+        </w:rPr>
+        <w:t xml:space="preserve"> autoriza expresa e irrevocablemente a </w:t>
+      </w:r>
+      <w:r>
+        <w:rPr>
+          <w:rFonts w:ascii="Aptos" w:eastAsiaTheme="minorEastAsia" w:hAnsi="Aptos" w:cs="Calibri"/>
+          <w:b/>
         </w:rPr>
         <w:t>CAPITALINK</w:t>
       </w:r>
       <w:r>
         <w:rPr>
-          <w:rFonts w:ascii="Aptos" w:eastAsia="Aptos" w:hAnsi="Aptos" w:cs="Aptos"/>
-          <w:b/>
-          <w:bCs/>
-          <w:sz w:val="20"/>
-          <w:szCs w:val="20"/>
+          <w:rFonts w:ascii="Aptos" w:eastAsiaTheme="minorEastAsia" w:hAnsi="Aptos" w:cs="Calibri"/>
+          <w:b/>
         </w:rPr>
         <w:t xml:space="preserve"> </w:t>
       </w:r>
       <w:r>
         <w:rPr>
-          <w:rFonts w:ascii="Aptos" w:hAnsi="Aptos" w:cs="Calibri"/>
-          <w:sz w:val="20"/>
-          <w:szCs w:val="20"/>
-        </w:rPr>
-        <w:t>o de sus clientes, que a manera enunciativa podrá tratarse de manuales, procesos, procedimientos, accesos, configuraciones, informes, entre otros</w:t>
-      </w:r>
-      <w:r>
-        <w:rPr>
-          <w:rFonts w:ascii="Aptos" w:hAnsi="Aptos" w:cs="Calibri"/>
-          <w:sz w:val="20"/>
-          <w:szCs w:val="20"/>
-        </w:rPr>
-        <w:t>, so pena, de dar aplicación a lo establecido en la Cláusula Penal.</w:t>
-      </w:r>
-    </w:p>
-    <w:p>
-      <w:pPr>
-        <w:jc w:val="both"/>
-        <w:rPr>
-          <w:rFonts w:ascii="Aptos" w:hAnsi="Aptos" w:cs="Calibri"/>
-          <w:sz w:val="20"/>
-          <w:szCs w:val="20"/>
-        </w:rPr>
-      </w:pPr>
-    </w:p>
-    <w:p>
-      <w:pPr>
-        <w:jc w:val="both"/>
-        <w:rPr>
-          <w:rFonts w:ascii="Aptos" w:hAnsi="Aptos" w:cs="Calibri"/>
-          <w:sz w:val="20"/>
-          <w:szCs w:val="20"/>
-        </w:rPr>
-      </w:pPr>
-      <w:r>
-        <w:rPr>
-          <w:rFonts w:ascii="Aptos" w:hAnsi="Aptos" w:cs="Calibri"/>
-          <w:b/>
-          <w:bCs/>
-          <w:sz w:val="20"/>
-          <w:szCs w:val="20"/>
-        </w:rPr>
-        <w:t xml:space="preserve">Parágrafo </w:t>
-      </w:r>
-      <w:r>
-        <w:rPr>
-          <w:rFonts w:ascii="Aptos" w:hAnsi="Aptos" w:cs="Calibri"/>
-          <w:b/>
-          <w:bCs/>
-          <w:sz w:val="20"/>
-          <w:szCs w:val="20"/>
-        </w:rPr>
-        <w:t>Segundo</w:t>
-      </w:r>
-      <w:r>
-        <w:rPr>
-          <w:rFonts w:ascii="Aptos" w:hAnsi="Aptos" w:cs="Calibri"/>
-          <w:b/>
-          <w:bCs/>
-          <w:sz w:val="20"/>
-          <w:szCs w:val="20"/>
-        </w:rPr>
-        <w:t>:</w:t>
-      </w:r>
-      <w:r>
-        <w:rPr>
-          <w:rFonts w:ascii="Aptos" w:hAnsi="Aptos" w:cs="Calibri"/>
-          <w:sz w:val="20"/>
-          <w:szCs w:val="20"/>
-        </w:rPr>
-        <w:t xml:space="preserve"> Por circunstancias de fuerza mayor o caso fortuito podrá </w:t>
-      </w:r>
-      <w:r>
-        <w:rPr>
-          <w:rFonts w:ascii="Aptos" w:hAnsi="Aptos" w:cs="Calibri"/>
-          <w:b/>
-          <w:bCs/>
-          <w:sz w:val="20"/>
-          <w:szCs w:val="20"/>
+          <w:rFonts w:ascii="Aptos" w:eastAsiaTheme="minorEastAsia" w:hAnsi="Aptos" w:cs="Calibri"/>
+        </w:rPr>
+        <w:t>de conformidad con la Ley 1581 de 2012 y el Decreto 1377 de 2013, para realizar el tratamiento de la información de los datos personales que se informen en el presente documento y todos aquellos que le entregue con ocasión de las relaciones comerciales y contractuales.</w:t>
+      </w:r>
+    </w:p>
+    <w:p>
+      <w:pPr>
+        <w:pStyle w:val="Sinespaciado"/>
+        <w:jc w:val="both"/>
+        <w:rPr>
+          <w:rFonts w:ascii="Aptos" w:eastAsiaTheme="minorEastAsia" w:hAnsi="Aptos" w:cs="Calibri"/>
+        </w:rPr>
+      </w:pPr>
+    </w:p>
+    <w:p>
+      <w:pPr>
+        <w:pStyle w:val="Sinespaciado"/>
+        <w:jc w:val="both"/>
+        <w:rPr>
+          <w:rFonts w:ascii="Aptos" w:eastAsiaTheme="minorEastAsia" w:hAnsi="Aptos" w:cs="Calibri"/>
+        </w:rPr>
+      </w:pPr>
+      <w:r>
+        <w:rPr>
+          <w:rFonts w:ascii="Aptos" w:eastAsiaTheme="minorEastAsia" w:hAnsi="Aptos" w:cs="Calibri"/>
+        </w:rPr>
+        <w:t xml:space="preserve">La información y datos personales suministrados a </w:t>
+      </w:r>
+      <w:r>
+        <w:rPr>
+          <w:rFonts w:ascii="Aptos" w:eastAsiaTheme="minorEastAsia" w:hAnsi="Aptos" w:cs="Calibri"/>
+          <w:b/>
         </w:rPr>
         <w:t>CAPITALINK</w:t>
       </w:r>
       <w:r>
         <w:rPr>
-          <w:rFonts w:ascii="Aptos" w:hAnsi="Aptos" w:cs="Calibri"/>
-          <w:b/>
-          <w:bCs/>
-          <w:sz w:val="20"/>
-          <w:szCs w:val="20"/>
+          <w:rFonts w:ascii="Aptos" w:eastAsiaTheme="minorEastAsia" w:hAnsi="Aptos" w:cs="Calibri"/>
+          <w:b/>
         </w:rPr>
         <w:t xml:space="preserve"> </w:t>
       </w:r>
       <w:r>
         <w:rPr>
-          <w:rFonts w:ascii="Aptos" w:hAnsi="Aptos" w:cs="Calibri"/>
-          <w:sz w:val="20"/>
-          <w:szCs w:val="20"/>
-        </w:rPr>
-        <w:t xml:space="preserve">suspender temporalmente la ejecución del Contrato, mediante un Acta suscrita por </w:t>
-      </w:r>
-      <w:r>
-        <w:rPr>
-          <w:rFonts w:ascii="Aptos" w:hAnsi="Aptos" w:cs="Calibri"/>
-          <w:b/>
-          <w:bCs/>
-          <w:sz w:val="20"/>
-          <w:szCs w:val="20"/>
+          <w:rFonts w:ascii="Aptos" w:eastAsiaTheme="minorEastAsia" w:hAnsi="Aptos" w:cs="Calibri"/>
+        </w:rPr>
+        <w:t xml:space="preserve">podrán ser procesados, recolectados, almacenados, usados, circulados, suprimidos y compartidos. </w:t>
+      </w:r>
+      <w:r>
+        <w:rPr>
+          <w:rFonts w:ascii="Aptos" w:eastAsiaTheme="minorEastAsia" w:hAnsi="Aptos" w:cs="Calibri"/>
+          <w:b/>
+        </w:rPr>
+        <w:t>EL CONTRATISTA</w:t>
+      </w:r>
+      <w:r>
+        <w:rPr>
+          <w:rFonts w:ascii="Aptos" w:eastAsiaTheme="minorEastAsia" w:hAnsi="Aptos" w:cs="Calibri"/>
+        </w:rPr>
+        <w:t xml:space="preserve"> declara que acepta y conoce que los derechos que le asisten en calidad de titular de los datos personales objeto de tratamiento, como son: conocer, actualizar y solicitar la rectificación o supresión de datos; solicitar prueba del otorgamiento de la autorización; saber del uso que </w:t>
+      </w:r>
+      <w:r>
+        <w:rPr>
+          <w:rFonts w:ascii="Aptos" w:eastAsiaTheme="minorEastAsia" w:hAnsi="Aptos" w:cs="Calibri"/>
+          <w:b/>
         </w:rPr>
         <w:t>CAPITALINK</w:t>
       </w:r>
       <w:r>
         <w:rPr>
-          <w:rFonts w:ascii="Aptos" w:hAnsi="Aptos" w:cs="Calibri"/>
-          <w:b/>
-          <w:bCs/>
-          <w:sz w:val="20"/>
-          <w:szCs w:val="20"/>
+          <w:rFonts w:ascii="Aptos" w:eastAsiaTheme="minorEastAsia" w:hAnsi="Aptos" w:cs="Calibri"/>
+          <w:b/>
         </w:rPr>
         <w:t xml:space="preserve"> </w:t>
       </w:r>
       <w:r>
         <w:rPr>
-          <w:rFonts w:ascii="Aptos" w:hAnsi="Aptos" w:cs="Calibri"/>
-          <w:sz w:val="20"/>
-          <w:szCs w:val="20"/>
-        </w:rPr>
-        <w:t xml:space="preserve">en la cual se indiquen las causas que dieron origen a la suspensión, sin que para efectos del plazo del Contrato se compute el tiempo de suspensión, </w:t>
-      </w:r>
-      <w:r>
-        <w:rPr>
-          <w:rFonts w:ascii="Aptos" w:hAnsi="Aptos" w:cs="Calibri"/>
-          <w:b/>
-          <w:bCs/>
-          <w:sz w:val="20"/>
-          <w:szCs w:val="20"/>
+          <w:rFonts w:ascii="Aptos" w:eastAsiaTheme="minorEastAsia" w:hAnsi="Aptos" w:cs="Calibri"/>
+        </w:rPr>
+        <w:t xml:space="preserve">ha hecho de sus datos personales; revocar en cualquier momento  la  autorización de  inclusión  de  sus datos  personales  en  las  bases  de datos  de </w:t>
+      </w:r>
+      <w:r>
+        <w:rPr>
+          <w:rFonts w:ascii="Aptos" w:eastAsiaTheme="minorEastAsia" w:hAnsi="Aptos" w:cs="Calibri"/>
+          <w:b/>
         </w:rPr>
         <w:t>CAPITALINK</w:t>
       </w:r>
       <w:r>
         <w:rPr>
-          <w:rFonts w:ascii="Aptos" w:hAnsi="Aptos" w:cs="Calibri"/>
-          <w:b/>
-          <w:bCs/>
-          <w:sz w:val="20"/>
-          <w:szCs w:val="20"/>
+          <w:rFonts w:ascii="Aptos" w:eastAsiaTheme="minorEastAsia" w:hAnsi="Aptos" w:cs="Calibri"/>
+          <w:b/>
         </w:rPr>
         <w:t xml:space="preserve"> </w:t>
       </w:r>
       <w:r>
         <w:rPr>
-          <w:rFonts w:ascii="Aptos" w:hAnsi="Aptos" w:cs="Calibri"/>
-          <w:sz w:val="20"/>
-          <w:szCs w:val="20"/>
-        </w:rPr>
-        <w:t xml:space="preserve">y </w:t>
-      </w:r>
-      <w:r>
-        <w:rPr>
-          <w:rFonts w:ascii="Aptos" w:hAnsi="Aptos" w:cs="Calibri"/>
-          <w:b/>
-          <w:bCs/>
+          <w:rFonts w:ascii="Aptos" w:eastAsiaTheme="minorEastAsia" w:hAnsi="Aptos" w:cs="Calibri"/>
+        </w:rPr>
+        <w:t>y solicitar sin costo alguno los datos personales previamente autorizados.</w:t>
+      </w:r>
+    </w:p>
+    <w:p>
+      <w:pPr>
+        <w:jc w:val="both"/>
+        <w:rPr>
+          <w:rFonts w:ascii="Aptos" w:hAnsi="Aptos" w:cs="Calibri"/>
+          <w:sz w:val="20"/>
+          <w:szCs w:val="20"/>
+        </w:rPr>
+      </w:pPr>
+    </w:p>
+    <w:p>
+      <w:pPr>
+        <w:jc w:val="both"/>
+        <w:rPr>
+          <w:rFonts w:ascii="Aptos" w:hAnsi="Aptos" w:cs="Calibri"/>
+          <w:sz w:val="20"/>
+          <w:szCs w:val="20"/>
+        </w:rPr>
+      </w:pPr>
+      <w:r>
+        <w:rPr>
+          <w:rFonts w:ascii="Aptos" w:hAnsi="Aptos" w:cs="Calibri"/>
+          <w:b/>
+          <w:bCs/>
+          <w:sz w:val="20"/>
+          <w:szCs w:val="20"/>
+        </w:rPr>
+        <w:t xml:space="preserve">Décima </w:t>
+      </w:r>
+      <w:r>
+        <w:rPr>
+          <w:rFonts w:ascii="Aptos" w:hAnsi="Aptos" w:cs="Calibri"/>
+          <w:b/>
+          <w:bCs/>
+          <w:sz w:val="20"/>
+          <w:szCs w:val="20"/>
+        </w:rPr>
+        <w:t>Quinta</w:t>
+      </w:r>
+      <w:r>
+        <w:rPr>
+          <w:rFonts w:ascii="Aptos" w:hAnsi="Aptos" w:cs="Calibri"/>
+          <w:b/>
+          <w:bCs/>
+          <w:sz w:val="20"/>
+          <w:szCs w:val="20"/>
+        </w:rPr>
+        <w:t xml:space="preserve">. Uso Ético de la Información y Restricciones de Acceso. </w:t>
+      </w:r>
+      <w:r>
+        <w:rPr>
+          <w:rFonts w:ascii="Aptos" w:hAnsi="Aptos" w:cs="Calibri"/>
+          <w:b/>
           <w:sz w:val="20"/>
           <w:szCs w:val="20"/>
         </w:rPr>
@@ -4474,83 +6222,21 @@
           <w:sz w:val="20"/>
           <w:szCs w:val="20"/>
         </w:rPr>
-        <w:t xml:space="preserve"> podrán reiniciar la ejecución de este Contrato cuando consideren que han desaparecido las causas que dieron origen a la suspensión. </w:t>
-      </w:r>
-      <w:r>
-        <w:rPr>
-          <w:rFonts w:ascii="Aptos" w:hAnsi="Aptos" w:cs="Calibri"/>
-          <w:sz w:val="20"/>
-          <w:szCs w:val="20"/>
-        </w:rPr>
-        <w:t>El presente Contrato se reiniciará mediante Acta en la que se indique que se ha superado la causa que di</w:t>
-      </w:r>
-      <w:r>
-        <w:rPr>
-          <w:rFonts w:ascii="Aptos" w:hAnsi="Aptos" w:cs="Calibri"/>
-          <w:sz w:val="20"/>
-          <w:szCs w:val="20"/>
-        </w:rPr>
-        <w:t>o</w:t>
-      </w:r>
-      <w:r>
-        <w:rPr>
-          <w:rFonts w:ascii="Aptos" w:hAnsi="Aptos" w:cs="Calibri"/>
-          <w:sz w:val="20"/>
-          <w:szCs w:val="20"/>
-        </w:rPr>
-        <w:t xml:space="preserve"> origen a la suspensión y en los mismos términos y acuerdos que ya se encontraban establecidos a</w:t>
-      </w:r>
-      <w:r>
-        <w:rPr>
-          <w:rFonts w:ascii="Aptos" w:hAnsi="Aptos" w:cs="Calibri"/>
-          <w:sz w:val="20"/>
-          <w:szCs w:val="20"/>
-        </w:rPr>
-        <w:t xml:space="preserve">l momento de la suspensión del Contrato, en especial, las tarifas establecidas en el Anexo Técnico. </w:t>
-      </w:r>
-    </w:p>
-    <w:p>
-      <w:pPr>
-        <w:jc w:val="both"/>
-        <w:rPr>
-          <w:rFonts w:ascii="Aptos" w:hAnsi="Aptos" w:cs="Calibri"/>
-          <w:sz w:val="20"/>
-          <w:szCs w:val="20"/>
-        </w:rPr>
-      </w:pPr>
-    </w:p>
-    <w:p>
-      <w:pPr>
-        <w:jc w:val="both"/>
-        <w:rPr>
-          <w:rFonts w:ascii="Aptos" w:hAnsi="Aptos" w:cs="Calibri"/>
-          <w:sz w:val="20"/>
-          <w:szCs w:val="20"/>
-        </w:rPr>
-      </w:pPr>
-      <w:r>
-        <w:rPr>
-          <w:rFonts w:ascii="Aptos" w:hAnsi="Aptos" w:cs="Calibri"/>
-          <w:b/>
-          <w:bCs/>
-          <w:sz w:val="20"/>
-          <w:szCs w:val="20"/>
-        </w:rPr>
-        <w:t>Séptima</w:t>
-      </w:r>
-      <w:r>
-        <w:rPr>
-          <w:rFonts w:ascii="Aptos" w:hAnsi="Aptos" w:cs="Calibri"/>
-          <w:b/>
-          <w:bCs/>
-          <w:sz w:val="20"/>
-          <w:szCs w:val="20"/>
-        </w:rPr>
-        <w:t>. Seguridad de la Información y Ciberseguridad:</w:t>
-      </w:r>
-      <w:r>
-        <w:rPr>
-          <w:rFonts w:ascii="Aptos" w:hAnsi="Aptos" w:cs="Calibri"/>
+        <w:t xml:space="preserve"> se compromete a utilizar la información proporcionada por </w:t>
+      </w:r>
+      <w:r>
+        <w:rPr>
+          <w:rFonts w:ascii="Aptos" w:hAnsi="Aptos" w:cs="Calibri"/>
+          <w:b/>
+          <w:sz w:val="20"/>
+          <w:szCs w:val="20"/>
+        </w:rPr>
+        <w:t>CAPITALINK</w:t>
+      </w:r>
+      <w:r>
+        <w:rPr>
+          <w:rFonts w:ascii="Aptos" w:hAnsi="Aptos" w:cs="Calibri"/>
+          <w:b/>
           <w:sz w:val="20"/>
           <w:szCs w:val="20"/>
         </w:rPr>
@@ -4559,6 +6245,22 @@
       <w:r>
         <w:rPr>
           <w:rFonts w:ascii="Aptos" w:hAnsi="Aptos" w:cs="Calibri"/>
+          <w:sz w:val="20"/>
+          <w:szCs w:val="20"/>
+        </w:rPr>
+        <w:t xml:space="preserve">o sus clientes, </w:t>
+      </w:r>
+      <w:r>
+        <w:rPr>
+          <w:rFonts w:ascii="Aptos" w:hAnsi="Aptos" w:cs="Calibri"/>
+          <w:sz w:val="20"/>
+          <w:szCs w:val="20"/>
+        </w:rPr>
+        <w:t xml:space="preserve">únicamente para los fines específicos del presente contrato, manteniendo en todo momento la confidencialidad y siguiendo los principios éticos y profesionales aplicables. Queda prohibido que </w:t>
+      </w:r>
+      <w:r>
+        <w:rPr>
+          <w:rFonts w:ascii="Aptos" w:hAnsi="Aptos" w:cs="Calibri"/>
           <w:b/>
           <w:sz w:val="20"/>
           <w:szCs w:val="20"/>
@@ -4571,7 +6273,7 @@
           <w:sz w:val="20"/>
           <w:szCs w:val="20"/>
         </w:rPr>
-        <w:t xml:space="preserve"> se compromete a cumplir estrictamente con todas las políticas, normas y procedimientos de seguridad de la información y ciberseguridad establecidos por </w:t>
+        <w:t xml:space="preserve"> o sus colaboradores acceda, manipule o realice modificaciones a cualquier plataforma, sistema, servidor, base de datos o recurso tecnológico del Cliente sin la previa autorización por escrito de este o de </w:t>
       </w:r>
       <w:r>
         <w:rPr>
@@ -4585,6 +6287,119 @@
       <w:r>
         <w:rPr>
           <w:rFonts w:ascii="Aptos" w:hAnsi="Aptos" w:cs="Calibri"/>
+          <w:sz w:val="20"/>
+          <w:szCs w:val="20"/>
+        </w:rPr>
+        <w:t xml:space="preserve">. Asimismo, </w:t>
+      </w:r>
+      <w:r>
+        <w:rPr>
+          <w:rFonts w:ascii="Aptos" w:hAnsi="Aptos" w:cs="Calibri"/>
+          <w:b/>
+          <w:sz w:val="20"/>
+          <w:szCs w:val="20"/>
+        </w:rPr>
+        <w:t>EL CONTRATISTA</w:t>
+      </w:r>
+      <w:r>
+        <w:rPr>
+          <w:rFonts w:ascii="Aptos" w:hAnsi="Aptos" w:cs="Calibri"/>
+          <w:sz w:val="20"/>
+          <w:szCs w:val="20"/>
+        </w:rPr>
+        <w:t xml:space="preserve"> no podrá auto concederse permisos ni modificar configuraciones de acceso en dichos sistemas, ya sea para la realización de entregables, mantenimiento o cualquier otra actividad, sin que medie autorización escrita y previa del Cliente o </w:t>
+      </w:r>
+      <w:r>
+        <w:rPr>
+          <w:rFonts w:ascii="Aptos" w:hAnsi="Aptos" w:cs="Calibri"/>
+          <w:b/>
+          <w:sz w:val="20"/>
+          <w:szCs w:val="20"/>
+        </w:rPr>
+        <w:t>CAPITALINK</w:t>
+      </w:r>
+      <w:r>
+        <w:rPr>
+          <w:rFonts w:ascii="Aptos" w:hAnsi="Aptos" w:cs="Calibri"/>
+          <w:sz w:val="20"/>
+          <w:szCs w:val="20"/>
+        </w:rPr>
+        <w:t>. </w:t>
+      </w:r>
+    </w:p>
+    <w:p>
+      <w:pPr>
+        <w:jc w:val="both"/>
+        <w:rPr>
+          <w:rFonts w:ascii="Aptos" w:hAnsi="Aptos" w:cs="Calibri"/>
+          <w:sz w:val="20"/>
+          <w:szCs w:val="20"/>
+        </w:rPr>
+      </w:pPr>
+    </w:p>
+    <w:p>
+      <w:pPr>
+        <w:jc w:val="both"/>
+        <w:rPr>
+          <w:rFonts w:ascii="Aptos" w:hAnsi="Aptos" w:cs="Calibri"/>
+          <w:sz w:val="20"/>
+          <w:szCs w:val="20"/>
+        </w:rPr>
+      </w:pPr>
+      <w:r>
+        <w:rPr>
+          <w:rFonts w:ascii="Aptos" w:hAnsi="Aptos" w:cs="Calibri"/>
+          <w:sz w:val="20"/>
+          <w:szCs w:val="20"/>
+        </w:rPr>
+        <w:t xml:space="preserve">En caso de identificar vulnerabilidades, errores o problemas técnicos en las plataformas o sistemas del Cliente, </w:t>
+      </w:r>
+      <w:r>
+        <w:rPr>
+          <w:rFonts w:ascii="Aptos" w:hAnsi="Aptos" w:cs="Calibri"/>
+          <w:b/>
+          <w:sz w:val="20"/>
+          <w:szCs w:val="20"/>
+        </w:rPr>
+        <w:t>EL CONTRATISTA</w:t>
+      </w:r>
+      <w:r>
+        <w:rPr>
+          <w:rFonts w:ascii="Aptos" w:hAnsi="Aptos" w:cs="Calibri"/>
+          <w:sz w:val="20"/>
+          <w:szCs w:val="20"/>
+        </w:rPr>
+        <w:t xml:space="preserve"> deberá notificarlo inmediatamente al Cliente y a </w:t>
+      </w:r>
+      <w:r>
+        <w:rPr>
+          <w:rFonts w:ascii="Aptos" w:hAnsi="Aptos" w:cs="Calibri"/>
+          <w:b/>
+          <w:sz w:val="20"/>
+          <w:szCs w:val="20"/>
+        </w:rPr>
+        <w:t>CAPITALINK</w:t>
+      </w:r>
+      <w:r>
+        <w:rPr>
+          <w:rFonts w:ascii="Aptos" w:hAnsi="Aptos" w:cs="Calibri"/>
+          <w:sz w:val="20"/>
+          <w:szCs w:val="20"/>
+        </w:rPr>
+        <w:t xml:space="preserve">, sin intervenir en los sistemas hasta recibir la autorización correspondiente. Cualquier incumplimiento de estas obligaciones será considerado una violación grave del presente contrato y facultará a </w:t>
+      </w:r>
+      <w:r>
+        <w:rPr>
+          <w:rFonts w:ascii="Aptos" w:hAnsi="Aptos" w:cs="Calibri"/>
+          <w:b/>
+          <w:sz w:val="20"/>
+          <w:szCs w:val="20"/>
+        </w:rPr>
+        <w:t>CAPITALINK</w:t>
+      </w:r>
+      <w:r>
+        <w:rPr>
+          <w:rFonts w:ascii="Aptos" w:hAnsi="Aptos" w:cs="Calibri"/>
           <w:b/>
           <w:sz w:val="20"/>
           <w:szCs w:val="20"/>
@@ -4597,20 +6412,80 @@
           <w:sz w:val="20"/>
           <w:szCs w:val="20"/>
         </w:rPr>
-        <w:t>y sus clientes</w:t>
-      </w:r>
-      <w:r>
-        <w:rPr>
-          <w:rFonts w:ascii="Aptos" w:hAnsi="Aptos" w:cs="Calibri"/>
-          <w:sz w:val="20"/>
-          <w:szCs w:val="20"/>
-        </w:rPr>
-        <w:t xml:space="preserve">, así como con la legislación y normativa aplicable en Colombia incluyendo, pero no limitándose a, las disposiciones de la Ley 1581 de 2012 (protección de datos personales), la Ley 1273 de 2009 (delitos informáticos) y las regulaciones internacionales que sean aplicables. </w:t>
-      </w:r>
-      <w:r>
-        <w:rPr>
-          <w:rFonts w:ascii="Aptos" w:hAnsi="Aptos" w:cs="Calibri"/>
-          <w:b/>
+        <w:t xml:space="preserve">para </w:t>
+      </w:r>
+      <w:r>
+        <w:rPr>
+          <w:rFonts w:ascii="Aptos" w:hAnsi="Aptos" w:cs="Calibri"/>
+          <w:sz w:val="20"/>
+          <w:szCs w:val="20"/>
+        </w:rPr>
+        <w:lastRenderedPageBreak/>
+        <w:t>su terminación inmediata, sin perjuicio de las acciones legales que correspondan, incluyendo reclamaciones por daños y perjuicios, así como el cobro de la cláusula penal. </w:t>
+      </w:r>
+    </w:p>
+    <w:p>
+      <w:pPr>
+        <w:jc w:val="both"/>
+        <w:rPr>
+          <w:rFonts w:ascii="Aptos" w:hAnsi="Aptos" w:cs="Calibri"/>
+          <w:sz w:val="20"/>
+          <w:szCs w:val="20"/>
+        </w:rPr>
+      </w:pPr>
+    </w:p>
+    <w:p>
+      <w:pPr>
+        <w:jc w:val="both"/>
+        <w:rPr>
+          <w:rFonts w:ascii="Aptos" w:hAnsi="Aptos" w:cs="Calibri"/>
+          <w:sz w:val="20"/>
+          <w:szCs w:val="20"/>
+        </w:rPr>
+      </w:pPr>
+      <w:r>
+        <w:rPr>
+          <w:rFonts w:ascii="Aptos" w:hAnsi="Aptos" w:cs="Calibri"/>
+          <w:b/>
+          <w:bCs/>
+          <w:sz w:val="20"/>
+          <w:szCs w:val="20"/>
+        </w:rPr>
+        <w:t xml:space="preserve">Décima </w:t>
+      </w:r>
+      <w:r>
+        <w:rPr>
+          <w:rFonts w:ascii="Aptos" w:hAnsi="Aptos" w:cs="Calibri"/>
+          <w:b/>
+          <w:bCs/>
+          <w:sz w:val="20"/>
+          <w:szCs w:val="20"/>
+        </w:rPr>
+        <w:t>Sexta.</w:t>
+      </w:r>
+      <w:r>
+        <w:rPr>
+          <w:rFonts w:ascii="Aptos" w:hAnsi="Aptos" w:cs="Calibri"/>
+          <w:b/>
+          <w:bCs/>
+          <w:sz w:val="20"/>
+          <w:szCs w:val="20"/>
+        </w:rPr>
+        <w:t xml:space="preserve"> Cláusula Penal: </w:t>
+      </w:r>
+      <w:r>
+        <w:rPr>
+          <w:rFonts w:ascii="Aptos" w:hAnsi="Aptos" w:cs="Calibri"/>
+          <w:sz w:val="20"/>
+          <w:szCs w:val="20"/>
+        </w:rPr>
+        <w:t xml:space="preserve">El incumplimiento por parte de </w:t>
+      </w:r>
+      <w:r>
+        <w:rPr>
+          <w:rFonts w:ascii="Aptos" w:hAnsi="Aptos" w:cs="Calibri"/>
+          <w:b/>
+          <w:bCs/>
           <w:sz w:val="20"/>
           <w:szCs w:val="20"/>
         </w:rPr>
@@ -4622,193 +6497,7 @@
           <w:sz w:val="20"/>
           <w:szCs w:val="20"/>
         </w:rPr>
-        <w:t xml:space="preserve"> deberá garantizar que sus prácticas cumplan con los estándares exigidos por la ley y estar preparado para auditorías que verifiquen este cumplimiento. </w:t>
-      </w:r>
-    </w:p>
-    <w:p>
-      <w:pPr>
-        <w:jc w:val="both"/>
-        <w:rPr>
-          <w:rFonts w:ascii="Aptos" w:hAnsi="Aptos" w:cs="Calibri"/>
-          <w:sz w:val="20"/>
-          <w:szCs w:val="20"/>
-        </w:rPr>
-      </w:pPr>
-    </w:p>
-    <w:p>
-      <w:pPr>
-        <w:jc w:val="both"/>
-        <w:rPr>
-          <w:rFonts w:ascii="Aptos" w:hAnsi="Aptos" w:cs="Calibri"/>
-          <w:sz w:val="20"/>
-          <w:szCs w:val="20"/>
-        </w:rPr>
-      </w:pPr>
-      <w:r>
-        <w:rPr>
-          <w:rFonts w:ascii="Aptos" w:hAnsi="Aptos" w:cs="Calibri"/>
-          <w:b/>
-          <w:bCs/>
-          <w:sz w:val="20"/>
-          <w:szCs w:val="20"/>
-        </w:rPr>
-        <w:t xml:space="preserve">Parágrafo Primero: </w:t>
-      </w:r>
-      <w:r>
-        <w:rPr>
-          <w:rFonts w:ascii="Aptos" w:hAnsi="Aptos" w:cs="Calibri"/>
-          <w:b/>
-          <w:sz w:val="20"/>
-          <w:szCs w:val="20"/>
-        </w:rPr>
-        <w:t>EL CONTRATISTA</w:t>
-      </w:r>
-      <w:r>
-        <w:rPr>
-          <w:rFonts w:ascii="Aptos" w:hAnsi="Aptos" w:cs="Calibri"/>
-          <w:sz w:val="20"/>
-          <w:szCs w:val="20"/>
-        </w:rPr>
-        <w:t xml:space="preserve"> deberá implementar medidas técnicas y organizativas adecuadas para garantizar la seguridad, confidencialidad, integridad y disponibilidad de la información, incluyendo, pero no limitándose a, controles de acceso, cifrado de datos, gestión de vulnerabilidades, prevención de ataques informáticos (malware, phishing, </w:t>
-      </w:r>
-      <w:proofErr w:type="spellStart"/>
-      <w:r>
-        <w:rPr>
-          <w:rFonts w:ascii="Aptos" w:hAnsi="Aptos" w:cs="Calibri"/>
-          <w:sz w:val="20"/>
-          <w:szCs w:val="20"/>
-        </w:rPr>
-        <w:t>ransomware</w:t>
-      </w:r>
-      <w:proofErr w:type="spellEnd"/>
-      <w:r>
-        <w:rPr>
-          <w:rFonts w:ascii="Aptos" w:hAnsi="Aptos" w:cs="Calibri"/>
-          <w:sz w:val="20"/>
-          <w:szCs w:val="20"/>
-        </w:rPr>
-        <w:t>), y procedimientos de recuperación ante desastres o incidentes de ciberseguridad. </w:t>
-      </w:r>
-    </w:p>
-    <w:p>
-      <w:pPr>
-        <w:jc w:val="both"/>
-        <w:rPr>
-          <w:rFonts w:ascii="Aptos" w:hAnsi="Aptos" w:cs="Calibri"/>
-          <w:sz w:val="20"/>
-          <w:szCs w:val="20"/>
-        </w:rPr>
-      </w:pPr>
-    </w:p>
-    <w:p>
-      <w:pPr>
-        <w:jc w:val="both"/>
-        <w:rPr>
-          <w:rFonts w:ascii="Aptos" w:hAnsi="Aptos" w:cs="Calibri"/>
-          <w:sz w:val="20"/>
-          <w:szCs w:val="20"/>
-        </w:rPr>
-      </w:pPr>
-      <w:r>
-        <w:rPr>
-          <w:rFonts w:ascii="Aptos" w:hAnsi="Aptos" w:cs="Calibri"/>
-          <w:b/>
-          <w:bCs/>
-          <w:sz w:val="20"/>
-          <w:szCs w:val="20"/>
-        </w:rPr>
-        <w:t>Parágrafo Segundo:</w:t>
-      </w:r>
-      <w:r>
-        <w:rPr>
-          <w:rFonts w:ascii="Aptos" w:hAnsi="Aptos" w:cs="Calibri"/>
-          <w:sz w:val="20"/>
-          <w:szCs w:val="20"/>
-        </w:rPr>
-        <w:t xml:space="preserve"> </w:t>
-      </w:r>
-      <w:r>
-        <w:rPr>
-          <w:rFonts w:ascii="Aptos" w:hAnsi="Aptos" w:cs="Calibri"/>
-          <w:b/>
-          <w:sz w:val="20"/>
-          <w:szCs w:val="20"/>
-        </w:rPr>
-        <w:t>EL CONTRATISTA</w:t>
-      </w:r>
-      <w:r>
-        <w:rPr>
-          <w:rFonts w:ascii="Aptos" w:hAnsi="Aptos" w:cs="Calibri"/>
-          <w:sz w:val="20"/>
-          <w:szCs w:val="20"/>
-        </w:rPr>
-        <w:t xml:space="preserve"> deberá asegurar que cualquier dato personal o sensible tratado en virtud de este Contrato será almacenado y procesado de conformidad con las normativas vigentes de protección de datos y ciberseguridad, implementando protocolos de cifrado tanto en tránsito como en reposo</w:t>
-      </w:r>
-      <w:r>
-        <w:rPr>
-          <w:rFonts w:ascii="Aptos" w:hAnsi="Aptos" w:cs="Calibri"/>
-          <w:b/>
-          <w:bCs/>
-          <w:sz w:val="20"/>
-          <w:szCs w:val="20"/>
-        </w:rPr>
-        <w:t>.</w:t>
-      </w:r>
-      <w:r>
-        <w:rPr>
-          <w:rFonts w:ascii="Aptos" w:hAnsi="Aptos" w:cs="Calibri"/>
-          <w:sz w:val="20"/>
-          <w:szCs w:val="20"/>
-        </w:rPr>
-        <w:t> </w:t>
-      </w:r>
-    </w:p>
-    <w:p>
-      <w:pPr>
-        <w:jc w:val="both"/>
-        <w:rPr>
-          <w:rFonts w:ascii="Aptos" w:hAnsi="Aptos" w:cs="Calibri"/>
-          <w:sz w:val="20"/>
-          <w:szCs w:val="20"/>
-        </w:rPr>
-      </w:pPr>
-    </w:p>
-    <w:p>
-      <w:pPr>
-        <w:jc w:val="both"/>
-        <w:rPr>
-          <w:rFonts w:ascii="Aptos" w:hAnsi="Aptos" w:cs="Calibri"/>
-          <w:sz w:val="20"/>
-          <w:szCs w:val="20"/>
-        </w:rPr>
-      </w:pPr>
-      <w:r>
-        <w:rPr>
-          <w:rFonts w:ascii="Aptos" w:hAnsi="Aptos" w:cs="Calibri"/>
-          <w:b/>
-          <w:bCs/>
-          <w:sz w:val="20"/>
-          <w:szCs w:val="20"/>
-        </w:rPr>
-        <w:t>Octava</w:t>
-      </w:r>
-      <w:r>
-        <w:rPr>
-          <w:rFonts w:ascii="Aptos" w:hAnsi="Aptos" w:cs="Calibri"/>
-          <w:b/>
-          <w:bCs/>
-          <w:sz w:val="20"/>
-          <w:szCs w:val="20"/>
-        </w:rPr>
-        <w:t xml:space="preserve">. Gestión de Incidentes de Seguridad: </w:t>
-      </w:r>
-      <w:r>
-        <w:rPr>
-          <w:rFonts w:ascii="Aptos" w:hAnsi="Aptos" w:cs="Calibri"/>
-          <w:sz w:val="20"/>
-          <w:szCs w:val="20"/>
-        </w:rPr>
-        <w:t xml:space="preserve">En caso de cualquier incidente o vulneración de seguridad que comprometa la información de </w:t>
+        <w:t xml:space="preserve"> de la totalidad o algunas de las obligaciones derivadas del presente Contrato, dará derecho a </w:t>
       </w:r>
       <w:r>
         <w:rPr>
@@ -4823,1510 +6512,10 @@
       <w:r>
         <w:rPr>
           <w:rFonts w:ascii="Aptos" w:hAnsi="Aptos" w:cs="Calibri"/>
-          <w:b/>
-          <w:bCs/>
-          <w:sz w:val="20"/>
-          <w:szCs w:val="20"/>
-        </w:rPr>
-        <w:t xml:space="preserve"> </w:t>
-      </w:r>
-      <w:r>
-        <w:rPr>
-          <w:rFonts w:ascii="Aptos" w:hAnsi="Aptos" w:cs="Calibri"/>
-          <w:sz w:val="20"/>
-          <w:szCs w:val="20"/>
-        </w:rPr>
-        <w:t xml:space="preserve">o </w:t>
-      </w:r>
-      <w:r>
-        <w:rPr>
-          <w:rFonts w:ascii="Aptos" w:hAnsi="Aptos" w:cs="Calibri"/>
-          <w:sz w:val="20"/>
-          <w:szCs w:val="20"/>
-        </w:rPr>
-        <w:t>de sus clientes</w:t>
-      </w:r>
-      <w:r>
-        <w:rPr>
-          <w:rFonts w:ascii="Aptos" w:hAnsi="Aptos" w:cs="Calibri"/>
-          <w:sz w:val="20"/>
-          <w:szCs w:val="20"/>
-        </w:rPr>
-        <w:t xml:space="preserve">, </w:t>
-      </w:r>
-      <w:r>
-        <w:rPr>
-          <w:rFonts w:ascii="Aptos" w:hAnsi="Aptos" w:cs="Calibri"/>
-          <w:b/>
-          <w:sz w:val="20"/>
-          <w:szCs w:val="20"/>
-        </w:rPr>
-        <w:t>EL CONTRATISTA</w:t>
-      </w:r>
-      <w:r>
-        <w:rPr>
-          <w:rFonts w:ascii="Aptos" w:hAnsi="Aptos" w:cs="Calibri"/>
-          <w:sz w:val="20"/>
-          <w:szCs w:val="20"/>
-        </w:rPr>
-        <w:t xml:space="preserve"> deberá notificarlo de forma inmediata, en un plazo no mayor a veinticuatro (24) horas desde que tenga conocimiento del mismo, e implementar todas las acciones correctivas necesarias para mitigar sus efectos. </w:t>
-      </w:r>
-      <w:r>
-        <w:rPr>
-          <w:rFonts w:ascii="Aptos" w:hAnsi="Aptos" w:cs="Calibri"/>
-          <w:b/>
-          <w:sz w:val="20"/>
-          <w:szCs w:val="20"/>
-        </w:rPr>
-        <w:t>EL CONTRATISTA</w:t>
-      </w:r>
-      <w:r>
-        <w:rPr>
-          <w:rFonts w:ascii="Aptos" w:hAnsi="Aptos" w:cs="Calibri"/>
-          <w:sz w:val="20"/>
-          <w:szCs w:val="20"/>
-        </w:rPr>
-        <w:t xml:space="preserve"> se compromete a colaborar plenamente con </w:t>
-      </w:r>
-      <w:r>
-        <w:rPr>
-          <w:rFonts w:ascii="Aptos" w:hAnsi="Aptos" w:cs="Calibri"/>
-          <w:b/>
-          <w:sz w:val="20"/>
-          <w:szCs w:val="20"/>
-        </w:rPr>
-        <w:t>CAPITALINK</w:t>
-      </w:r>
-      <w:r>
-        <w:rPr>
-          <w:rFonts w:ascii="Aptos" w:hAnsi="Aptos" w:cs="Calibri"/>
-          <w:b/>
-          <w:sz w:val="20"/>
-          <w:szCs w:val="20"/>
-        </w:rPr>
-        <w:t xml:space="preserve"> </w:t>
-      </w:r>
-      <w:r>
-        <w:rPr>
-          <w:rFonts w:ascii="Aptos" w:hAnsi="Aptos" w:cs="Calibri"/>
-          <w:sz w:val="20"/>
-          <w:szCs w:val="20"/>
-        </w:rPr>
-        <w:t>en la investigación y resolución de dicho incidente. </w:t>
-      </w:r>
-    </w:p>
-    <w:p>
-      <w:pPr>
-        <w:jc w:val="both"/>
-        <w:rPr>
-          <w:rFonts w:ascii="Aptos" w:hAnsi="Aptos" w:cs="Calibri"/>
-          <w:sz w:val="20"/>
-          <w:szCs w:val="20"/>
-        </w:rPr>
-      </w:pPr>
-    </w:p>
-    <w:p>
-      <w:pPr>
-        <w:jc w:val="both"/>
-        <w:rPr>
-          <w:rFonts w:ascii="Aptos" w:hAnsi="Aptos" w:cs="Calibri"/>
-          <w:sz w:val="20"/>
-          <w:szCs w:val="20"/>
-        </w:rPr>
-      </w:pPr>
-      <w:r>
-        <w:rPr>
-          <w:rFonts w:ascii="Aptos" w:hAnsi="Aptos" w:cs="Calibri"/>
-          <w:b/>
-          <w:bCs/>
-          <w:sz w:val="20"/>
-          <w:szCs w:val="20"/>
-        </w:rPr>
-        <w:t>Novena</w:t>
-      </w:r>
-      <w:r>
-        <w:rPr>
-          <w:rFonts w:ascii="Aptos" w:hAnsi="Aptos" w:cs="Calibri"/>
-          <w:b/>
-          <w:bCs/>
-          <w:sz w:val="20"/>
-          <w:szCs w:val="20"/>
-        </w:rPr>
-        <w:t xml:space="preserve">. Prohibición </w:t>
-      </w:r>
-      <w:r>
-        <w:rPr>
-          <w:rFonts w:ascii="Aptos" w:hAnsi="Aptos" w:cs="Calibri"/>
-          <w:b/>
-          <w:bCs/>
-          <w:sz w:val="20"/>
-          <w:szCs w:val="20"/>
-        </w:rPr>
-        <w:t>d</w:t>
-      </w:r>
-      <w:r>
-        <w:rPr>
-          <w:rFonts w:ascii="Aptos" w:hAnsi="Aptos" w:cs="Calibri"/>
-          <w:b/>
-          <w:bCs/>
-          <w:sz w:val="20"/>
-          <w:szCs w:val="20"/>
-        </w:rPr>
-        <w:t xml:space="preserve">e Cesión: </w:t>
-      </w:r>
-      <w:r>
-        <w:rPr>
-          <w:rFonts w:ascii="Aptos" w:hAnsi="Aptos" w:cs="Calibri"/>
-          <w:b/>
-          <w:sz w:val="20"/>
-          <w:szCs w:val="20"/>
-        </w:rPr>
-        <w:t>EL CONTRATISTA</w:t>
-      </w:r>
-      <w:r>
-        <w:rPr>
-          <w:rFonts w:ascii="Aptos" w:hAnsi="Aptos" w:cs="Calibri"/>
-          <w:sz w:val="20"/>
-          <w:szCs w:val="20"/>
-        </w:rPr>
-        <w:t xml:space="preserve"> declara que conoce que el presente Contrato es celebrado con fundamento en su experiencia y conocimiento, en virtud de ello queda prohibido ceder este Contrato o subcontratar la ejecución de ninguna de las actividades que se deriven del mismo.  </w:t>
-      </w:r>
-    </w:p>
-    <w:p>
-      <w:pPr>
-        <w:jc w:val="both"/>
-        <w:rPr>
-          <w:rFonts w:ascii="Aptos" w:hAnsi="Aptos" w:cs="Calibri"/>
-          <w:sz w:val="20"/>
-          <w:szCs w:val="20"/>
-        </w:rPr>
-      </w:pPr>
-    </w:p>
-    <w:p>
-      <w:pPr>
-        <w:jc w:val="both"/>
-        <w:rPr>
-          <w:rFonts w:ascii="Aptos" w:hAnsi="Aptos" w:cs="Calibri"/>
-          <w:sz w:val="20"/>
-          <w:szCs w:val="20"/>
-        </w:rPr>
-      </w:pPr>
-      <w:r>
-        <w:rPr>
-          <w:rFonts w:ascii="Aptos" w:hAnsi="Aptos" w:cs="Calibri"/>
-          <w:b/>
-          <w:bCs/>
-          <w:sz w:val="20"/>
-          <w:szCs w:val="20"/>
-        </w:rPr>
-        <w:lastRenderedPageBreak/>
-        <w:t>Parágrafo Primero:</w:t>
-      </w:r>
-      <w:r>
-        <w:rPr>
-          <w:rFonts w:ascii="Aptos" w:hAnsi="Aptos" w:cs="Calibri"/>
-          <w:sz w:val="20"/>
-          <w:szCs w:val="20"/>
-        </w:rPr>
-        <w:t xml:space="preserve"> </w:t>
-      </w:r>
-      <w:r>
-        <w:rPr>
-          <w:rFonts w:ascii="Aptos" w:hAnsi="Aptos" w:cs="Calibri"/>
-          <w:b/>
-          <w:sz w:val="20"/>
-          <w:szCs w:val="20"/>
-        </w:rPr>
-        <w:t>EL CONTRATISTA</w:t>
-      </w:r>
-      <w:r>
-        <w:rPr>
-          <w:rFonts w:ascii="Aptos" w:hAnsi="Aptos" w:cs="Calibri"/>
-          <w:sz w:val="20"/>
-          <w:szCs w:val="20"/>
-        </w:rPr>
-        <w:t xml:space="preserve"> tendrá como obligación ejecutar las actividades derivadas del presente Contrato por sí mismo, cuando se tratare de una persona natural. En caso de que </w:t>
-      </w:r>
-      <w:r>
-        <w:rPr>
-          <w:rFonts w:ascii="Aptos" w:hAnsi="Aptos" w:cs="Calibri"/>
-          <w:b/>
-          <w:sz w:val="20"/>
-          <w:szCs w:val="20"/>
-        </w:rPr>
-        <w:t>EL CONTRATISTA</w:t>
-      </w:r>
-      <w:r>
-        <w:rPr>
-          <w:rFonts w:ascii="Aptos" w:hAnsi="Aptos" w:cs="Calibri"/>
-          <w:sz w:val="20"/>
-          <w:szCs w:val="20"/>
-        </w:rPr>
-        <w:t xml:space="preserve"> sea una persona jurídica, deberá cumplir con lo establecido en el presente Contrato, para elección del consultor encargado de desarrollar las actividades derivadas de este Contrato.  </w:t>
-      </w:r>
-    </w:p>
-    <w:p>
-      <w:pPr>
-        <w:jc w:val="both"/>
-        <w:rPr>
-          <w:rFonts w:ascii="Aptos" w:hAnsi="Aptos" w:cs="Calibri"/>
-          <w:sz w:val="20"/>
-          <w:szCs w:val="20"/>
-        </w:rPr>
-      </w:pPr>
-    </w:p>
-    <w:p>
-      <w:pPr>
-        <w:jc w:val="both"/>
-        <w:rPr>
-          <w:rFonts w:ascii="Aptos" w:hAnsi="Aptos" w:cs="Calibri"/>
-          <w:sz w:val="20"/>
-          <w:szCs w:val="20"/>
-        </w:rPr>
-      </w:pPr>
-      <w:r>
-        <w:rPr>
-          <w:rFonts w:ascii="Aptos" w:hAnsi="Aptos" w:cs="Calibri"/>
-          <w:b/>
-          <w:bCs/>
-          <w:sz w:val="20"/>
-          <w:szCs w:val="20"/>
-        </w:rPr>
-        <w:t>Décima</w:t>
-      </w:r>
-      <w:r>
-        <w:rPr>
-          <w:rFonts w:ascii="Aptos" w:hAnsi="Aptos" w:cs="Calibri"/>
-          <w:b/>
-          <w:bCs/>
-          <w:sz w:val="20"/>
-          <w:szCs w:val="20"/>
-        </w:rPr>
-        <w:t>. Auditoría:</w:t>
-      </w:r>
-      <w:r>
-        <w:rPr>
-          <w:rFonts w:ascii="Aptos" w:hAnsi="Aptos" w:cs="Calibri"/>
-          <w:sz w:val="20"/>
-          <w:szCs w:val="20"/>
-        </w:rPr>
-        <w:t xml:space="preserve"> </w:t>
-      </w:r>
-      <w:r>
-        <w:rPr>
-          <w:rFonts w:ascii="Aptos" w:hAnsi="Aptos" w:cs="Calibri"/>
-          <w:b/>
-          <w:sz w:val="20"/>
-          <w:szCs w:val="20"/>
-        </w:rPr>
-        <w:t>CAPITALINK</w:t>
-      </w:r>
-      <w:r>
-        <w:rPr>
-          <w:rFonts w:ascii="Aptos" w:hAnsi="Aptos" w:cs="Calibri"/>
-          <w:b/>
-          <w:sz w:val="20"/>
-          <w:szCs w:val="20"/>
-        </w:rPr>
-        <w:t xml:space="preserve"> </w:t>
-      </w:r>
-      <w:r>
-        <w:rPr>
-          <w:rFonts w:ascii="Aptos" w:hAnsi="Aptos" w:cs="Calibri"/>
-          <w:sz w:val="20"/>
-          <w:szCs w:val="20"/>
-        </w:rPr>
-        <w:t xml:space="preserve">podrá en cualquier momento iniciar una auditoría a </w:t>
-      </w:r>
-      <w:r>
-        <w:rPr>
-          <w:rFonts w:ascii="Aptos" w:hAnsi="Aptos" w:cs="Calibri"/>
-          <w:b/>
-          <w:bCs/>
-          <w:sz w:val="20"/>
-          <w:szCs w:val="20"/>
-        </w:rPr>
-        <w:t xml:space="preserve">EL </w:t>
-      </w:r>
-      <w:r>
-        <w:rPr>
-          <w:rFonts w:ascii="Aptos" w:hAnsi="Aptos" w:cs="Calibri"/>
-          <w:b/>
-          <w:bCs/>
-          <w:sz w:val="20"/>
-          <w:szCs w:val="20"/>
-        </w:rPr>
-        <w:t>CONTRATISTA</w:t>
-      </w:r>
-      <w:r>
-        <w:rPr>
-          <w:rFonts w:ascii="Aptos" w:hAnsi="Aptos" w:cs="Calibri"/>
-          <w:sz w:val="20"/>
-          <w:szCs w:val="20"/>
-        </w:rPr>
-        <w:t xml:space="preserve">, para lo cual deberá notificarlo de su intención de iniciar auditoría enunciando los documentos que requiere sean aportados o en todo caso, si realizará la auditoría en las instalaciones </w:t>
-      </w:r>
-      <w:r>
-        <w:rPr>
-          <w:rFonts w:ascii="Aptos" w:hAnsi="Aptos" w:cs="Calibri"/>
-          <w:bCs/>
-          <w:sz w:val="20"/>
-          <w:szCs w:val="20"/>
-        </w:rPr>
-        <w:t>de</w:t>
-      </w:r>
-      <w:r>
-        <w:rPr>
-          <w:rFonts w:ascii="Aptos" w:hAnsi="Aptos" w:cs="Calibri"/>
-          <w:b/>
-          <w:sz w:val="20"/>
-          <w:szCs w:val="20"/>
-        </w:rPr>
-        <w:t xml:space="preserve"> </w:t>
-      </w:r>
-      <w:r>
-        <w:rPr>
-          <w:rFonts w:ascii="Aptos" w:hAnsi="Aptos" w:cs="Calibri"/>
-          <w:b/>
-          <w:sz w:val="20"/>
-          <w:szCs w:val="20"/>
-        </w:rPr>
-        <w:t>EL CONTRATISTA</w:t>
-      </w:r>
-      <w:r>
-        <w:rPr>
-          <w:rFonts w:ascii="Aptos" w:hAnsi="Aptos" w:cs="Calibri"/>
-          <w:sz w:val="20"/>
-          <w:szCs w:val="20"/>
-        </w:rPr>
-        <w:t xml:space="preserve">. La finalidad de las auditorías establecidas en la presente Cláusula es verificar el cumplimiento de todas las obligaciones contenida en la Ley y en el presente Contrato para </w:t>
-      </w:r>
-      <w:r>
-        <w:rPr>
-          <w:rFonts w:ascii="Aptos" w:hAnsi="Aptos" w:cs="Calibri"/>
-          <w:b/>
-          <w:sz w:val="20"/>
-          <w:szCs w:val="20"/>
-        </w:rPr>
-        <w:t>EL CONTRATISTA</w:t>
-      </w:r>
-      <w:r>
-        <w:rPr>
-          <w:rFonts w:ascii="Aptos" w:hAnsi="Aptos" w:cs="Calibri"/>
-          <w:sz w:val="20"/>
-          <w:szCs w:val="20"/>
-        </w:rPr>
-        <w:t xml:space="preserve">. </w:t>
-      </w:r>
-    </w:p>
-    <w:p>
-      <w:pPr>
-        <w:jc w:val="both"/>
-        <w:rPr>
-          <w:rFonts w:ascii="Aptos" w:hAnsi="Aptos" w:cs="Calibri"/>
-          <w:sz w:val="20"/>
-          <w:szCs w:val="20"/>
-        </w:rPr>
-      </w:pPr>
-    </w:p>
-    <w:p>
-      <w:pPr>
-        <w:pStyle w:val="Sinespaciado"/>
-        <w:jc w:val="both"/>
-        <w:rPr>
-          <w:rFonts w:ascii="Aptos" w:eastAsiaTheme="minorEastAsia" w:hAnsi="Aptos" w:cs="Calibri"/>
-        </w:rPr>
-      </w:pPr>
-      <w:r>
-        <w:rPr>
-          <w:rFonts w:ascii="Aptos" w:hAnsi="Aptos" w:cs="Calibri"/>
-          <w:b/>
-          <w:bCs/>
-        </w:rPr>
-        <w:t>Décima</w:t>
-      </w:r>
-      <w:r>
-        <w:rPr>
-          <w:rFonts w:ascii="Aptos" w:hAnsi="Aptos" w:cs="Calibri"/>
-          <w:b/>
-          <w:bCs/>
-        </w:rPr>
-        <w:t xml:space="preserve"> Primera</w:t>
-      </w:r>
-      <w:r>
-        <w:rPr>
-          <w:rFonts w:ascii="Aptos" w:hAnsi="Aptos" w:cs="Calibri"/>
-          <w:b/>
-          <w:bCs/>
-        </w:rPr>
-        <w:t>. Naturaleza de la relación</w:t>
-      </w:r>
-      <w:r>
-        <w:rPr>
-          <w:rFonts w:ascii="Aptos" w:eastAsiaTheme="minorEastAsia" w:hAnsi="Aptos" w:cs="Calibri"/>
-          <w:b/>
-          <w:bCs/>
-        </w:rPr>
-        <w:t>:</w:t>
-      </w:r>
-      <w:r>
-        <w:rPr>
-          <w:rFonts w:ascii="Aptos" w:eastAsiaTheme="minorEastAsia" w:hAnsi="Aptos" w:cs="Calibri"/>
-        </w:rPr>
-        <w:t xml:space="preserve"> El vínculo contractual que se establece por el presente Contrato es de naturaleza civil- comercial, motivo por el cual  </w:t>
-      </w:r>
-      <w:r>
-        <w:rPr>
-          <w:rFonts w:ascii="Aptos" w:eastAsiaTheme="minorEastAsia" w:hAnsi="Aptos" w:cs="Calibri"/>
-          <w:b/>
-          <w:bCs/>
-        </w:rPr>
-        <w:t>EL CONTRATISTA</w:t>
-      </w:r>
-      <w:r>
-        <w:rPr>
-          <w:rFonts w:ascii="Aptos" w:eastAsiaTheme="minorEastAsia" w:hAnsi="Aptos" w:cs="Calibri"/>
-        </w:rPr>
-        <w:t xml:space="preserve"> y/o sus colaboradores dependientes e independientes o subcontratistas, no adquieren vínculo jurídico de carácter laboral o de servicios con </w:t>
-      </w:r>
-      <w:r>
-        <w:rPr>
-          <w:rFonts w:ascii="Aptos" w:eastAsiaTheme="minorEastAsia" w:hAnsi="Aptos" w:cs="Calibri"/>
-          <w:b/>
-          <w:bCs/>
-        </w:rPr>
-        <w:t>CAPITALINK</w:t>
-      </w:r>
-      <w:r>
-        <w:rPr>
-          <w:rFonts w:ascii="Aptos" w:eastAsiaTheme="minorEastAsia" w:hAnsi="Aptos" w:cs="Calibri"/>
-        </w:rPr>
-        <w:t xml:space="preserve">, por cuanto </w:t>
-      </w:r>
-      <w:r>
-        <w:rPr>
-          <w:rFonts w:ascii="Aptos" w:eastAsiaTheme="minorEastAsia" w:hAnsi="Aptos" w:cs="Calibri"/>
-          <w:b/>
-          <w:bCs/>
-        </w:rPr>
-        <w:t>EL CONTRATISTA</w:t>
-      </w:r>
-      <w:r>
-        <w:rPr>
-          <w:rFonts w:ascii="Aptos" w:eastAsiaTheme="minorEastAsia" w:hAnsi="Aptos" w:cs="Calibri"/>
-        </w:rPr>
-        <w:t xml:space="preserve"> tiene autonomía técnica, financiera, administrativa y operacional en tanto se compromete a ejecutar el presente Contrato con sus propios medios, bajo su responsabilidad y con sus propios colaboradores. Se deja expresa constancia en cuanto a que las Partes han negociado en pie de igualdad y nada de lo estipulado creará entre ellas sociedad de hecho o relación laboral alguna.</w:t>
-      </w:r>
-    </w:p>
-    <w:p>
-      <w:pPr>
-        <w:jc w:val="both"/>
-        <w:rPr>
-          <w:rFonts w:ascii="Aptos" w:hAnsi="Aptos" w:cs="Calibri"/>
-          <w:sz w:val="20"/>
-          <w:szCs w:val="20"/>
-        </w:rPr>
-      </w:pPr>
-    </w:p>
-    <w:p>
-      <w:pPr>
-        <w:pStyle w:val="Sinespaciado"/>
-        <w:jc w:val="both"/>
-        <w:rPr>
-          <w:rFonts w:ascii="Aptos" w:eastAsiaTheme="minorEastAsia" w:hAnsi="Aptos" w:cs="Calibri"/>
-        </w:rPr>
-      </w:pPr>
-      <w:r>
-        <w:rPr>
-          <w:rFonts w:ascii="Aptos" w:hAnsi="Aptos" w:cs="Calibri"/>
-          <w:b/>
-          <w:bCs/>
-        </w:rPr>
-        <w:t xml:space="preserve">Décima </w:t>
-      </w:r>
-      <w:r>
-        <w:rPr>
-          <w:rFonts w:ascii="Aptos" w:hAnsi="Aptos" w:cs="Calibri"/>
-          <w:b/>
-          <w:bCs/>
-        </w:rPr>
-        <w:t>Segunda</w:t>
-      </w:r>
-      <w:r>
-        <w:rPr>
-          <w:rFonts w:ascii="Aptos" w:hAnsi="Aptos" w:cs="Calibri"/>
-          <w:b/>
-          <w:bCs/>
-        </w:rPr>
-        <w:t xml:space="preserve">. </w:t>
-      </w:r>
-      <w:r>
-        <w:rPr>
-          <w:rFonts w:ascii="Aptos" w:eastAsiaTheme="minorEastAsia" w:hAnsi="Aptos" w:cs="Calibri"/>
-          <w:b/>
-        </w:rPr>
-        <w:t>Indemnidad:</w:t>
-      </w:r>
-      <w:r>
-        <w:rPr>
-          <w:rFonts w:ascii="Aptos" w:eastAsiaTheme="minorEastAsia" w:hAnsi="Aptos" w:cs="Calibri"/>
-        </w:rPr>
-        <w:t xml:space="preserve"> </w:t>
-      </w:r>
-      <w:r>
-        <w:rPr>
-          <w:rFonts w:ascii="Aptos" w:eastAsiaTheme="minorEastAsia" w:hAnsi="Aptos" w:cs="Calibri"/>
-          <w:b/>
-        </w:rPr>
-        <w:t>EL CONTRATISTA</w:t>
-      </w:r>
-      <w:r>
-        <w:rPr>
-          <w:rFonts w:ascii="Aptos" w:eastAsiaTheme="minorEastAsia" w:hAnsi="Aptos" w:cs="Calibri"/>
-        </w:rPr>
-        <w:t xml:space="preserve"> mantendrá </w:t>
-      </w:r>
-      <w:r>
-        <w:rPr>
-          <w:rFonts w:ascii="Aptos" w:eastAsiaTheme="minorEastAsia" w:hAnsi="Aptos" w:cs="Calibri"/>
-          <w:u w:val="single"/>
-        </w:rPr>
-        <w:t>indemne</w:t>
-      </w:r>
-      <w:r>
-        <w:rPr>
-          <w:rFonts w:ascii="Aptos" w:eastAsiaTheme="minorEastAsia" w:hAnsi="Aptos" w:cs="Calibri"/>
-        </w:rPr>
-        <w:t xml:space="preserve"> a </w:t>
-      </w:r>
-      <w:r>
-        <w:rPr>
-          <w:rFonts w:ascii="Aptos" w:eastAsiaTheme="minorEastAsia" w:hAnsi="Aptos" w:cs="Calibri"/>
-          <w:b/>
-        </w:rPr>
-        <w:t>CAPITALINK</w:t>
-      </w:r>
-      <w:r>
-        <w:rPr>
-          <w:rFonts w:ascii="Aptos" w:eastAsiaTheme="minorEastAsia" w:hAnsi="Aptos" w:cs="Calibri"/>
-          <w:b/>
-        </w:rPr>
-        <w:t xml:space="preserve"> </w:t>
-      </w:r>
-      <w:r>
-        <w:rPr>
-          <w:rFonts w:ascii="Aptos" w:eastAsiaTheme="minorEastAsia" w:hAnsi="Aptos" w:cs="Calibri"/>
-        </w:rPr>
-        <w:t xml:space="preserve">y las personas relacionadas directa o indirectamente con este, contra toda reclamación, demanda o acción legal que pueda surgir por daños o lesiones de cualquier índole a terceros, a </w:t>
-      </w:r>
-      <w:r>
-        <w:rPr>
-          <w:rFonts w:ascii="Aptos" w:eastAsiaTheme="minorEastAsia" w:hAnsi="Aptos" w:cs="Calibri"/>
-          <w:b/>
-        </w:rPr>
-        <w:t>CAPITALINK</w:t>
-      </w:r>
-      <w:r>
-        <w:rPr>
-          <w:rFonts w:ascii="Aptos" w:eastAsiaTheme="minorEastAsia" w:hAnsi="Aptos" w:cs="Calibri"/>
-          <w:b/>
-        </w:rPr>
-        <w:t xml:space="preserve"> </w:t>
-      </w:r>
-      <w:r>
-        <w:rPr>
-          <w:rFonts w:ascii="Aptos" w:eastAsiaTheme="minorEastAsia" w:hAnsi="Aptos" w:cs="Calibri"/>
-        </w:rPr>
-        <w:t xml:space="preserve">o a su propio personal en razón de la ejecución del presente Contrato y por no contar </w:t>
-      </w:r>
-      <w:r>
-        <w:rPr>
-          <w:rFonts w:ascii="Aptos" w:eastAsiaTheme="minorEastAsia" w:hAnsi="Aptos" w:cs="Calibri"/>
-          <w:b/>
-        </w:rPr>
-        <w:t>EL CONTRATISTA</w:t>
-      </w:r>
-      <w:r>
-        <w:rPr>
-          <w:rFonts w:ascii="Aptos" w:eastAsiaTheme="minorEastAsia" w:hAnsi="Aptos" w:cs="Calibri"/>
-        </w:rPr>
-        <w:t xml:space="preserve"> con los permisos, licencias, autorizaciones y demás para la debida ejecución de las actividades contratadas, considerándose para el efecto de responsabilidad , todas las acciones y omisiones del personal a su servicio.</w:t>
-      </w:r>
-    </w:p>
-    <w:p>
-      <w:pPr>
-        <w:pStyle w:val="Sinespaciado"/>
-        <w:jc w:val="both"/>
-        <w:rPr>
-          <w:rFonts w:ascii="Aptos" w:eastAsiaTheme="minorEastAsia" w:hAnsi="Aptos" w:cs="Calibri"/>
-        </w:rPr>
-      </w:pPr>
-    </w:p>
-    <w:p>
-      <w:pPr>
-        <w:pStyle w:val="Sinespaciado"/>
-        <w:jc w:val="both"/>
-        <w:rPr>
-          <w:rFonts w:ascii="Aptos" w:eastAsiaTheme="minorEastAsia" w:hAnsi="Aptos" w:cs="Calibri"/>
-        </w:rPr>
-      </w:pPr>
-      <w:r>
-        <w:rPr>
-          <w:rFonts w:ascii="Aptos" w:eastAsiaTheme="minorEastAsia" w:hAnsi="Aptos" w:cs="Calibri"/>
-          <w:b/>
-        </w:rPr>
-        <w:t>EL CONTRATISTA</w:t>
-      </w:r>
-      <w:r>
-        <w:rPr>
-          <w:rFonts w:ascii="Aptos" w:eastAsiaTheme="minorEastAsia" w:hAnsi="Aptos" w:cs="Calibri"/>
-        </w:rPr>
-        <w:t xml:space="preserve"> a través de la firma del presente Contrato, se compromete a salir en la defensa e indemnidad de los intereses de </w:t>
-      </w:r>
-      <w:r>
-        <w:rPr>
-          <w:rFonts w:ascii="Aptos" w:eastAsiaTheme="minorEastAsia" w:hAnsi="Aptos" w:cs="Calibri"/>
-          <w:b/>
-        </w:rPr>
-        <w:t>CAPITALINK</w:t>
-      </w:r>
-      <w:r>
-        <w:rPr>
-          <w:rFonts w:ascii="Aptos" w:eastAsiaTheme="minorEastAsia" w:hAnsi="Aptos" w:cs="Calibri"/>
-        </w:rPr>
-        <w:t xml:space="preserve">, en la integración del litisconsorcio o coadyuvancia necesarios, cuando quiera que se presente reclamación, sanción o proceso judicial en su contra, por actividades o faltas derivadas directa o indirectamente de las actividades objeto del Contrato, en ese sentido, con la firma del Contrato acepta ser llamado en garantía en cualquier proceso judicial en el cual sea vinculado </w:t>
-      </w:r>
-      <w:r>
-        <w:rPr>
-          <w:rFonts w:ascii="Aptos" w:eastAsiaTheme="minorEastAsia" w:hAnsi="Aptos" w:cs="Calibri"/>
-          <w:b/>
-        </w:rPr>
-        <w:t>CAPITALINK</w:t>
-      </w:r>
-      <w:r>
-        <w:rPr>
-          <w:rFonts w:ascii="Aptos" w:eastAsiaTheme="minorEastAsia" w:hAnsi="Aptos" w:cs="Calibri"/>
-        </w:rPr>
-        <w:t xml:space="preserve"> por cualquier tercero que tenga o haya tenido relación directa o indirecta con </w:t>
-      </w:r>
-      <w:r>
-        <w:rPr>
-          <w:rFonts w:ascii="Aptos" w:eastAsiaTheme="minorEastAsia" w:hAnsi="Aptos" w:cs="Calibri"/>
-          <w:b/>
-        </w:rPr>
-        <w:t>CAPITALINK</w:t>
-      </w:r>
-      <w:r>
-        <w:rPr>
-          <w:rFonts w:ascii="Aptos" w:eastAsiaTheme="minorEastAsia" w:hAnsi="Aptos" w:cs="Calibri"/>
-        </w:rPr>
-        <w:t>, en virtud de la celebración, ejecución y conclusión del presente Contrato.</w:t>
-      </w:r>
-    </w:p>
-    <w:p>
-      <w:pPr>
-        <w:pStyle w:val="Sinespaciado"/>
-        <w:jc w:val="both"/>
-        <w:rPr>
-          <w:rFonts w:ascii="Aptos" w:eastAsiaTheme="minorEastAsia" w:hAnsi="Aptos" w:cs="Calibri"/>
-        </w:rPr>
-      </w:pPr>
-    </w:p>
-    <w:p>
-      <w:pPr>
-        <w:pStyle w:val="Sinespaciado"/>
-        <w:jc w:val="both"/>
-        <w:rPr>
-          <w:rFonts w:ascii="Aptos" w:eastAsiaTheme="minorEastAsia" w:hAnsi="Aptos" w:cs="Calibri"/>
-        </w:rPr>
-      </w:pPr>
-      <w:r>
-        <w:rPr>
-          <w:rFonts w:ascii="Aptos" w:eastAsiaTheme="minorEastAsia" w:hAnsi="Aptos" w:cs="Calibri"/>
-          <w:b/>
-        </w:rPr>
-        <w:t>EL CONTRATISTA</w:t>
-      </w:r>
-      <w:r>
-        <w:rPr>
-          <w:rFonts w:ascii="Aptos" w:eastAsiaTheme="minorEastAsia" w:hAnsi="Aptos" w:cs="Calibri"/>
-        </w:rPr>
-        <w:t xml:space="preserve"> se compromete a hacer devolución en un plazo máximo de treinta (30) días calendario, de las sumas que haya cancelado </w:t>
-      </w:r>
-      <w:r>
-        <w:rPr>
-          <w:rFonts w:ascii="Aptos" w:eastAsiaTheme="minorEastAsia" w:hAnsi="Aptos" w:cs="Calibri"/>
-          <w:b/>
-        </w:rPr>
-        <w:t>CAPITALINK</w:t>
-      </w:r>
-      <w:r>
-        <w:rPr>
-          <w:rFonts w:ascii="Aptos" w:eastAsiaTheme="minorEastAsia" w:hAnsi="Aptos" w:cs="Calibri"/>
-          <w:b/>
-        </w:rPr>
-        <w:t xml:space="preserve"> </w:t>
-      </w:r>
-      <w:r>
-        <w:rPr>
-          <w:rFonts w:ascii="Aptos" w:eastAsiaTheme="minorEastAsia" w:hAnsi="Aptos" w:cs="Calibri"/>
-        </w:rPr>
-        <w:t xml:space="preserve">para la defensa, sus intereses o cualquier costo o gasto, como consecuencia de las situaciones planteadas en este contrato o por cualquier otra derivada del incumplimiento de las obligaciones, para lo cual el presente documento, junto con la manifestación de lo pagado, hecha por </w:t>
-      </w:r>
-      <w:r>
-        <w:rPr>
-          <w:rFonts w:ascii="Aptos" w:eastAsiaTheme="minorEastAsia" w:hAnsi="Aptos" w:cs="Calibri"/>
-          <w:b/>
-        </w:rPr>
-        <w:t>CAPITALINK</w:t>
-      </w:r>
-      <w:r>
-        <w:rPr>
-          <w:rFonts w:ascii="Aptos" w:eastAsiaTheme="minorEastAsia" w:hAnsi="Aptos" w:cs="Calibri"/>
-          <w:b/>
-        </w:rPr>
-        <w:t xml:space="preserve"> </w:t>
-      </w:r>
-      <w:r>
-        <w:rPr>
-          <w:rFonts w:ascii="Aptos" w:eastAsiaTheme="minorEastAsia" w:hAnsi="Aptos" w:cs="Calibri"/>
-        </w:rPr>
-        <w:t>constituirá título ejecutivo suficiente para exigir judicialmente la restitución de dichas sumas en el entendido que no habrá requerimiento en mora alguno.</w:t>
-      </w:r>
-    </w:p>
-    <w:p>
-      <w:pPr>
-        <w:pStyle w:val="Sinespaciado"/>
-        <w:jc w:val="both"/>
-        <w:rPr>
-          <w:rFonts w:ascii="Aptos" w:eastAsiaTheme="minorEastAsia" w:hAnsi="Aptos" w:cs="Calibri"/>
-        </w:rPr>
-      </w:pPr>
-    </w:p>
-    <w:p>
-      <w:pPr>
-        <w:jc w:val="both"/>
-        <w:rPr>
-          <w:rFonts w:ascii="Aptos" w:hAnsi="Aptos" w:cs="Calibri"/>
-          <w:sz w:val="20"/>
-          <w:szCs w:val="20"/>
-        </w:rPr>
-      </w:pPr>
-      <w:r>
-        <w:rPr>
-          <w:rFonts w:ascii="Aptos" w:hAnsi="Aptos" w:cs="Calibri"/>
-          <w:b/>
-          <w:bCs/>
-          <w:sz w:val="20"/>
-          <w:szCs w:val="20"/>
-        </w:rPr>
-        <w:t xml:space="preserve">Décima </w:t>
-      </w:r>
-      <w:r>
-        <w:rPr>
-          <w:rFonts w:ascii="Aptos" w:hAnsi="Aptos" w:cs="Calibri"/>
-          <w:b/>
-          <w:bCs/>
-          <w:sz w:val="20"/>
-          <w:szCs w:val="20"/>
-        </w:rPr>
-        <w:t>Tercera</w:t>
-      </w:r>
-      <w:r>
-        <w:rPr>
-          <w:rFonts w:ascii="Aptos" w:hAnsi="Aptos" w:cs="Calibri"/>
-          <w:b/>
-          <w:bCs/>
-          <w:sz w:val="20"/>
-          <w:szCs w:val="20"/>
-        </w:rPr>
-        <w:t>. Confidencialidad:</w:t>
-      </w:r>
-      <w:r>
-        <w:rPr>
-          <w:rFonts w:ascii="Aptos" w:hAnsi="Aptos" w:cs="Calibri"/>
-          <w:sz w:val="20"/>
-          <w:szCs w:val="20"/>
-        </w:rPr>
-        <w:t xml:space="preserve"> Las Partes se comprometen a mantener en estricta reserva y confidencialidad de la información, documentación, operaciones, procesos, tecnología y demás datos, a la que tuviera acceso o conocimiento en virtud del presente Contrato. Queda comprendido en la obligación de confidencialidad, toda documentación que, por cualquier medio, se cursen las Partes en ejecución del mismo.</w:t>
-      </w:r>
-    </w:p>
-    <w:p>
-      <w:pPr>
-        <w:jc w:val="both"/>
-        <w:rPr>
-          <w:rFonts w:ascii="Aptos" w:hAnsi="Aptos" w:cs="Calibri"/>
-          <w:sz w:val="20"/>
-          <w:szCs w:val="20"/>
-        </w:rPr>
-      </w:pPr>
-    </w:p>
-    <w:p>
-      <w:pPr>
-        <w:jc w:val="both"/>
-        <w:rPr>
-          <w:rFonts w:ascii="Aptos" w:hAnsi="Aptos" w:cs="Calibri"/>
-          <w:sz w:val="20"/>
-          <w:szCs w:val="20"/>
-        </w:rPr>
-      </w:pPr>
-      <w:r>
-        <w:rPr>
-          <w:rFonts w:ascii="Aptos" w:hAnsi="Aptos" w:cs="Calibri"/>
-          <w:b/>
-          <w:bCs/>
-          <w:sz w:val="20"/>
-          <w:szCs w:val="20"/>
-        </w:rPr>
-        <w:t>Parágrafo Primero:</w:t>
-      </w:r>
-      <w:r>
-        <w:rPr>
-          <w:rFonts w:ascii="Aptos" w:hAnsi="Aptos" w:cs="Calibri"/>
-          <w:sz w:val="20"/>
-          <w:szCs w:val="20"/>
-        </w:rPr>
-        <w:t xml:space="preserve"> A efectos de lo dispuesto en el párrafo precedente, para que se considere que una de las Partes  ha  incurrido en un incumplimiento de la obligación antes señalada, basta con que alguno </w:t>
-      </w:r>
-      <w:r>
-        <w:rPr>
-          <w:rFonts w:ascii="Aptos" w:hAnsi="Aptos" w:cs="Calibri"/>
-          <w:sz w:val="20"/>
-          <w:szCs w:val="20"/>
-        </w:rPr>
-        <w:lastRenderedPageBreak/>
-        <w:t xml:space="preserve">o algunos de los antes mencionados revelen a cualquier tercero, ajeno a la otra Parte contratante, cualquier información contenida en la documentación o informes verbales que se le proporcione para la ejecución del objeto del presente Contrato, así como toda otra información que pudiera obtener como consecuencia del mismo. </w:t>
-      </w:r>
-    </w:p>
-    <w:p>
-      <w:pPr>
-        <w:jc w:val="both"/>
-        <w:rPr>
-          <w:rFonts w:ascii="Aptos" w:hAnsi="Aptos" w:cs="Calibri"/>
-          <w:sz w:val="20"/>
-          <w:szCs w:val="20"/>
-        </w:rPr>
-      </w:pPr>
-    </w:p>
-    <w:p>
-      <w:pPr>
-        <w:jc w:val="both"/>
-        <w:rPr>
-          <w:rFonts w:ascii="Aptos" w:hAnsi="Aptos" w:cs="Calibri"/>
-          <w:sz w:val="20"/>
-          <w:szCs w:val="20"/>
-        </w:rPr>
-      </w:pPr>
-      <w:r>
-        <w:rPr>
-          <w:rFonts w:ascii="Aptos" w:hAnsi="Aptos" w:cs="Calibri"/>
-          <w:b/>
-          <w:bCs/>
-          <w:sz w:val="20"/>
-          <w:szCs w:val="20"/>
-        </w:rPr>
-        <w:t>Parágrafo</w:t>
-      </w:r>
-      <w:r>
-        <w:rPr>
-          <w:rFonts w:ascii="Aptos" w:hAnsi="Aptos" w:cs="Calibri"/>
-          <w:sz w:val="20"/>
-          <w:szCs w:val="20"/>
-        </w:rPr>
-        <w:t xml:space="preserve"> </w:t>
-      </w:r>
-      <w:r>
-        <w:rPr>
-          <w:rFonts w:ascii="Aptos" w:hAnsi="Aptos" w:cs="Calibri"/>
-          <w:b/>
-          <w:bCs/>
-          <w:sz w:val="20"/>
-          <w:szCs w:val="20"/>
-        </w:rPr>
-        <w:t xml:space="preserve">Segundo: </w:t>
-      </w:r>
-      <w:r>
-        <w:rPr>
-          <w:rFonts w:ascii="Aptos" w:hAnsi="Aptos" w:cs="Calibri"/>
-          <w:sz w:val="20"/>
-          <w:szCs w:val="20"/>
-        </w:rPr>
-        <w:t xml:space="preserve">Si alguna de las Partes fuera notificada por cualquier autoridad judicial, administrativa, arbitral, entre otras análogas, a fin de que proporcione información y/o documentación relativa al presente Contrato, deberá notificar de inmediato y por escrito a la otra Parte para que esta ejerza las acciones conducentes a cautelar sus derechos, antes de entregar cualquier información y/o documentación. Esta obligación de confidencialidad se extiende a los empleados y asesores externos de cada una de las Partes, quienes harán uso exclusivo de la Información Confidencial para el cumplimiento del Contrato. </w:t>
-      </w:r>
-    </w:p>
-    <w:p>
-      <w:pPr>
-        <w:jc w:val="both"/>
-        <w:rPr>
-          <w:rFonts w:ascii="Aptos" w:hAnsi="Aptos" w:cs="Calibri"/>
-          <w:sz w:val="20"/>
-          <w:szCs w:val="20"/>
-        </w:rPr>
-      </w:pPr>
-    </w:p>
-    <w:p>
-      <w:pPr>
-        <w:jc w:val="both"/>
-        <w:rPr>
-          <w:rFonts w:ascii="Aptos" w:hAnsi="Aptos" w:cs="Calibri"/>
-          <w:sz w:val="20"/>
-          <w:szCs w:val="20"/>
-        </w:rPr>
-      </w:pPr>
-      <w:r>
-        <w:rPr>
-          <w:rFonts w:ascii="Aptos" w:hAnsi="Aptos" w:cs="Calibri"/>
-          <w:b/>
-          <w:bCs/>
-          <w:sz w:val="20"/>
-          <w:szCs w:val="20"/>
-        </w:rPr>
-        <w:t>Parágrafo Tercero:</w:t>
-      </w:r>
-      <w:r>
-        <w:rPr>
-          <w:rFonts w:ascii="Aptos" w:hAnsi="Aptos" w:cs="Calibri"/>
-          <w:sz w:val="20"/>
-          <w:szCs w:val="20"/>
-        </w:rPr>
-        <w:t xml:space="preserve"> La Información Confidencial no se dará a conocer a terceras personas, firmas o corporaciones sin la autorización escrita y previa de la otra Parte. Las Partes convienen expresamente que las obligaciones contenidas en la presente cláusula permanecerán con plena fuerza y vigor incluso vencido el plazo del presente contrato o resuelto el mismo.</w:t>
-      </w:r>
-    </w:p>
-    <w:p>
-      <w:pPr>
-        <w:pStyle w:val="Sinespaciado"/>
-        <w:jc w:val="both"/>
-        <w:rPr>
-          <w:rFonts w:ascii="Aptos" w:eastAsiaTheme="minorEastAsia" w:hAnsi="Aptos" w:cs="Calibri"/>
-        </w:rPr>
-      </w:pPr>
-    </w:p>
-    <w:p>
-      <w:pPr>
-        <w:pStyle w:val="Sinespaciado"/>
-        <w:jc w:val="both"/>
-        <w:rPr>
-          <w:rFonts w:ascii="Aptos" w:eastAsiaTheme="minorEastAsia" w:hAnsi="Aptos" w:cs="Calibri"/>
-        </w:rPr>
-      </w:pPr>
-      <w:r>
-        <w:rPr>
-          <w:rFonts w:ascii="Aptos" w:eastAsiaTheme="minorEastAsia" w:hAnsi="Aptos" w:cs="Calibri"/>
-          <w:b/>
-        </w:rPr>
-        <w:t xml:space="preserve">Décima </w:t>
-      </w:r>
-      <w:r>
-        <w:rPr>
-          <w:rFonts w:ascii="Aptos" w:eastAsiaTheme="minorEastAsia" w:hAnsi="Aptos" w:cs="Calibri"/>
-          <w:b/>
-        </w:rPr>
-        <w:t>Cuarta</w:t>
-      </w:r>
-      <w:r>
-        <w:rPr>
-          <w:rFonts w:ascii="Aptos" w:eastAsiaTheme="minorEastAsia" w:hAnsi="Aptos" w:cs="Calibri"/>
-          <w:b/>
-        </w:rPr>
-        <w:t>. Autorización de Tratamiento, Consulta y Registro de Datos Personales:</w:t>
-      </w:r>
-      <w:r>
-        <w:rPr>
-          <w:rFonts w:ascii="Aptos" w:eastAsia="Cambria" w:hAnsi="Aptos" w:cs="Calibri"/>
-          <w:b/>
-          <w:spacing w:val="2"/>
-        </w:rPr>
-        <w:t xml:space="preserve"> </w:t>
-      </w:r>
-      <w:r>
-        <w:rPr>
-          <w:rFonts w:ascii="Aptos" w:eastAsiaTheme="minorEastAsia" w:hAnsi="Aptos" w:cs="Calibri"/>
-          <w:b/>
-        </w:rPr>
-        <w:t>EL CONTRATISTA</w:t>
-      </w:r>
-      <w:r>
-        <w:rPr>
-          <w:rFonts w:ascii="Aptos" w:eastAsiaTheme="minorEastAsia" w:hAnsi="Aptos" w:cs="Calibri"/>
-        </w:rPr>
-        <w:t xml:space="preserve"> autoriza expresa e irrevocablemente a </w:t>
-      </w:r>
-      <w:r>
-        <w:rPr>
-          <w:rFonts w:ascii="Aptos" w:eastAsiaTheme="minorEastAsia" w:hAnsi="Aptos" w:cs="Calibri"/>
-          <w:b/>
-        </w:rPr>
-        <w:t>CAPITALINK</w:t>
-      </w:r>
-      <w:r>
-        <w:rPr>
-          <w:rFonts w:ascii="Aptos" w:eastAsiaTheme="minorEastAsia" w:hAnsi="Aptos" w:cs="Calibri"/>
-          <w:b/>
-        </w:rPr>
-        <w:t xml:space="preserve"> </w:t>
-      </w:r>
-      <w:r>
-        <w:rPr>
-          <w:rFonts w:ascii="Aptos" w:eastAsiaTheme="minorEastAsia" w:hAnsi="Aptos" w:cs="Calibri"/>
-        </w:rPr>
-        <w:t>de conformidad con la Ley 1581 de 2012 y el Decreto 1377 de 2013, para realizar el tratamiento de la información de los datos personales que se informen en el presente documento y todos aquellos que le entregue con ocasión de las relaciones comerciales y contractuales.</w:t>
-      </w:r>
-    </w:p>
-    <w:p>
-      <w:pPr>
-        <w:pStyle w:val="Sinespaciado"/>
-        <w:jc w:val="both"/>
-        <w:rPr>
-          <w:rFonts w:ascii="Aptos" w:eastAsiaTheme="minorEastAsia" w:hAnsi="Aptos" w:cs="Calibri"/>
-        </w:rPr>
-      </w:pPr>
-    </w:p>
-    <w:p>
-      <w:pPr>
-        <w:pStyle w:val="Sinespaciado"/>
-        <w:jc w:val="both"/>
-        <w:rPr>
-          <w:rFonts w:ascii="Aptos" w:eastAsiaTheme="minorEastAsia" w:hAnsi="Aptos" w:cs="Calibri"/>
-        </w:rPr>
-      </w:pPr>
-      <w:r>
-        <w:rPr>
-          <w:rFonts w:ascii="Aptos" w:eastAsiaTheme="minorEastAsia" w:hAnsi="Aptos" w:cs="Calibri"/>
-        </w:rPr>
-        <w:t xml:space="preserve">La información y datos personales suministrados a </w:t>
-      </w:r>
-      <w:r>
-        <w:rPr>
-          <w:rFonts w:ascii="Aptos" w:eastAsiaTheme="minorEastAsia" w:hAnsi="Aptos" w:cs="Calibri"/>
-          <w:b/>
-        </w:rPr>
-        <w:t>CAPITALINK</w:t>
-      </w:r>
-      <w:r>
-        <w:rPr>
-          <w:rFonts w:ascii="Aptos" w:eastAsiaTheme="minorEastAsia" w:hAnsi="Aptos" w:cs="Calibri"/>
-          <w:b/>
-        </w:rPr>
-        <w:t xml:space="preserve"> </w:t>
-      </w:r>
-      <w:r>
-        <w:rPr>
-          <w:rFonts w:ascii="Aptos" w:eastAsiaTheme="minorEastAsia" w:hAnsi="Aptos" w:cs="Calibri"/>
-        </w:rPr>
-        <w:t xml:space="preserve">podrán ser procesados, recolectados, almacenados, usados, circulados, suprimidos y compartidos. </w:t>
-      </w:r>
-      <w:r>
-        <w:rPr>
-          <w:rFonts w:ascii="Aptos" w:eastAsiaTheme="minorEastAsia" w:hAnsi="Aptos" w:cs="Calibri"/>
-          <w:b/>
-        </w:rPr>
-        <w:t>EL CONTRATISTA</w:t>
-      </w:r>
-      <w:r>
-        <w:rPr>
-          <w:rFonts w:ascii="Aptos" w:eastAsiaTheme="minorEastAsia" w:hAnsi="Aptos" w:cs="Calibri"/>
-        </w:rPr>
-        <w:t xml:space="preserve"> declara que acepta y conoce que los derechos que le asisten en calidad de titular de los datos personales objeto de tratamiento, como son: conocer, actualizar y solicitar la rectificación o supresión de datos; solicitar prueba del otorgamiento de la autorización; saber del uso que </w:t>
-      </w:r>
-      <w:r>
-        <w:rPr>
-          <w:rFonts w:ascii="Aptos" w:eastAsiaTheme="minorEastAsia" w:hAnsi="Aptos" w:cs="Calibri"/>
-          <w:b/>
-        </w:rPr>
-        <w:t>CAPITALINK</w:t>
-      </w:r>
-      <w:r>
-        <w:rPr>
-          <w:rFonts w:ascii="Aptos" w:eastAsiaTheme="minorEastAsia" w:hAnsi="Aptos" w:cs="Calibri"/>
-          <w:b/>
-        </w:rPr>
-        <w:t xml:space="preserve"> </w:t>
-      </w:r>
-      <w:r>
-        <w:rPr>
-          <w:rFonts w:ascii="Aptos" w:eastAsiaTheme="minorEastAsia" w:hAnsi="Aptos" w:cs="Calibri"/>
-        </w:rPr>
-        <w:t xml:space="preserve">ha hecho de sus datos personales; revocar en cualquier momento  la  autorización de  inclusión  de  sus datos  personales  en  las  bases  de datos  de </w:t>
-      </w:r>
-      <w:r>
-        <w:rPr>
-          <w:rFonts w:ascii="Aptos" w:eastAsiaTheme="minorEastAsia" w:hAnsi="Aptos" w:cs="Calibri"/>
-          <w:b/>
-        </w:rPr>
-        <w:t>CAPITALINK</w:t>
-      </w:r>
-      <w:r>
-        <w:rPr>
-          <w:rFonts w:ascii="Aptos" w:eastAsiaTheme="minorEastAsia" w:hAnsi="Aptos" w:cs="Calibri"/>
-          <w:b/>
-        </w:rPr>
-        <w:t xml:space="preserve"> </w:t>
-      </w:r>
-      <w:r>
-        <w:rPr>
-          <w:rFonts w:ascii="Aptos" w:eastAsiaTheme="minorEastAsia" w:hAnsi="Aptos" w:cs="Calibri"/>
-        </w:rPr>
-        <w:t>y solicitar sin costo alguno los datos personales previamente autorizados.</w:t>
-      </w:r>
-    </w:p>
-    <w:p>
-      <w:pPr>
-        <w:jc w:val="both"/>
-        <w:rPr>
-          <w:rFonts w:ascii="Aptos" w:hAnsi="Aptos" w:cs="Calibri"/>
-          <w:sz w:val="20"/>
-          <w:szCs w:val="20"/>
-        </w:rPr>
-      </w:pPr>
-    </w:p>
-    <w:p>
-      <w:pPr>
-        <w:jc w:val="both"/>
-        <w:rPr>
-          <w:rFonts w:ascii="Aptos" w:hAnsi="Aptos" w:cs="Calibri"/>
-          <w:sz w:val="20"/>
-          <w:szCs w:val="20"/>
-        </w:rPr>
-      </w:pPr>
-      <w:r>
-        <w:rPr>
-          <w:rFonts w:ascii="Aptos" w:hAnsi="Aptos" w:cs="Calibri"/>
-          <w:b/>
-          <w:bCs/>
-          <w:sz w:val="20"/>
-          <w:szCs w:val="20"/>
-        </w:rPr>
-        <w:t xml:space="preserve">Décima </w:t>
-      </w:r>
-      <w:r>
-        <w:rPr>
-          <w:rFonts w:ascii="Aptos" w:hAnsi="Aptos" w:cs="Calibri"/>
-          <w:b/>
-          <w:bCs/>
-          <w:sz w:val="20"/>
-          <w:szCs w:val="20"/>
-        </w:rPr>
-        <w:t>Quinta</w:t>
-      </w:r>
-      <w:r>
-        <w:rPr>
-          <w:rFonts w:ascii="Aptos" w:hAnsi="Aptos" w:cs="Calibri"/>
-          <w:b/>
-          <w:bCs/>
-          <w:sz w:val="20"/>
-          <w:szCs w:val="20"/>
-        </w:rPr>
-        <w:t xml:space="preserve">. Uso Ético de la Información y Restricciones de Acceso. </w:t>
-      </w:r>
-      <w:r>
-        <w:rPr>
-          <w:rFonts w:ascii="Aptos" w:hAnsi="Aptos" w:cs="Calibri"/>
-          <w:b/>
-          <w:sz w:val="20"/>
-          <w:szCs w:val="20"/>
-        </w:rPr>
-        <w:t>EL CONTRATISTA</w:t>
-      </w:r>
-      <w:r>
-        <w:rPr>
-          <w:rFonts w:ascii="Aptos" w:hAnsi="Aptos" w:cs="Calibri"/>
-          <w:sz w:val="20"/>
-          <w:szCs w:val="20"/>
-        </w:rPr>
-        <w:t xml:space="preserve"> se compromete a utilizar la información proporcionada por </w:t>
-      </w:r>
-      <w:r>
-        <w:rPr>
-          <w:rFonts w:ascii="Aptos" w:hAnsi="Aptos" w:cs="Calibri"/>
-          <w:b/>
-          <w:sz w:val="20"/>
-          <w:szCs w:val="20"/>
-        </w:rPr>
-        <w:t>CAPITALINK</w:t>
-      </w:r>
-      <w:r>
-        <w:rPr>
-          <w:rFonts w:ascii="Aptos" w:hAnsi="Aptos" w:cs="Calibri"/>
-          <w:b/>
-          <w:sz w:val="20"/>
-          <w:szCs w:val="20"/>
-        </w:rPr>
-        <w:t xml:space="preserve"> </w:t>
-      </w:r>
-      <w:r>
-        <w:rPr>
-          <w:rFonts w:ascii="Aptos" w:hAnsi="Aptos" w:cs="Calibri"/>
-          <w:sz w:val="20"/>
-          <w:szCs w:val="20"/>
-        </w:rPr>
-        <w:t xml:space="preserve">o sus clientes, </w:t>
-      </w:r>
-      <w:r>
-        <w:rPr>
-          <w:rFonts w:ascii="Aptos" w:hAnsi="Aptos" w:cs="Calibri"/>
-          <w:sz w:val="20"/>
-          <w:szCs w:val="20"/>
-        </w:rPr>
-        <w:t xml:space="preserve">únicamente para los fines específicos del presente contrato, manteniendo en todo momento la confidencialidad y siguiendo los principios éticos y profesionales aplicables. Queda prohibido que </w:t>
-      </w:r>
-      <w:r>
-        <w:rPr>
-          <w:rFonts w:ascii="Aptos" w:hAnsi="Aptos" w:cs="Calibri"/>
-          <w:b/>
-          <w:sz w:val="20"/>
-          <w:szCs w:val="20"/>
-        </w:rPr>
-        <w:t>EL CONTRATISTA</w:t>
-      </w:r>
-      <w:r>
-        <w:rPr>
-          <w:rFonts w:ascii="Aptos" w:hAnsi="Aptos" w:cs="Calibri"/>
-          <w:sz w:val="20"/>
-          <w:szCs w:val="20"/>
-        </w:rPr>
-        <w:t xml:space="preserve"> o sus colaboradores acceda, manipule o realice modificaciones a cualquier plataforma, sistema, servidor, base de datos o recurso tecnológico del Cliente sin la previa autorización por escrito de este o de </w:t>
-      </w:r>
-      <w:r>
-        <w:rPr>
-          <w:rFonts w:ascii="Aptos" w:hAnsi="Aptos" w:cs="Calibri"/>
-          <w:b/>
-          <w:sz w:val="20"/>
-          <w:szCs w:val="20"/>
-        </w:rPr>
-        <w:t>CAPITALINK</w:t>
-      </w:r>
-      <w:r>
-        <w:rPr>
-          <w:rFonts w:ascii="Aptos" w:hAnsi="Aptos" w:cs="Calibri"/>
-          <w:sz w:val="20"/>
-          <w:szCs w:val="20"/>
-        </w:rPr>
-        <w:t xml:space="preserve">. Asimismo, </w:t>
-      </w:r>
-      <w:r>
-        <w:rPr>
-          <w:rFonts w:ascii="Aptos" w:hAnsi="Aptos" w:cs="Calibri"/>
-          <w:b/>
-          <w:sz w:val="20"/>
-          <w:szCs w:val="20"/>
-        </w:rPr>
-        <w:t>EL CONTRATISTA</w:t>
-      </w:r>
-      <w:r>
-        <w:rPr>
-          <w:rFonts w:ascii="Aptos" w:hAnsi="Aptos" w:cs="Calibri"/>
-          <w:sz w:val="20"/>
-          <w:szCs w:val="20"/>
-        </w:rPr>
-        <w:t xml:space="preserve"> no podrá auto concederse permisos ni modificar configuraciones de acceso en dichos sistemas, ya sea para la realización de entregables, mantenimiento o cualquier otra actividad, sin que medie autorización escrita y previa del Cliente o </w:t>
-      </w:r>
-      <w:r>
-        <w:rPr>
-          <w:rFonts w:ascii="Aptos" w:hAnsi="Aptos" w:cs="Calibri"/>
-          <w:b/>
-          <w:sz w:val="20"/>
-          <w:szCs w:val="20"/>
-        </w:rPr>
-        <w:t>CAPITALINK</w:t>
-      </w:r>
-      <w:r>
-        <w:rPr>
-          <w:rFonts w:ascii="Aptos" w:hAnsi="Aptos" w:cs="Calibri"/>
-          <w:sz w:val="20"/>
-          <w:szCs w:val="20"/>
-        </w:rPr>
-        <w:t>. </w:t>
-      </w:r>
-    </w:p>
-    <w:p>
-      <w:pPr>
-        <w:jc w:val="both"/>
-        <w:rPr>
-          <w:rFonts w:ascii="Aptos" w:hAnsi="Aptos" w:cs="Calibri"/>
-          <w:sz w:val="20"/>
-          <w:szCs w:val="20"/>
-        </w:rPr>
-      </w:pPr>
-    </w:p>
-    <w:p>
-      <w:pPr>
-        <w:jc w:val="both"/>
-        <w:rPr>
-          <w:rFonts w:ascii="Aptos" w:hAnsi="Aptos" w:cs="Calibri"/>
-          <w:sz w:val="20"/>
-          <w:szCs w:val="20"/>
-        </w:rPr>
-      </w:pPr>
-      <w:r>
-        <w:rPr>
-          <w:rFonts w:ascii="Aptos" w:hAnsi="Aptos" w:cs="Calibri"/>
-          <w:sz w:val="20"/>
-          <w:szCs w:val="20"/>
-        </w:rPr>
-        <w:t xml:space="preserve">En caso de identificar vulnerabilidades, errores o problemas técnicos en las plataformas o sistemas del Cliente, </w:t>
-      </w:r>
-      <w:r>
-        <w:rPr>
-          <w:rFonts w:ascii="Aptos" w:hAnsi="Aptos" w:cs="Calibri"/>
-          <w:b/>
-          <w:sz w:val="20"/>
-          <w:szCs w:val="20"/>
-        </w:rPr>
-        <w:t>EL CONTRATISTA</w:t>
-      </w:r>
-      <w:r>
-        <w:rPr>
-          <w:rFonts w:ascii="Aptos" w:hAnsi="Aptos" w:cs="Calibri"/>
-          <w:sz w:val="20"/>
-          <w:szCs w:val="20"/>
-        </w:rPr>
-        <w:t xml:space="preserve"> deberá notificarlo inmediatamente al Cliente y a </w:t>
-      </w:r>
-      <w:r>
-        <w:rPr>
-          <w:rFonts w:ascii="Aptos" w:hAnsi="Aptos" w:cs="Calibri"/>
-          <w:b/>
-          <w:sz w:val="20"/>
-          <w:szCs w:val="20"/>
-        </w:rPr>
-        <w:t>CAPITALINK</w:t>
-      </w:r>
-      <w:r>
-        <w:rPr>
-          <w:rFonts w:ascii="Aptos" w:hAnsi="Aptos" w:cs="Calibri"/>
-          <w:sz w:val="20"/>
-          <w:szCs w:val="20"/>
-        </w:rPr>
-        <w:t xml:space="preserve">, sin intervenir en los sistemas hasta recibir la autorización correspondiente. Cualquier incumplimiento de estas obligaciones será considerado una violación grave del presente contrato y facultará a </w:t>
-      </w:r>
-      <w:r>
-        <w:rPr>
-          <w:rFonts w:ascii="Aptos" w:hAnsi="Aptos" w:cs="Calibri"/>
-          <w:b/>
-          <w:sz w:val="20"/>
-          <w:szCs w:val="20"/>
-        </w:rPr>
-        <w:t>CAPITALINK</w:t>
-      </w:r>
-      <w:r>
-        <w:rPr>
-          <w:rFonts w:ascii="Aptos" w:hAnsi="Aptos" w:cs="Calibri"/>
-          <w:b/>
-          <w:sz w:val="20"/>
-          <w:szCs w:val="20"/>
-        </w:rPr>
-        <w:t xml:space="preserve"> </w:t>
-      </w:r>
-      <w:r>
-        <w:rPr>
-          <w:rFonts w:ascii="Aptos" w:hAnsi="Aptos" w:cs="Calibri"/>
-          <w:sz w:val="20"/>
-          <w:szCs w:val="20"/>
-        </w:rPr>
-        <w:t>para su terminación inmediata, sin perjuicio de las acciones legales que correspondan, incluyendo reclamaciones por daños y perjuicios, así como el cobro de la cláusula penal. </w:t>
-      </w:r>
-    </w:p>
-    <w:p>
-      <w:pPr>
-        <w:jc w:val="both"/>
-        <w:rPr>
-          <w:rFonts w:ascii="Aptos" w:hAnsi="Aptos" w:cs="Calibri"/>
-          <w:sz w:val="20"/>
-          <w:szCs w:val="20"/>
-        </w:rPr>
-      </w:pPr>
-    </w:p>
-    <w:p>
-      <w:pPr>
-        <w:jc w:val="both"/>
-        <w:rPr>
-          <w:rFonts w:ascii="Aptos" w:hAnsi="Aptos" w:cs="Calibri"/>
-          <w:sz w:val="20"/>
-          <w:szCs w:val="20"/>
-        </w:rPr>
-      </w:pPr>
-      <w:r>
-        <w:rPr>
-          <w:rFonts w:ascii="Aptos" w:hAnsi="Aptos" w:cs="Calibri"/>
-          <w:b/>
-          <w:bCs/>
-          <w:sz w:val="20"/>
-          <w:szCs w:val="20"/>
-        </w:rPr>
-        <w:t xml:space="preserve">Décima </w:t>
-      </w:r>
-      <w:r>
-        <w:rPr>
-          <w:rFonts w:ascii="Aptos" w:hAnsi="Aptos" w:cs="Calibri"/>
-          <w:b/>
-          <w:bCs/>
-          <w:sz w:val="20"/>
-          <w:szCs w:val="20"/>
-        </w:rPr>
-        <w:t>Sexta.</w:t>
-      </w:r>
-      <w:r>
-        <w:rPr>
-          <w:rFonts w:ascii="Aptos" w:hAnsi="Aptos" w:cs="Calibri"/>
-          <w:b/>
-          <w:bCs/>
-          <w:sz w:val="20"/>
-          <w:szCs w:val="20"/>
-        </w:rPr>
-        <w:t xml:space="preserve"> Cláusula Penal: </w:t>
-      </w:r>
-      <w:r>
-        <w:rPr>
-          <w:rFonts w:ascii="Aptos" w:hAnsi="Aptos" w:cs="Calibri"/>
-          <w:sz w:val="20"/>
-          <w:szCs w:val="20"/>
-        </w:rPr>
-        <w:t xml:space="preserve">El incumplimiento por parte de </w:t>
-      </w:r>
-      <w:r>
-        <w:rPr>
-          <w:rFonts w:ascii="Aptos" w:hAnsi="Aptos" w:cs="Calibri"/>
-          <w:b/>
-          <w:bCs/>
-          <w:sz w:val="20"/>
-          <w:szCs w:val="20"/>
-        </w:rPr>
-        <w:t>EL CONTRATISTA</w:t>
-      </w:r>
-      <w:r>
-        <w:rPr>
-          <w:rFonts w:ascii="Aptos" w:hAnsi="Aptos" w:cs="Calibri"/>
-          <w:sz w:val="20"/>
-          <w:szCs w:val="20"/>
-        </w:rPr>
-        <w:t xml:space="preserve"> de la totalidad o algunas de las obligaciones derivadas del presente Contrato, dará derecho a </w:t>
-      </w:r>
-      <w:r>
-        <w:rPr>
-          <w:rFonts w:ascii="Aptos" w:hAnsi="Aptos" w:cs="Calibri"/>
-          <w:b/>
-          <w:bCs/>
-          <w:sz w:val="20"/>
-          <w:szCs w:val="20"/>
-        </w:rPr>
-        <w:t>CAPITALINK</w:t>
-      </w:r>
-      <w:r>
-        <w:rPr>
-          <w:rFonts w:ascii="Aptos" w:hAnsi="Aptos" w:cs="Calibri"/>
-          <w:sz w:val="20"/>
-          <w:szCs w:val="20"/>
-        </w:rPr>
-        <w:t xml:space="preserve">, para exigir </w:t>
-      </w:r>
-      <w:r>
-        <w:rPr>
-          <w:rFonts w:ascii="Aptos" w:hAnsi="Aptos" w:cs="Calibri"/>
-          <w:sz w:val="20"/>
-          <w:szCs w:val="20"/>
-        </w:rPr>
-        <w:lastRenderedPageBreak/>
-        <w:t xml:space="preserve">inmediatamente a título de pena, a </w:t>
+          <w:sz w:val="20"/>
+          <w:szCs w:val="20"/>
+        </w:rPr>
+        <w:t xml:space="preserve">, para exigir inmediatamente a título de pena, a </w:t>
       </w:r>
       <w:r>
         <w:rPr>
@@ -7037,6 +7226,7 @@
         <w:rPr>
           <w:rFonts w:ascii="Aptos" w:eastAsiaTheme="minorEastAsia" w:hAnsi="Aptos" w:cs="Calibri"/>
         </w:rPr>
+        <w:lastRenderedPageBreak/>
         <w:t>Ella, sus trabajadores, contratistas, socios, directivos, administradores, terceros vinculados o representantes no se encuentran incluidos dentro de alguna de las listas vinculantes, cautelares o restrictivas en Colombia para el cumplimiento de SARLAFT, SIPLAFT, SAGRILAFT, Régimen de medidas mínimas o cualquier otro sistema aplicable para la prevención en materia de riesgos LA/FT/FPADM.</w:t>
       </w:r>
     </w:p>
@@ -7061,7 +7251,6 @@
         <w:rPr>
           <w:rFonts w:ascii="Aptos" w:eastAsiaTheme="minorEastAsia" w:hAnsi="Aptos" w:cs="Calibri"/>
         </w:rPr>
-        <w:lastRenderedPageBreak/>
         <w:t xml:space="preserve">De igual manera, </w:t>
       </w:r>
       <w:r>
@@ -7507,6 +7696,7 @@
           <w:rFonts w:ascii="Aptos" w:eastAsiaTheme="minorEastAsia" w:hAnsi="Aptos" w:cs="Calibri"/>
           <w:b/>
         </w:rPr>
+        <w:lastRenderedPageBreak/>
         <w:t xml:space="preserve">Vigésima </w:t>
       </w:r>
       <w:r>
@@ -7564,7 +7754,6 @@
           <w:sz w:val="20"/>
           <w:szCs w:val="20"/>
         </w:rPr>
-        <w:lastRenderedPageBreak/>
         <w:t xml:space="preserve">Vigésima </w:t>
       </w:r>
       <w:r>
@@ -8719,6 +8908,7 @@
                 <w:sz w:val="22"/>
                 <w:szCs w:val="22"/>
               </w:rPr>
+              <w:lastRenderedPageBreak/>
               <w:t>{{</w:t>
             </w:r>
             <w:proofErr w:type="spellStart"/>
@@ -8881,6 +9071,7 @@
                 <w:sz w:val="22"/>
                 <w:szCs w:val="22"/>
               </w:rPr>
+              <w:lastRenderedPageBreak/>
               <w:t>NIT. {{</w:t>
             </w:r>
             <w:proofErr w:type="spellStart"/>
@@ -12554,6 +12745,26 @@
       <w:szCs w:val="20"/>
     </w:rPr>
   </w:style>
+  <w:style w:type="paragraph" w:customStyle="1" w:styleId="TableParagraph">
+    <w:name w:val="Table Paragraph"/>
+    <w:basedOn w:val="Normal"/>
+    <w:uiPriority w:val="1"/>
+    <w:qFormat/>
+    <w:rsid w:val="00D65525"/>
+    <w:pPr>
+      <w:widowControl w:val="0"/>
+      <w:autoSpaceDE w:val="0"/>
+      <w:autoSpaceDN w:val="0"/>
+      <w:spacing w:before="1" w:line="223" w:lineRule="exact"/>
+      <w:ind w:left="104"/>
+    </w:pPr>
+    <w:rPr>
+      <w:rFonts w:ascii="Trebuchet MS" w:eastAsia="Trebuchet MS" w:hAnsi="Trebuchet MS" w:cs="Trebuchet MS"/>
+      <w:sz w:val="22"/>
+      <w:szCs w:val="22"/>
+      <w:lang w:val="es-ES"/>
+    </w:rPr>
+  </w:style>
 </w:styles>
 </file>
 
@@ -12886,12 +13097,14 @@
 </file>
 
 <file path=customXml/item1.xml><?xml version="1.0" encoding="utf-8"?>
-<?mso-contentType ?>
-<FormTemplates xmlns="http://schemas.microsoft.com/sharepoint/v3/contenttype/forms">
-  <Display>DocumentLibraryForm</Display>
-  <Edit>DocumentLibraryForm</Edit>
-  <New>DocumentLibraryForm</New>
-</FormTemplates>
+<p:properties xmlns:p="http://schemas.microsoft.com/office/2006/metadata/properties" xmlns:xsi="http://www.w3.org/2001/XMLSchema-instance" xmlns:pc="http://schemas.microsoft.com/office/infopath/2007/PartnerControls">
+  <documentManagement>
+    <lcf76f155ced4ddcb4097134ff3c332f xmlns="0671de82-fb77-4741-a946-bbedde5d4f76">
+      <Terms xmlns="http://schemas.microsoft.com/office/infopath/2007/PartnerControls"/>
+    </lcf76f155ced4ddcb4097134ff3c332f>
+    <TaxCatchAll xmlns="bfe36008-4467-4f6a-b17f-684c3d9d556d" xsi:nil="true"/>
+  </documentManagement>
+</p:properties>
 </file>
 
 <file path=customXml/item2.xml><?xml version="1.0" encoding="utf-8"?>
@@ -13102,20 +13315,21 @@
 </file>
 
 <file path=customXml/item3.xml><?xml version="1.0" encoding="utf-8"?>
-<p:properties xmlns:p="http://schemas.microsoft.com/office/2006/metadata/properties" xmlns:xsi="http://www.w3.org/2001/XMLSchema-instance" xmlns:pc="http://schemas.microsoft.com/office/infopath/2007/PartnerControls">
-  <documentManagement>
-    <lcf76f155ced4ddcb4097134ff3c332f xmlns="0671de82-fb77-4741-a946-bbedde5d4f76">
-      <Terms xmlns="http://schemas.microsoft.com/office/infopath/2007/PartnerControls"/>
-    </lcf76f155ced4ddcb4097134ff3c332f>
-    <TaxCatchAll xmlns="bfe36008-4467-4f6a-b17f-684c3d9d556d" xsi:nil="true"/>
-  </documentManagement>
-</p:properties>
+<?mso-contentType ?>
+<FormTemplates xmlns="http://schemas.microsoft.com/sharepoint/v3/contenttype/forms">
+  <Display>DocumentLibraryForm</Display>
+  <Edit>DocumentLibraryForm</Edit>
+  <New>DocumentLibraryForm</New>
+</FormTemplates>
 </file>
 
 <file path=customXml/itemProps1.xml><?xml version="1.0" encoding="utf-8"?>
-<ds:datastoreItem xmlns:ds="http://schemas.openxmlformats.org/officeDocument/2006/customXml" ds:itemID="{5743EEC1-3586-4A5C-8E76-2F104B5DD15D}">
+<ds:datastoreItem xmlns:ds="http://schemas.openxmlformats.org/officeDocument/2006/customXml" ds:itemID="{248E68C4-6EDF-4C44-A890-EBEC35D3B192}">
   <ds:schemaRefs>
-    <ds:schemaRef ds:uri="http://schemas.microsoft.com/sharepoint/v3/contenttype/forms"/>
+    <ds:schemaRef ds:uri="http://schemas.microsoft.com/office/2006/metadata/properties"/>
+    <ds:schemaRef ds:uri="http://schemas.microsoft.com/office/infopath/2007/PartnerControls"/>
+    <ds:schemaRef ds:uri="0671de82-fb77-4741-a946-bbedde5d4f76"/>
+    <ds:schemaRef ds:uri="bfe36008-4467-4f6a-b17f-684c3d9d556d"/>
   </ds:schemaRefs>
 </ds:datastoreItem>
 </file>
@@ -13140,12 +13354,9 @@
 </file>
 
 <file path=customXml/itemProps3.xml><?xml version="1.0" encoding="utf-8"?>
-<ds:datastoreItem xmlns:ds="http://schemas.openxmlformats.org/officeDocument/2006/customXml" ds:itemID="{248E68C4-6EDF-4C44-A890-EBEC35D3B192}">
+<ds:datastoreItem xmlns:ds="http://schemas.openxmlformats.org/officeDocument/2006/customXml" ds:itemID="{5743EEC1-3586-4A5C-8E76-2F104B5DD15D}">
   <ds:schemaRefs>
-    <ds:schemaRef ds:uri="http://schemas.microsoft.com/office/2006/metadata/properties"/>
-    <ds:schemaRef ds:uri="http://schemas.microsoft.com/office/infopath/2007/PartnerControls"/>
-    <ds:schemaRef ds:uri="0671de82-fb77-4741-a946-bbedde5d4f76"/>
-    <ds:schemaRef ds:uri="bfe36008-4467-4f6a-b17f-684c3d9d556d"/>
+    <ds:schemaRef ds:uri="http://schemas.microsoft.com/sharepoint/v3/contenttype/forms"/>
   </ds:schemaRefs>
 </ds:datastoreItem>
 </file>
</xml_diff>